<commit_message>
Fix formato documenti/email (batch)
Contratto sponsor (docx):
- Firma SPONSOR: nome azienda + firmatario (era una riga vuota), tolta evidenza cyan
- ALLEGATO 1 rietichettato come "ALLEGATO 1 - DOMANDA DI AMMISSIONE"

Domanda di ammissione:
- Tabella dati sponsor 8->7pt (etichette su una riga)
- Tabella servizi 10->8pt (post-processing); footer in Arial

Preventivo (quote_pdf.html + generator):
- "Gentile" -> "Spett.le"
- Riga "Sconto incondizionato" nei totali (somma sconti riga)
- Footer: Email a capo dopo il telefono
- Prezzo di listino della riga STAND dal prezzo base dello stand/blocco
  (cosi' spazio espositivo mostra listino barrato + prezzo riservato / sconto)

Email:
- Fallback 'contact' in build_common_context: {{ contact.full_name }} ora
  risolve sempre (contatto principale dello sponsor) anche dove non passato

Modello:
- sconto_eur conta solo le righe realmente revisionate (esclusi gli inclusi a 0)
</commit_message>
<xml_diff>
--- a/contracts/templates_pdf/template_contratto_sponsor_non_ecm_it.docx
+++ b/contracts/templates_pdf/template_contratto_sponsor_non_ecm_it.docx
@@ -3310,12 +3310,53 @@
       </w:pPr>
       <w:r>
         <w:rPr>
-          <w:rFonts w:cs="Calibri" w:ascii="Calibri" w:hAnsi="Calibri"/>
-          <w:b/>
-          <w:bCs/>
-          <w:highlight w:val="cyan"/>
-        </w:rPr>
-        <w:t xml:space="preserve">Sponsor _______________________________________ </w:t>
+          <w:rFonts w:ascii="Arial" w:hAnsi="Arial" w:cs="Arial"/>
+          <w:b w:val="0"/>
+          <w:sz w:val="20"/>
+        </w:rPr>
+        <w:t>Sponsor</w:t>
+      </w:r>
+      <w:r>
+        <w:rPr>
+          <w:rFonts w:ascii="Arial" w:hAnsi="Arial" w:cs="Arial"/>
+          <w:b w:val="0"/>
+          <w:sz w:val="20"/>
+        </w:rPr>
+        <w:br/>
+      </w:r>
+      <w:r>
+        <w:rPr>
+          <w:rFonts w:ascii="Arial" w:hAnsi="Arial" w:cs="Arial"/>
+          <w:b/>
+          <w:sz w:val="20"/>
+        </w:rPr>
+        <w:t>{{ sponsor.legal_name }}</w:t>
+      </w:r>
+      <w:r>
+        <w:rPr>
+          <w:rFonts w:ascii="Arial" w:hAnsi="Arial" w:cs="Arial"/>
+          <w:b w:val="0"/>
+          <w:sz w:val="20"/>
+        </w:rPr>
+        <w:br/>
+      </w:r>
+      <w:r>
+        <w:rPr>
+          <w:rFonts w:ascii="Arial" w:hAnsi="Arial" w:cs="Arial"/>
+          <w:b/>
+          <w:sz w:val="20"/>
+        </w:rPr>
+        <w:t>{% if signer.full_name %}{{ signer.full_name }}</w:t>
+        <w:br/>
+        <w:t>{% endif %}</w:t>
+      </w:r>
+      <w:r>
+        <w:rPr>
+          <w:rFonts w:ascii="Arial" w:hAnsi="Arial" w:cs="Arial"/>
+          <w:b w:val="0"/>
+          <w:sz w:val="20"/>
+        </w:rPr>
+        <w:t>_______________________________________</w:t>
       </w:r>
     </w:p>
     <w:p>
@@ -3487,13 +3528,20 @@
       </w:pPr>
       <w:r>
         <w:rPr>
-          <w:rFonts w:cs="Calibri" w:ascii="Calibri" w:hAnsi="Calibri"/>
-          <w:b/>
-          <w:bCs/>
-        </w:rPr>
-        <w:t xml:space="preserve">ALLEGATO 1 </w:t>
+          <w:rFonts w:ascii="Arial" w:hAnsi="Arial" w:cs="Arial"/>
+          <w:b/>
+          <w:sz w:val="24"/>
+        </w:rPr>
+        <w:t>ALLEGATO 1 – DOMANDA DI AMMISSIONE</w:t>
+      </w:r>
+      <w:r>
+        <w:rPr>
+          <w:rFonts w:ascii="Arial" w:hAnsi="Arial" w:cs="Arial"/>
+          <w:b w:val="0"/>
+          <w:sz w:val="20"/>
+        </w:rPr>
         <w:br/>
-        <w:t>Il presente allegato è parte integrante dell’accordo</w:t>
+        <w:t>Il presente allegato è parte integrante dell’accordo. Segue la domanda di ammissione.</w:t>
       </w:r>
     </w:p>
     <w:p>

</xml_diff>

<commit_message>
Contratto: firma sponsor centrata, corpo compattato (8pt+margini) ~4 pagine, ALLEGATO 1 ora e la domanda di ammissione (intestazione condizionale as_allegato)
</commit_message>
<xml_diff>
--- a/contracts/templates_pdf/template_contratto_sponsor_non_ecm_it.docx
+++ b/contracts/templates_pdf/template_contratto_sponsor_non_ecm_it.docx
@@ -5,6 +5,7 @@
     <w:p>
       <w:pPr>
         <w:pStyle w:val="Normal"/>
+        <w:spacing w:before="0" w:after="0" w:line="230" w:lineRule="auto"/>
         <w:jc w:val="center"/>
         <w:rPr>
           <w:rFonts w:ascii="Calibri" w:hAnsi="Calibri" w:cs="Calibri"/>
@@ -12,9 +13,10 @@
       </w:pPr>
       <w:r>
         <w:rPr>
-          <w:rFonts w:cs="Calibri" w:ascii="Calibri" w:hAnsi="Calibri"/>
-          <w:b/>
-          <w:bCs/>
+          <w:rFonts w:cs="Arial" w:ascii="Arial" w:hAnsi="Arial"/>
+          <w:b/>
+          <w:bCs/>
+          <w:sz w:val="16"/>
         </w:rPr>
         <w:t>CONTRATTO DI SPONSORIZZAZIONE Evento non ECM</w:t>
       </w:r>
@@ -22,6 +24,7 @@
     <w:p>
       <w:pPr>
         <w:pStyle w:val="Normal"/>
+        <w:spacing w:before="0" w:after="0" w:line="230" w:lineRule="auto"/>
         <w:jc w:val="center"/>
         <w:rPr>
           <w:rFonts w:ascii="Calibri" w:hAnsi="Calibri" w:cs="Calibri"/>
@@ -29,9 +32,10 @@
       </w:pPr>
       <w:r>
         <w:rPr>
-          <w:rFonts w:cs="Calibri" w:ascii="Calibri" w:hAnsi="Calibri"/>
-          <w:b/>
-          <w:bCs/>
+          <w:rFonts w:cs="Arial" w:ascii="Arial" w:hAnsi="Arial"/>
+          <w:b/>
+          <w:bCs/>
+          <w:sz w:val="16"/>
         </w:rPr>
         <w:t>tra</w:t>
       </w:r>
@@ -45,6 +49,7 @@
           <w:tab w:val="left" w:pos="5911" w:leader="none"/>
           <w:tab w:val="left" w:pos="7545" w:leader="none"/>
         </w:tabs>
+        <w:spacing w:before="0" w:after="0" w:line="230" w:lineRule="auto"/>
         <w:ind w:right="56" w:hanging="0"/>
         <w:jc w:val="both"/>
         <w:rPr/>
@@ -53,314 +58,362 @@
       <w:bookmarkEnd w:id="0"/>
       <w:r>
         <w:rPr>
-          <w:rFonts w:cs="Calibri" w:ascii="Calibri" w:hAnsi="Calibri"/>
+          <w:rFonts w:cs="Arial" w:ascii="Arial" w:hAnsi="Arial"/>
+          <w:sz w:val="16"/>
         </w:rPr>
         <w:t>La</w:t>
       </w:r>
       <w:r>
         <w:rPr>
-          <w:rFonts w:cs="Calibri" w:ascii="Calibri" w:hAnsi="Calibri"/>
+          <w:rFonts w:cs="Arial" w:ascii="Arial" w:hAnsi="Arial"/>
           <w:spacing w:val="25"/>
+          <w:sz w:val="16"/>
         </w:rPr>
         <w:t xml:space="preserve"> </w:t>
       </w:r>
       <w:r>
         <w:rPr>
-          <w:rFonts w:cs="Calibri" w:ascii="Calibri" w:hAnsi="Calibri"/>
+          <w:rFonts w:cs="Arial" w:ascii="Arial" w:hAnsi="Arial"/>
+          <w:sz w:val="16"/>
         </w:rPr>
         <w:t>Società VALET SRL, con sede legale in Bologna,</w:t>
       </w:r>
       <w:r>
         <w:rPr>
-          <w:rFonts w:cs="Calibri" w:ascii="Calibri" w:hAnsi="Calibri"/>
+          <w:rFonts w:cs="Arial" w:ascii="Arial" w:hAnsi="Arial"/>
           <w:spacing w:val="26"/>
+          <w:sz w:val="16"/>
         </w:rPr>
         <w:t xml:space="preserve"> </w:t>
       </w:r>
       <w:r>
         <w:rPr>
-          <w:rFonts w:cs="Calibri" w:ascii="Calibri" w:hAnsi="Calibri"/>
+          <w:rFonts w:cs="Arial" w:ascii="Arial" w:hAnsi="Arial"/>
+          <w:sz w:val="16"/>
         </w:rPr>
         <w:t>CAP 40129, prov.</w:t>
       </w:r>
       <w:r>
         <w:rPr>
-          <w:rFonts w:cs="Calibri" w:ascii="Calibri" w:hAnsi="Calibri"/>
+          <w:rFonts w:cs="Arial" w:ascii="Arial" w:hAnsi="Arial"/>
           <w:spacing w:val="48"/>
+          <w:sz w:val="16"/>
         </w:rPr>
         <w:t xml:space="preserve"> </w:t>
       </w:r>
       <w:r>
         <w:rPr>
-          <w:rFonts w:cs="Calibri" w:ascii="Calibri" w:hAnsi="Calibri"/>
+          <w:rFonts w:cs="Arial" w:ascii="Arial" w:hAnsi="Arial"/>
+          <w:sz w:val="16"/>
         </w:rPr>
         <w:t xml:space="preserve">di </w:t>
       </w:r>
       <w:r>
         <w:rPr>
-          <w:rFonts w:cs="Calibri" w:ascii="Calibri" w:hAnsi="Calibri"/>
+          <w:rFonts w:cs="Arial" w:ascii="Arial" w:hAnsi="Arial"/>
           <w:w w:val="99"/>
+          <w:sz w:val="16"/>
         </w:rPr>
         <w:t>Bologna</w:t>
       </w:r>
       <w:r>
         <w:rPr>
-          <w:rFonts w:cs="Calibri" w:ascii="Calibri" w:hAnsi="Calibri"/>
+          <w:rFonts w:cs="Arial" w:ascii="Arial" w:hAnsi="Arial"/>
           <w:spacing w:val="-25"/>
+          <w:sz w:val="16"/>
         </w:rPr>
         <w:t xml:space="preserve"> </w:t>
       </w:r>
       <w:r>
         <w:rPr>
-          <w:rFonts w:cs="Calibri" w:ascii="Calibri" w:hAnsi="Calibri"/>
+          <w:rFonts w:cs="Arial" w:ascii="Arial" w:hAnsi="Arial"/>
+          <w:sz w:val="16"/>
         </w:rPr>
         <w:t>,</w:t>
       </w:r>
       <w:r>
         <w:rPr>
-          <w:rFonts w:cs="Calibri" w:ascii="Calibri" w:hAnsi="Calibri"/>
+          <w:rFonts w:cs="Arial" w:ascii="Arial" w:hAnsi="Arial"/>
           <w:spacing w:val="16"/>
+          <w:sz w:val="16"/>
         </w:rPr>
         <w:t xml:space="preserve"> </w:t>
       </w:r>
       <w:r>
         <w:rPr>
-          <w:rFonts w:cs="Calibri" w:ascii="Calibri" w:hAnsi="Calibri"/>
+          <w:rFonts w:cs="Arial" w:ascii="Arial" w:hAnsi="Arial"/>
+          <w:sz w:val="16"/>
         </w:rPr>
         <w:t>via Dei Fornaciai, n.29/B, Partita</w:t>
       </w:r>
       <w:r>
         <w:rPr>
-          <w:rFonts w:cs="Calibri" w:ascii="Calibri" w:hAnsi="Calibri"/>
+          <w:rFonts w:cs="Arial" w:ascii="Arial" w:hAnsi="Arial"/>
           <w:spacing w:val="18"/>
+          <w:sz w:val="16"/>
         </w:rPr>
         <w:t xml:space="preserve"> </w:t>
       </w:r>
       <w:r>
         <w:rPr>
-          <w:rFonts w:cs="Calibri" w:ascii="Calibri" w:hAnsi="Calibri"/>
+          <w:rFonts w:cs="Arial" w:ascii="Arial" w:hAnsi="Arial"/>
+          <w:sz w:val="16"/>
         </w:rPr>
         <w:t>IVA</w:t>
       </w:r>
       <w:r>
         <w:rPr>
-          <w:rFonts w:cs="Calibri" w:ascii="Calibri" w:hAnsi="Calibri"/>
+          <w:rFonts w:cs="Arial" w:ascii="Arial" w:hAnsi="Arial"/>
           <w:spacing w:val="-15"/>
+          <w:sz w:val="16"/>
         </w:rPr>
         <w:t xml:space="preserve"> e  </w:t>
       </w:r>
       <w:r>
         <w:rPr>
-          <w:rFonts w:cs="Calibri" w:ascii="Calibri" w:hAnsi="Calibri"/>
+          <w:rFonts w:cs="Arial" w:ascii="Arial" w:hAnsi="Arial"/>
+          <w:sz w:val="16"/>
         </w:rPr>
         <w:t>Codice Fiscale: 02107230373, iscritta al Registro delle Imprese</w:t>
       </w:r>
       <w:r>
         <w:rPr>
-          <w:rFonts w:cs="Calibri" w:ascii="Calibri" w:hAnsi="Calibri"/>
+          <w:rFonts w:cs="Arial" w:ascii="Arial" w:hAnsi="Arial"/>
           <w:spacing w:val="18"/>
+          <w:sz w:val="16"/>
         </w:rPr>
         <w:t xml:space="preserve"> </w:t>
       </w:r>
       <w:r>
         <w:rPr>
-          <w:rFonts w:cs="Calibri" w:ascii="Calibri" w:hAnsi="Calibri"/>
+          <w:rFonts w:cs="Arial" w:ascii="Arial" w:hAnsi="Arial"/>
+          <w:sz w:val="16"/>
         </w:rPr>
         <w:t xml:space="preserve">di Bologna al </w:t>
       </w:r>
       <w:r>
         <w:rPr>
-          <w:rFonts w:cs="Calibri" w:ascii="Calibri" w:hAnsi="Calibri"/>
+          <w:rFonts w:cs="Arial" w:ascii="Arial" w:hAnsi="Arial"/>
           <w:spacing w:val="-16"/>
+          <w:sz w:val="16"/>
         </w:rPr>
         <w:t xml:space="preserve">n. 27958 | </w:t>
       </w:r>
       <w:r>
         <w:rPr>
-          <w:rFonts w:cs="Calibri" w:ascii="Calibri" w:hAnsi="Calibri"/>
+          <w:rFonts w:cs="Arial" w:ascii="Arial" w:hAnsi="Arial"/>
+          <w:sz w:val="16"/>
         </w:rPr>
         <w:t>REA</w:t>
       </w:r>
       <w:r>
         <w:rPr>
-          <w:rFonts w:cs="Calibri" w:ascii="Calibri" w:hAnsi="Calibri"/>
+          <w:rFonts w:cs="Arial" w:ascii="Arial" w:hAnsi="Arial"/>
+          <w:sz w:val="16"/>
           <w:u w:val="single"/>
         </w:rPr>
         <w:t xml:space="preserve"> </w:t>
       </w:r>
       <w:r>
         <w:rPr>
-          <w:rFonts w:cs="Calibri" w:ascii="Calibri" w:hAnsi="Calibri"/>
+          <w:rFonts w:cs="Arial" w:ascii="Arial" w:hAnsi="Arial"/>
+          <w:sz w:val="16"/>
         </w:rPr>
         <w:t>BO252016, nella persona del suo Rappresentante Legale in carica Sig. Daniele Morini,</w:t>
       </w:r>
       <w:r>
         <w:rPr>
-          <w:rFonts w:cs="Calibri" w:ascii="Calibri" w:hAnsi="Calibri"/>
+          <w:rFonts w:cs="Arial" w:ascii="Arial" w:hAnsi="Arial"/>
           <w:spacing w:val="4"/>
+          <w:sz w:val="16"/>
         </w:rPr>
         <w:t xml:space="preserve"> </w:t>
       </w:r>
       <w:r>
         <w:rPr>
-          <w:rFonts w:cs="Calibri" w:ascii="Calibri" w:hAnsi="Calibri"/>
+          <w:rFonts w:cs="Arial" w:ascii="Arial" w:hAnsi="Arial"/>
+          <w:sz w:val="16"/>
         </w:rPr>
         <w:t>nato</w:t>
       </w:r>
       <w:r>
         <w:rPr>
-          <w:rFonts w:cs="Calibri" w:ascii="Calibri" w:hAnsi="Calibri"/>
+          <w:rFonts w:cs="Arial" w:ascii="Arial" w:hAnsi="Arial"/>
           <w:spacing w:val="8"/>
+          <w:sz w:val="16"/>
         </w:rPr>
         <w:t xml:space="preserve"> </w:t>
       </w:r>
       <w:r>
         <w:rPr>
-          <w:rFonts w:cs="Calibri" w:ascii="Calibri" w:hAnsi="Calibri"/>
+          <w:rFonts w:cs="Arial" w:ascii="Arial" w:hAnsi="Arial"/>
+          <w:sz w:val="16"/>
         </w:rPr>
         <w:t>il 23/07/1965,</w:t>
       </w:r>
       <w:r>
         <w:rPr>
-          <w:rFonts w:cs="Calibri" w:ascii="Calibri" w:hAnsi="Calibri"/>
+          <w:rFonts w:cs="Arial" w:ascii="Arial" w:hAnsi="Arial"/>
           <w:spacing w:val="7"/>
+          <w:sz w:val="16"/>
         </w:rPr>
         <w:t xml:space="preserve"> </w:t>
       </w:r>
       <w:r>
         <w:rPr>
-          <w:rFonts w:cs="Calibri" w:ascii="Calibri" w:hAnsi="Calibri"/>
+          <w:rFonts w:cs="Arial" w:ascii="Arial" w:hAnsi="Arial"/>
+          <w:sz w:val="16"/>
         </w:rPr>
         <w:t>a Castel San Pietro Terme, (BO)</w:t>
       </w:r>
       <w:r>
         <w:rPr>
-          <w:rFonts w:cs="Calibri" w:ascii="Calibri" w:hAnsi="Calibri"/>
+          <w:rFonts w:cs="Arial" w:ascii="Arial" w:hAnsi="Arial"/>
           <w:spacing w:val="-1"/>
+          <w:sz w:val="16"/>
         </w:rPr>
         <w:t xml:space="preserve"> </w:t>
       </w:r>
       <w:r>
         <w:rPr>
-          <w:rFonts w:cs="Calibri" w:ascii="Calibri" w:hAnsi="Calibri"/>
+          <w:rFonts w:cs="Arial" w:ascii="Arial" w:hAnsi="Arial"/>
+          <w:sz w:val="16"/>
         </w:rPr>
         <w:t>residente</w:t>
       </w:r>
       <w:r>
         <w:rPr>
-          <w:rFonts w:cs="Calibri" w:ascii="Calibri" w:hAnsi="Calibri"/>
+          <w:rFonts w:cs="Arial" w:ascii="Arial" w:hAnsi="Arial"/>
           <w:spacing w:val="-1"/>
+          <w:sz w:val="16"/>
         </w:rPr>
         <w:t xml:space="preserve"> </w:t>
       </w:r>
       <w:r>
         <w:rPr>
-          <w:rFonts w:cs="Calibri" w:ascii="Calibri" w:hAnsi="Calibri"/>
+          <w:rFonts w:cs="Arial" w:ascii="Arial" w:hAnsi="Arial"/>
+          <w:sz w:val="16"/>
         </w:rPr>
         <w:t>in Pianoro (BO),</w:t>
       </w:r>
       <w:r>
         <w:rPr>
-          <w:rFonts w:cs="Calibri" w:ascii="Calibri" w:hAnsi="Calibri"/>
+          <w:rFonts w:cs="Arial" w:ascii="Arial" w:hAnsi="Arial"/>
           <w:spacing w:val="-2"/>
+          <w:sz w:val="16"/>
         </w:rPr>
         <w:t xml:space="preserve"> CAP</w:t>
       </w:r>
       <w:r>
         <w:rPr>
-          <w:rFonts w:cs="Calibri" w:ascii="Calibri" w:hAnsi="Calibri"/>
+          <w:rFonts w:cs="Arial" w:ascii="Arial" w:hAnsi="Arial"/>
+          <w:sz w:val="16"/>
         </w:rPr>
         <w:t xml:space="preserve"> 40065, via Marzabotto, n</w:t>
       </w:r>
       <w:r>
         <w:rPr>
-          <w:rFonts w:cs="Calibri" w:ascii="Calibri" w:hAnsi="Calibri"/>
+          <w:rFonts w:cs="Arial" w:ascii="Arial" w:hAnsi="Arial"/>
           <w:spacing w:val="49"/>
+          <w:sz w:val="16"/>
         </w:rPr>
         <w:t xml:space="preserve">21 </w:t>
       </w:r>
       <w:r>
         <w:rPr>
-          <w:rFonts w:cs="Calibri" w:ascii="Calibri" w:hAnsi="Calibri"/>
+          <w:rFonts w:cs="Arial" w:ascii="Arial" w:hAnsi="Arial"/>
+          <w:sz w:val="16"/>
         </w:rPr>
         <w:t>Carta</w:t>
       </w:r>
       <w:r>
         <w:rPr>
-          <w:rFonts w:cs="Calibri" w:ascii="Calibri" w:hAnsi="Calibri"/>
+          <w:rFonts w:cs="Arial" w:ascii="Arial" w:hAnsi="Arial"/>
           <w:spacing w:val="40"/>
+          <w:sz w:val="16"/>
         </w:rPr>
         <w:t xml:space="preserve"> </w:t>
       </w:r>
       <w:r>
         <w:rPr>
-          <w:rFonts w:cs="Calibri" w:ascii="Calibri" w:hAnsi="Calibri"/>
+          <w:rFonts w:cs="Arial" w:ascii="Arial" w:hAnsi="Arial"/>
+          <w:sz w:val="16"/>
         </w:rPr>
         <w:t>d’Identità</w:t>
       </w:r>
       <w:r>
         <w:rPr>
-          <w:rFonts w:cs="Calibri" w:ascii="Calibri" w:hAnsi="Calibri"/>
+          <w:rFonts w:cs="Arial" w:ascii="Arial" w:hAnsi="Arial"/>
           <w:spacing w:val="38"/>
+          <w:sz w:val="16"/>
         </w:rPr>
         <w:t xml:space="preserve"> </w:t>
       </w:r>
       <w:r>
         <w:rPr>
-          <w:rFonts w:cs="Calibri" w:ascii="Calibri" w:hAnsi="Calibri"/>
+          <w:rFonts w:cs="Arial" w:ascii="Arial" w:hAnsi="Arial"/>
+          <w:sz w:val="16"/>
         </w:rPr>
         <w:t>n. CA36209QA,</w:t>
       </w:r>
       <w:r>
         <w:rPr>
-          <w:rFonts w:cs="Calibri" w:ascii="Calibri" w:hAnsi="Calibri"/>
+          <w:rFonts w:cs="Arial" w:ascii="Arial" w:hAnsi="Arial"/>
           <w:spacing w:val="38"/>
+          <w:sz w:val="16"/>
         </w:rPr>
         <w:t xml:space="preserve"> </w:t>
       </w:r>
       <w:r>
         <w:rPr>
-          <w:rFonts w:cs="Calibri" w:ascii="Calibri" w:hAnsi="Calibri"/>
+          <w:rFonts w:cs="Arial" w:ascii="Arial" w:hAnsi="Arial"/>
+          <w:sz w:val="16"/>
         </w:rPr>
         <w:t>Codice</w:t>
       </w:r>
       <w:r>
         <w:rPr>
-          <w:rFonts w:cs="Calibri" w:ascii="Calibri" w:hAnsi="Calibri"/>
+          <w:rFonts w:cs="Arial" w:ascii="Arial" w:hAnsi="Arial"/>
           <w:spacing w:val="36"/>
+          <w:sz w:val="16"/>
         </w:rPr>
         <w:t xml:space="preserve"> </w:t>
       </w:r>
       <w:r>
         <w:rPr>
-          <w:rFonts w:cs="Calibri" w:ascii="Calibri" w:hAnsi="Calibri"/>
+          <w:rFonts w:cs="Arial" w:ascii="Arial" w:hAnsi="Arial"/>
+          <w:sz w:val="16"/>
         </w:rPr>
         <w:t>Fiscale: MRN DNL 65L23 C265S occorrenti poteri (denominata di seguito come “</w:t>
       </w:r>
       <w:r>
         <w:rPr>
-          <w:rFonts w:cs="Calibri" w:ascii="Calibri" w:hAnsi="Calibri"/>
-          <w:b/>
-          <w:bCs/>
+          <w:rFonts w:cs="Arial" w:ascii="Arial" w:hAnsi="Arial"/>
+          <w:b/>
+          <w:bCs/>
+          <w:sz w:val="16"/>
         </w:rPr>
         <w:t>Segreteria Organizzativa</w:t>
       </w:r>
       <w:r>
         <w:rPr>
-          <w:rFonts w:cs="Calibri" w:ascii="Calibri" w:hAnsi="Calibri"/>
+          <w:rFonts w:cs="Arial" w:ascii="Arial" w:hAnsi="Arial"/>
+          <w:sz w:val="16"/>
         </w:rPr>
         <w:t xml:space="preserve">”, </w:t>
       </w:r>
       <w:r>
         <w:rPr>
-          <w:rFonts w:cs="Calibri" w:ascii="Calibri" w:hAnsi="Calibri"/>
+          <w:rFonts w:cs="Arial" w:ascii="Arial" w:hAnsi="Arial"/>
           <w:spacing w:val="-14"/>
+          <w:sz w:val="16"/>
         </w:rPr>
         <w:t xml:space="preserve"> </w:t>
       </w:r>
       <w:r>
         <w:rPr>
-          <w:rFonts w:cs="Calibri" w:ascii="Calibri" w:hAnsi="Calibri"/>
+          <w:rFonts w:cs="Arial" w:ascii="Arial" w:hAnsi="Arial"/>
+          <w:sz w:val="16"/>
         </w:rPr>
         <w:t>pec valet@pec.it</w:t>
       </w:r>
@@ -368,6 +421,7 @@
     <w:p>
       <w:pPr>
         <w:pStyle w:val="Normal"/>
+        <w:spacing w:before="0" w:after="0" w:line="230" w:lineRule="auto"/>
         <w:jc w:val="center"/>
         <w:rPr>
           <w:rFonts w:ascii="Calibri" w:hAnsi="Calibri" w:cs="Calibri"/>
@@ -380,9 +434,10 @@
       <w:bookmarkEnd w:id="1"/>
       <w:r>
         <w:rPr>
-          <w:rFonts w:cs="Calibri" w:ascii="Calibri" w:hAnsi="Calibri"/>
-          <w:b/>
-          <w:bCs/>
+          <w:rFonts w:cs="Arial" w:ascii="Arial" w:hAnsi="Arial"/>
+          <w:b/>
+          <w:bCs/>
+          <w:sz w:val="16"/>
         </w:rPr>
         <w:t>e</w:t>
       </w:r>
@@ -432,26 +487,29 @@
           <w:p>
             <w:pPr>
               <w:pStyle w:val="TextBody"/>
-              <w:spacing w:before="1" w:after="0"/>
+              <w:spacing w:before="0" w:after="0" w:line="230" w:lineRule="auto"/>
               <w:ind w:right="56" w:hanging="0"/>
               <w:rPr/>
             </w:pPr>
             <w:r>
               <w:rPr>
-                <w:rFonts w:cs="Calibri" w:ascii="Calibri" w:hAnsi="Calibri"/>
+                <w:rFonts w:cs="Arial" w:ascii="Arial" w:hAnsi="Arial"/>
+                <w:sz w:val="16"/>
               </w:rPr>
               <w:t xml:space="preserve">la </w:t>
             </w:r>
             <w:r>
               <w:rPr>
-                <w:rFonts w:cs="Calibri" w:ascii="Calibri" w:hAnsi="Calibri"/>
+                <w:rFonts w:cs="Arial" w:ascii="Arial" w:hAnsi="Arial"/>
                 <w:spacing w:val="25"/>
+                <w:sz w:val="16"/>
               </w:rPr>
               <w:t xml:space="preserve"> </w:t>
             </w:r>
             <w:r>
               <w:rPr>
-                <w:rFonts w:cs="Calibri" w:ascii="Calibri" w:hAnsi="Calibri"/>
+                <w:rFonts w:cs="Arial" w:ascii="Arial" w:hAnsi="Arial"/>
+                <w:sz w:val="16"/>
               </w:rPr>
               <w:t>Società</w:t>
             </w:r>
@@ -471,7 +529,7 @@
           <w:p>
             <w:pPr>
               <w:pStyle w:val="TextBody"/>
-              <w:spacing w:before="1" w:after="0"/>
+              <w:spacing w:before="0" w:after="0" w:line="230" w:lineRule="auto"/>
               <w:ind w:right="56" w:hanging="0"/>
               <w:rPr>
                 <w:rFonts w:ascii="Calibri" w:hAnsi="Calibri" w:cs="Calibri"/>
@@ -479,7 +537,8 @@
             </w:pPr>
             <w:r>
               <w:rPr>
-                <w:rFonts w:cs="Calibri" w:ascii="Calibri" w:hAnsi="Calibri"/>
+                <w:rFonts w:cs="Arial" w:ascii="Arial" w:hAnsi="Arial"/>
+                <w:sz w:val="16"/>
               </w:rPr>
               <w:t>{{ sponsor.legal_name }}</w:t>
             </w:r>
@@ -503,26 +562,29 @@
           <w:p>
             <w:pPr>
               <w:pStyle w:val="TextBody"/>
-              <w:spacing w:before="1" w:after="0"/>
+              <w:spacing w:before="0" w:after="0" w:line="230" w:lineRule="auto"/>
               <w:ind w:right="56" w:hanging="0"/>
               <w:rPr/>
             </w:pPr>
             <w:r>
               <w:rPr>
-                <w:rFonts w:cs="Calibri" w:ascii="Calibri" w:hAnsi="Calibri"/>
+                <w:rFonts w:cs="Arial" w:ascii="Arial" w:hAnsi="Arial"/>
+                <w:sz w:val="16"/>
               </w:rPr>
               <w:t xml:space="preserve">con   sede  legale </w:t>
             </w:r>
             <w:r>
               <w:rPr>
-                <w:rFonts w:cs="Calibri" w:ascii="Calibri" w:hAnsi="Calibri"/>
+                <w:rFonts w:cs="Arial" w:ascii="Arial" w:hAnsi="Arial"/>
                 <w:spacing w:val="25"/>
+                <w:sz w:val="16"/>
               </w:rPr>
               <w:t xml:space="preserve"> </w:t>
             </w:r>
             <w:r>
               <w:rPr>
-                <w:rFonts w:cs="Calibri" w:ascii="Calibri" w:hAnsi="Calibri"/>
+                <w:rFonts w:cs="Arial" w:ascii="Arial" w:hAnsi="Arial"/>
+                <w:sz w:val="16"/>
               </w:rPr>
               <w:t>in</w:t>
             </w:r>
@@ -542,7 +604,7 @@
           <w:p>
             <w:pPr>
               <w:pStyle w:val="TextBody"/>
-              <w:spacing w:before="1" w:after="0"/>
+              <w:spacing w:before="0" w:after="0" w:line="230" w:lineRule="auto"/>
               <w:ind w:right="56" w:hanging="0"/>
               <w:rPr>
                 <w:rFonts w:ascii="Calibri" w:hAnsi="Calibri" w:cs="Calibri"/>
@@ -550,7 +612,8 @@
             </w:pPr>
             <w:r>
               <w:rPr>
-                <w:rFonts w:cs="Calibri" w:ascii="Calibri" w:hAnsi="Calibri"/>
+                <w:rFonts w:cs="Arial" w:ascii="Arial" w:hAnsi="Arial"/>
+                <w:sz w:val="16"/>
               </w:rPr>
               <w:t>{{ sponsor.billing_city }}</w:t>
             </w:r>
@@ -574,7 +637,7 @@
           <w:p>
             <w:pPr>
               <w:pStyle w:val="TextBody"/>
-              <w:spacing w:before="1" w:after="0"/>
+              <w:spacing w:before="0" w:after="0" w:line="230" w:lineRule="auto"/>
               <w:ind w:right="56" w:hanging="0"/>
               <w:rPr>
                 <w:rFonts w:ascii="Calibri" w:hAnsi="Calibri" w:cs="Calibri"/>
@@ -582,7 +645,8 @@
             </w:pPr>
             <w:r>
               <w:rPr>
-                <w:rFonts w:cs="Calibri" w:ascii="Calibri" w:hAnsi="Calibri"/>
+                <w:rFonts w:cs="Arial" w:ascii="Arial" w:hAnsi="Arial"/>
+                <w:sz w:val="16"/>
               </w:rPr>
               <w:t>Indirizzo e num. civico</w:t>
             </w:r>
@@ -602,7 +666,7 @@
           <w:p>
             <w:pPr>
               <w:pStyle w:val="TextBody"/>
-              <w:spacing w:before="1" w:after="0"/>
+              <w:spacing w:before="0" w:after="0" w:line="230" w:lineRule="auto"/>
               <w:ind w:right="56" w:hanging="0"/>
               <w:rPr>
                 <w:rFonts w:ascii="Calibri" w:hAnsi="Calibri" w:cs="Calibri"/>
@@ -610,7 +674,8 @@
             </w:pPr>
             <w:r>
               <w:rPr>
-                <w:rFonts w:cs="Calibri" w:ascii="Calibri" w:hAnsi="Calibri"/>
+                <w:rFonts w:cs="Arial" w:ascii="Arial" w:hAnsi="Arial"/>
+                <w:sz w:val="16"/>
               </w:rPr>
               <w:t>{{ sponsor.billing_street }} {{ sponsor.billing_street_number }}</w:t>
             </w:r>
@@ -633,7 +698,7 @@
           <w:p>
             <w:pPr>
               <w:pStyle w:val="TextBody"/>
-              <w:spacing w:before="1" w:after="0"/>
+              <w:spacing w:before="0" w:after="0" w:line="230" w:lineRule="auto"/>
               <w:ind w:right="56" w:hanging="0"/>
               <w:rPr>
                 <w:rFonts w:ascii="Calibri" w:hAnsi="Calibri" w:cs="Calibri"/>
@@ -641,7 +706,8 @@
             </w:pPr>
             <w:r>
               <w:rPr>
-                <w:rFonts w:cs="Calibri" w:ascii="Calibri" w:hAnsi="Calibri"/>
+                <w:rFonts w:cs="Arial" w:ascii="Arial" w:hAnsi="Arial"/>
+                <w:sz w:val="16"/>
               </w:rPr>
               <w:t>CAP</w:t>
             </w:r>
@@ -661,7 +727,7 @@
           <w:p>
             <w:pPr>
               <w:pStyle w:val="TextBody"/>
-              <w:spacing w:before="1" w:after="0"/>
+              <w:spacing w:before="0" w:after="0" w:line="230" w:lineRule="auto"/>
               <w:ind w:right="56" w:hanging="0"/>
               <w:rPr>
                 <w:rFonts w:ascii="Calibri" w:hAnsi="Calibri" w:cs="Calibri"/>
@@ -669,7 +735,8 @@
             </w:pPr>
             <w:r>
               <w:rPr>
-                <w:rFonts w:cs="Calibri" w:ascii="Calibri" w:hAnsi="Calibri"/>
+                <w:rFonts w:cs="Arial" w:ascii="Arial" w:hAnsi="Arial"/>
+                <w:sz w:val="16"/>
               </w:rPr>
               <w:t>{{ sponsor.billing_zip }}</w:t>
             </w:r>
@@ -690,7 +757,7 @@
           <w:p>
             <w:pPr>
               <w:pStyle w:val="TextBody"/>
-              <w:spacing w:before="1" w:after="0"/>
+              <w:spacing w:before="0" w:after="0" w:line="230" w:lineRule="auto"/>
               <w:ind w:right="56" w:hanging="0"/>
               <w:rPr>
                 <w:rFonts w:ascii="Calibri" w:hAnsi="Calibri" w:cs="Calibri"/>
@@ -698,7 +765,8 @@
             </w:pPr>
             <w:r>
               <w:rPr>
-                <w:rFonts w:cs="Calibri" w:ascii="Calibri" w:hAnsi="Calibri"/>
+                <w:rFonts w:cs="Arial" w:ascii="Arial" w:hAnsi="Arial"/>
+                <w:sz w:val="16"/>
               </w:rPr>
               <w:t>Prov.</w:t>
             </w:r>
@@ -718,7 +786,7 @@
           <w:p>
             <w:pPr>
               <w:pStyle w:val="TextBody"/>
-              <w:spacing w:before="1" w:after="0"/>
+              <w:spacing w:before="0" w:after="0" w:line="230" w:lineRule="auto"/>
               <w:ind w:right="56" w:hanging="0"/>
               <w:rPr>
                 <w:rFonts w:ascii="Calibri" w:hAnsi="Calibri" w:cs="Calibri"/>
@@ -728,8 +796,8 @@
             </w:pPr>
             <w:r>
               <w:rPr>
-                <w:rFonts w:cs="Calibri" w:ascii="Calibri" w:hAnsi="Calibri"/>
-                <w:sz w:val="18"/>
+                <w:rFonts w:cs="Arial" w:ascii="Arial" w:hAnsi="Arial"/>
+                <w:sz w:val="16"/>
                 <w:szCs w:val="18"/>
               </w:rPr>
               <w:t>{{ sponsor.billing_province }}</w:t>
@@ -750,7 +818,7 @@
           <w:p>
             <w:pPr>
               <w:pStyle w:val="TextBody"/>
-              <w:spacing w:before="1" w:after="0"/>
+              <w:spacing w:before="0" w:after="0" w:line="230" w:lineRule="auto"/>
               <w:ind w:right="56" w:hanging="0"/>
               <w:rPr>
                 <w:rFonts w:ascii="Calibri" w:hAnsi="Calibri" w:cs="Calibri"/>
@@ -758,7 +826,8 @@
             </w:pPr>
             <w:r>
               <w:rPr>
-                <w:rFonts w:cs="Calibri" w:ascii="Calibri" w:hAnsi="Calibri"/>
+                <w:rFonts w:cs="Arial" w:ascii="Arial" w:hAnsi="Arial"/>
+                <w:sz w:val="16"/>
               </w:rPr>
               <w:t>P. IVA</w:t>
             </w:r>
@@ -778,7 +847,7 @@
           <w:p>
             <w:pPr>
               <w:pStyle w:val="TextBody"/>
-              <w:spacing w:before="1" w:after="0"/>
+              <w:spacing w:before="0" w:after="0" w:line="230" w:lineRule="auto"/>
               <w:ind w:right="56" w:hanging="0"/>
               <w:rPr>
                 <w:rFonts w:ascii="Calibri" w:hAnsi="Calibri" w:cs="Calibri"/>
@@ -786,7 +855,8 @@
             </w:pPr>
             <w:r>
               <w:rPr>
-                <w:rFonts w:cs="Calibri" w:ascii="Calibri" w:hAnsi="Calibri"/>
+                <w:rFonts w:cs="Arial" w:ascii="Arial" w:hAnsi="Arial"/>
+                <w:sz w:val="16"/>
               </w:rPr>
               <w:t>{{ sponsor.vat_number }}</w:t>
             </w:r>
@@ -806,7 +876,7 @@
           <w:p>
             <w:pPr>
               <w:pStyle w:val="TextBody"/>
-              <w:spacing w:before="1" w:after="0"/>
+              <w:spacing w:before="0" w:after="0" w:line="230" w:lineRule="auto"/>
               <w:ind w:right="56" w:hanging="0"/>
               <w:rPr>
                 <w:rFonts w:ascii="Calibri" w:hAnsi="Calibri" w:cs="Calibri"/>
@@ -814,7 +884,8 @@
             </w:pPr>
             <w:r>
               <w:rPr>
-                <w:rFonts w:cs="Calibri" w:ascii="Calibri" w:hAnsi="Calibri"/>
+                <w:rFonts w:cs="Arial" w:ascii="Arial" w:hAnsi="Arial"/>
+                <w:sz w:val="16"/>
               </w:rPr>
               <w:t>C.F.</w:t>
             </w:r>
@@ -834,7 +905,7 @@
           <w:p>
             <w:pPr>
               <w:pStyle w:val="TextBody"/>
-              <w:spacing w:before="1" w:after="0"/>
+              <w:spacing w:before="0" w:after="0" w:line="230" w:lineRule="auto"/>
               <w:ind w:right="56" w:hanging="0"/>
               <w:rPr>
                 <w:rFonts w:ascii="Calibri" w:hAnsi="Calibri" w:cs="Calibri"/>
@@ -842,7 +913,8 @@
             </w:pPr>
             <w:r>
               <w:rPr>
-                <w:rFonts w:cs="Calibri" w:ascii="Calibri" w:hAnsi="Calibri"/>
+                <w:rFonts w:cs="Arial" w:ascii="Arial" w:hAnsi="Arial"/>
+                <w:sz w:val="16"/>
               </w:rPr>
               <w:t>{{ sponsor.tax_code }}</w:t>
             </w:r>
@@ -866,7 +938,7 @@
           <w:p>
             <w:pPr>
               <w:pStyle w:val="TextBody"/>
-              <w:spacing w:before="1" w:after="0"/>
+              <w:spacing w:before="0" w:after="0" w:line="230" w:lineRule="auto"/>
               <w:ind w:right="56" w:hanging="0"/>
               <w:rPr>
                 <w:rFonts w:ascii="Calibri" w:hAnsi="Calibri" w:cs="Calibri"/>
@@ -874,7 +946,8 @@
             </w:pPr>
             <w:r>
               <w:rPr>
-                <w:rFonts w:cs="Calibri" w:ascii="Calibri" w:hAnsi="Calibri"/>
+                <w:rFonts w:cs="Arial" w:ascii="Arial" w:hAnsi="Arial"/>
+                <w:sz w:val="16"/>
               </w:rPr>
               <w:t xml:space="preserve">Indirizzo email </w:t>
             </w:r>
@@ -894,7 +967,7 @@
           <w:p>
             <w:pPr>
               <w:pStyle w:val="TextBody"/>
-              <w:spacing w:before="1" w:after="0"/>
+              <w:spacing w:before="0" w:after="0" w:line="230" w:lineRule="auto"/>
               <w:ind w:right="56" w:hanging="0"/>
               <w:rPr>
                 <w:rFonts w:ascii="Calibri" w:hAnsi="Calibri" w:cs="Calibri"/>
@@ -902,7 +975,8 @@
             </w:pPr>
             <w:r>
               <w:rPr>
-                <w:rFonts w:cs="Calibri" w:ascii="Calibri" w:hAnsi="Calibri"/>
+                <w:rFonts w:cs="Arial" w:ascii="Arial" w:hAnsi="Arial"/>
+                <w:sz w:val="16"/>
               </w:rPr>
               <w:t>{{ operational_email }}</w:t>
             </w:r>
@@ -923,7 +997,7 @@
           <w:p>
             <w:pPr>
               <w:pStyle w:val="TextBody"/>
-              <w:spacing w:before="1" w:after="0"/>
+              <w:spacing w:before="0" w:after="0" w:line="230" w:lineRule="auto"/>
               <w:ind w:right="56" w:hanging="0"/>
               <w:rPr>
                 <w:rFonts w:ascii="Calibri" w:hAnsi="Calibri" w:cs="Calibri"/>
@@ -931,7 +1005,8 @@
             </w:pPr>
             <w:r>
               <w:rPr>
-                <w:rFonts w:cs="Calibri" w:ascii="Calibri" w:hAnsi="Calibri"/>
+                <w:rFonts w:cs="Arial" w:ascii="Arial" w:hAnsi="Arial"/>
+                <w:sz w:val="16"/>
               </w:rPr>
               <w:t>PEC</w:t>
             </w:r>
@@ -951,7 +1026,7 @@
           <w:p>
             <w:pPr>
               <w:pStyle w:val="TextBody"/>
-              <w:spacing w:before="1" w:after="0"/>
+              <w:spacing w:before="0" w:after="0" w:line="230" w:lineRule="auto"/>
               <w:ind w:right="56" w:hanging="0"/>
               <w:rPr>
                 <w:rFonts w:ascii="Calibri" w:hAnsi="Calibri" w:cs="Calibri"/>
@@ -959,7 +1034,8 @@
             </w:pPr>
             <w:r>
               <w:rPr>
-                <w:rFonts w:cs="Calibri" w:ascii="Calibri" w:hAnsi="Calibri"/>
+                <w:rFonts w:cs="Arial" w:ascii="Arial" w:hAnsi="Arial"/>
+                <w:sz w:val="16"/>
               </w:rPr>
               <w:t>{{ sponsor.pec_email }}</w:t>
             </w:r>
@@ -983,7 +1059,7 @@
           <w:p>
             <w:pPr>
               <w:pStyle w:val="TextBody"/>
-              <w:spacing w:before="1" w:after="0"/>
+              <w:spacing w:before="0" w:after="0" w:line="230" w:lineRule="auto"/>
               <w:ind w:right="56" w:hanging="0"/>
               <w:rPr>
                 <w:rFonts w:ascii="Calibri" w:hAnsi="Calibri" w:cs="Calibri"/>
@@ -991,27 +1067,31 @@
             </w:pPr>
             <w:r>
               <w:rPr>
-                <w:rFonts w:cs="Calibri" w:ascii="Calibri" w:hAnsi="Calibri"/>
+                <w:rFonts w:cs="Arial" w:ascii="Arial" w:hAnsi="Arial"/>
+                <w:sz w:val="16"/>
               </w:rPr>
               <w:t xml:space="preserve">iscritta  al  Reg.delle </w:t>
             </w:r>
             <w:r>
               <w:rPr>
-                <w:rFonts w:cs="Calibri" w:ascii="Calibri" w:hAnsi="Calibri"/>
+                <w:rFonts w:cs="Arial" w:ascii="Arial" w:hAnsi="Arial"/>
                 <w:spacing w:val="40"/>
+                <w:sz w:val="16"/>
               </w:rPr>
               <w:t xml:space="preserve"> </w:t>
             </w:r>
             <w:r>
               <w:rPr>
-                <w:rFonts w:cs="Calibri" w:ascii="Calibri" w:hAnsi="Calibri"/>
+                <w:rFonts w:cs="Arial" w:ascii="Arial" w:hAnsi="Arial"/>
+                <w:sz w:val="16"/>
               </w:rPr>
               <w:t xml:space="preserve">Imprese </w:t>
             </w:r>
             <w:r>
               <w:rPr>
-                <w:rFonts w:cs="Calibri" w:ascii="Calibri" w:hAnsi="Calibri"/>
+                <w:rFonts w:cs="Arial" w:ascii="Arial" w:hAnsi="Arial"/>
                 <w:spacing w:val="18"/>
+                <w:sz w:val="16"/>
               </w:rPr>
               <w:t xml:space="preserve"> di</w:t>
             </w:r>
@@ -1032,7 +1112,7 @@
             <w:pPr>
               <w:pStyle w:val="TextBody"/>
               <w:snapToGrid w:val="false"/>
-              <w:spacing w:before="1" w:after="0"/>
+              <w:spacing w:before="0" w:after="0" w:line="230" w:lineRule="auto"/>
               <w:ind w:right="56" w:hanging="0"/>
               <w:rPr>
                 <w:rFonts w:ascii="Calibri" w:hAnsi="Calibri" w:cs="Calibri"/>
@@ -1040,7 +1120,8 @@
             </w:pPr>
             <w:r>
               <w:rPr>
-                <w:rFonts w:cs="Calibri" w:ascii="Calibri" w:hAnsi="Calibri"/>
+                <w:rFonts w:cs="Arial" w:ascii="Arial" w:hAnsi="Arial"/>
+                <w:sz w:val="16"/>
               </w:rPr>
               <w:t>{{ sponsor.rea_city }}</w:t>
             </w:r>
@@ -1061,7 +1142,7 @@
           <w:p>
             <w:pPr>
               <w:pStyle w:val="TextBody"/>
-              <w:spacing w:before="1" w:after="0"/>
+              <w:spacing w:before="0" w:after="0" w:line="230" w:lineRule="auto"/>
               <w:ind w:right="56" w:hanging="0"/>
               <w:rPr>
                 <w:rFonts w:ascii="Calibri" w:hAnsi="Calibri" w:cs="Calibri"/>
@@ -1069,7 +1150,8 @@
             </w:pPr>
             <w:r>
               <w:rPr>
-                <w:rFonts w:cs="Calibri" w:ascii="Calibri" w:hAnsi="Calibri"/>
+                <w:rFonts w:cs="Arial" w:ascii="Arial" w:hAnsi="Arial"/>
+                <w:sz w:val="16"/>
               </w:rPr>
               <w:t>al n° REA</w:t>
             </w:r>
@@ -1089,7 +1171,7 @@
             <w:pPr>
               <w:pStyle w:val="TextBody"/>
               <w:snapToGrid w:val="false"/>
-              <w:spacing w:before="1" w:after="0"/>
+              <w:spacing w:before="0" w:after="0" w:line="230" w:lineRule="auto"/>
               <w:ind w:right="56" w:hanging="0"/>
               <w:rPr>
                 <w:rFonts w:ascii="Calibri" w:hAnsi="Calibri" w:cs="Calibri"/>
@@ -1097,7 +1179,8 @@
             </w:pPr>
             <w:r>
               <w:rPr>
-                <w:rFonts w:cs="Calibri" w:ascii="Calibri" w:hAnsi="Calibri"/>
+                <w:rFonts w:cs="Arial" w:ascii="Arial" w:hAnsi="Arial"/>
+                <w:sz w:val="16"/>
               </w:rPr>
               <w:t>{{ sponsor.rea_number }}</w:t>
             </w:r>
@@ -1121,7 +1204,7 @@
           <w:p>
             <w:pPr>
               <w:pStyle w:val="TextBody"/>
-              <w:spacing w:before="1" w:after="0"/>
+              <w:spacing w:before="0" w:after="0" w:line="230" w:lineRule="auto"/>
               <w:ind w:right="56" w:hanging="0"/>
               <w:rPr>
                 <w:rFonts w:ascii="Calibri" w:hAnsi="Calibri" w:cs="Calibri"/>
@@ -1129,7 +1212,8 @@
             </w:pPr>
             <w:r>
               <w:rPr>
-                <w:rFonts w:cs="Calibri" w:ascii="Calibri" w:hAnsi="Calibri"/>
+                <w:rFonts w:cs="Arial" w:ascii="Arial" w:hAnsi="Arial"/>
+                <w:sz w:val="16"/>
               </w:rPr>
               <w:t>nella persona del suo Rappresentante Legale in carica Sig</w:t>
             </w:r>
@@ -1149,7 +1233,7 @@
           <w:p>
             <w:pPr>
               <w:pStyle w:val="TextBody"/>
-              <w:spacing w:before="1" w:after="0"/>
+              <w:spacing w:before="0" w:after="0" w:line="230" w:lineRule="auto"/>
               <w:ind w:right="56" w:hanging="0"/>
               <w:rPr>
                 <w:rFonts w:ascii="Calibri" w:hAnsi="Calibri" w:cs="Calibri"/>
@@ -1157,7 +1241,8 @@
             </w:pPr>
             <w:r>
               <w:rPr>
-                <w:rFonts w:cs="Calibri" w:ascii="Calibri" w:hAnsi="Calibri"/>
+                <w:rFonts w:cs="Arial" w:ascii="Arial" w:hAnsi="Arial"/>
+                <w:sz w:val="16"/>
               </w:rPr>
               <w:t>{{ signer.full_name }}</w:t>
             </w:r>
@@ -1181,26 +1266,29 @@
           <w:p>
             <w:pPr>
               <w:pStyle w:val="TextBody"/>
-              <w:spacing w:before="1" w:after="0"/>
+              <w:spacing w:before="0" w:after="0" w:line="230" w:lineRule="auto"/>
               <w:ind w:right="56" w:hanging="0"/>
               <w:rPr/>
             </w:pPr>
             <w:r>
               <w:rPr>
-                <w:rFonts w:cs="Calibri" w:ascii="Calibri" w:hAnsi="Calibri"/>
+                <w:rFonts w:cs="Arial" w:ascii="Arial" w:hAnsi="Arial"/>
+                <w:sz w:val="16"/>
               </w:rPr>
               <w:t>nato</w:t>
             </w:r>
             <w:r>
               <w:rPr>
-                <w:rFonts w:cs="Calibri" w:ascii="Calibri" w:hAnsi="Calibri"/>
+                <w:rFonts w:cs="Arial" w:ascii="Arial" w:hAnsi="Arial"/>
                 <w:spacing w:val="8"/>
+                <w:sz w:val="16"/>
               </w:rPr>
               <w:t xml:space="preserve"> </w:t>
             </w:r>
             <w:r>
               <w:rPr>
-                <w:rFonts w:cs="Calibri" w:ascii="Calibri" w:hAnsi="Calibri"/>
+                <w:rFonts w:cs="Arial" w:ascii="Arial" w:hAnsi="Arial"/>
+                <w:sz w:val="16"/>
               </w:rPr>
               <w:t>il</w:t>
             </w:r>
@@ -1221,7 +1309,7 @@
             <w:pPr>
               <w:pStyle w:val="TextBody"/>
               <w:snapToGrid w:val="false"/>
-              <w:spacing w:before="1" w:after="0"/>
+              <w:spacing w:before="0" w:after="0" w:line="230" w:lineRule="auto"/>
               <w:ind w:right="56" w:hanging="0"/>
               <w:rPr>
                 <w:rFonts w:ascii="Calibri" w:hAnsi="Calibri" w:cs="Calibri"/>
@@ -1229,7 +1317,8 @@
             </w:pPr>
             <w:r>
               <w:rPr>
-                <w:rFonts w:cs="Calibri" w:ascii="Calibri" w:hAnsi="Calibri"/>
+                <w:rFonts w:cs="Arial" w:ascii="Arial" w:hAnsi="Arial"/>
+                <w:sz w:val="16"/>
               </w:rPr>
               <w:t>{{ signer.birth_date|format_date }}</w:t>
             </w:r>
@@ -1249,7 +1338,7 @@
           <w:p>
             <w:pPr>
               <w:pStyle w:val="TextBody"/>
-              <w:spacing w:before="1" w:after="0"/>
+              <w:spacing w:before="0" w:after="0" w:line="230" w:lineRule="auto"/>
               <w:ind w:right="56" w:hanging="0"/>
               <w:rPr>
                 <w:rFonts w:ascii="Calibri" w:hAnsi="Calibri" w:cs="Calibri"/>
@@ -1257,7 +1346,8 @@
             </w:pPr>
             <w:r>
               <w:rPr>
-                <w:rFonts w:cs="Calibri" w:ascii="Calibri" w:hAnsi="Calibri"/>
+                <w:rFonts w:cs="Arial" w:ascii="Arial" w:hAnsi="Arial"/>
+                <w:sz w:val="16"/>
               </w:rPr>
               <w:t>a</w:t>
             </w:r>
@@ -1278,7 +1368,7 @@
             <w:pPr>
               <w:pStyle w:val="TextBody"/>
               <w:snapToGrid w:val="false"/>
-              <w:spacing w:before="1" w:after="0"/>
+              <w:spacing w:before="0" w:after="0" w:line="230" w:lineRule="auto"/>
               <w:ind w:right="56" w:hanging="0"/>
               <w:rPr>
                 <w:rFonts w:ascii="Calibri" w:hAnsi="Calibri" w:cs="Calibri"/>
@@ -1286,7 +1376,8 @@
             </w:pPr>
             <w:r>
               <w:rPr>
-                <w:rFonts w:cs="Calibri" w:ascii="Calibri" w:hAnsi="Calibri"/>
+                <w:rFonts w:cs="Arial" w:ascii="Arial" w:hAnsi="Arial"/>
+                <w:sz w:val="16"/>
               </w:rPr>
               <w:t>{{ signer.birth_place }}</w:t>
             </w:r>
@@ -1307,7 +1398,7 @@
           <w:p>
             <w:pPr>
               <w:pStyle w:val="TextBody"/>
-              <w:spacing w:before="1" w:after="0"/>
+              <w:spacing w:before="0" w:after="0" w:line="230" w:lineRule="auto"/>
               <w:ind w:right="56" w:hanging="0"/>
               <w:rPr>
                 <w:rFonts w:ascii="Calibri" w:hAnsi="Calibri" w:cs="Calibri"/>
@@ -1315,7 +1406,8 @@
             </w:pPr>
             <w:r>
               <w:rPr>
-                <w:rFonts w:cs="Calibri" w:ascii="Calibri" w:hAnsi="Calibri"/>
+                <w:rFonts w:cs="Arial" w:ascii="Arial" w:hAnsi="Arial"/>
+                <w:sz w:val="16"/>
               </w:rPr>
               <w:t>Prov. di</w:t>
             </w:r>
@@ -1335,7 +1427,7 @@
             <w:pPr>
               <w:pStyle w:val="TextBody"/>
               <w:snapToGrid w:val="false"/>
-              <w:spacing w:before="1" w:after="0"/>
+              <w:spacing w:before="0" w:after="0" w:line="230" w:lineRule="auto"/>
               <w:ind w:right="56" w:hanging="0"/>
               <w:rPr>
                 <w:rFonts w:ascii="Calibri" w:hAnsi="Calibri" w:cs="Calibri"/>
@@ -1343,7 +1435,8 @@
             </w:pPr>
             <w:r>
               <w:rPr>
-                <w:rFonts w:cs="Calibri" w:ascii="Calibri" w:hAnsi="Calibri"/>
+                <w:rFonts w:cs="Arial" w:ascii="Arial" w:hAnsi="Arial"/>
+                <w:sz w:val="16"/>
               </w:rPr>
               <w:t>{{ signer.birth_province }}</w:t>
             </w:r>
@@ -1367,7 +1460,7 @@
           <w:p>
             <w:pPr>
               <w:pStyle w:val="TextBody"/>
-              <w:spacing w:before="1" w:after="0"/>
+              <w:spacing w:before="0" w:after="0" w:line="230" w:lineRule="auto"/>
               <w:ind w:right="56" w:hanging="0"/>
               <w:rPr>
                 <w:rFonts w:ascii="Calibri" w:hAnsi="Calibri" w:cs="Calibri"/>
@@ -1375,7 +1468,8 @@
             </w:pPr>
             <w:r>
               <w:rPr>
-                <w:rFonts w:cs="Calibri" w:ascii="Calibri" w:hAnsi="Calibri"/>
+                <w:rFonts w:cs="Arial" w:ascii="Arial" w:hAnsi="Arial"/>
+                <w:sz w:val="16"/>
               </w:rPr>
               <w:t>Residente in</w:t>
             </w:r>
@@ -1396,7 +1490,7 @@
             <w:pPr>
               <w:pStyle w:val="TextBody"/>
               <w:snapToGrid w:val="false"/>
-              <w:spacing w:before="1" w:after="0"/>
+              <w:spacing w:before="0" w:after="0" w:line="230" w:lineRule="auto"/>
               <w:ind w:right="56" w:hanging="0"/>
               <w:rPr>
                 <w:rFonts w:ascii="Calibri" w:hAnsi="Calibri" w:cs="Calibri"/>
@@ -1404,7 +1498,8 @@
             </w:pPr>
             <w:r>
               <w:rPr>
-                <w:rFonts w:cs="Calibri" w:ascii="Calibri" w:hAnsi="Calibri"/>
+                <w:rFonts w:cs="Arial" w:ascii="Arial" w:hAnsi="Arial"/>
+                <w:sz w:val="16"/>
               </w:rPr>
               <w:t>{{ signer.residence_city }}</w:t>
             </w:r>
@@ -1425,7 +1520,7 @@
           <w:p>
             <w:pPr>
               <w:pStyle w:val="TextBody"/>
-              <w:spacing w:before="1" w:after="0"/>
+              <w:spacing w:before="0" w:after="0" w:line="230" w:lineRule="auto"/>
               <w:ind w:right="56" w:hanging="0"/>
               <w:rPr>
                 <w:rFonts w:ascii="Calibri" w:hAnsi="Calibri" w:cs="Calibri"/>
@@ -1433,7 +1528,8 @@
             </w:pPr>
             <w:r>
               <w:rPr>
-                <w:rFonts w:cs="Calibri" w:ascii="Calibri" w:hAnsi="Calibri"/>
+                <w:rFonts w:cs="Arial" w:ascii="Arial" w:hAnsi="Arial"/>
+                <w:sz w:val="16"/>
               </w:rPr>
               <w:t>CAP</w:t>
             </w:r>
@@ -1453,7 +1549,7 @@
             <w:pPr>
               <w:pStyle w:val="TextBody"/>
               <w:snapToGrid w:val="false"/>
-              <w:spacing w:before="1" w:after="0"/>
+              <w:spacing w:before="0" w:after="0" w:line="230" w:lineRule="auto"/>
               <w:ind w:right="56" w:hanging="0"/>
               <w:rPr>
                 <w:rFonts w:ascii="Calibri" w:hAnsi="Calibri" w:cs="Calibri"/>
@@ -1461,7 +1557,8 @@
             </w:pPr>
             <w:r>
               <w:rPr>
-                <w:rFonts w:cs="Calibri" w:ascii="Calibri" w:hAnsi="Calibri"/>
+                <w:rFonts w:cs="Arial" w:ascii="Arial" w:hAnsi="Arial"/>
+                <w:sz w:val="16"/>
               </w:rPr>
               <w:t>{{ signer.residence_zip }}</w:t>
             </w:r>
@@ -1485,7 +1582,7 @@
           <w:p>
             <w:pPr>
               <w:pStyle w:val="TextBody"/>
-              <w:spacing w:before="1" w:after="0"/>
+              <w:spacing w:before="0" w:after="0" w:line="230" w:lineRule="auto"/>
               <w:ind w:right="56" w:hanging="0"/>
               <w:rPr>
                 <w:rFonts w:ascii="Calibri" w:hAnsi="Calibri" w:cs="Calibri"/>
@@ -1493,7 +1590,8 @@
             </w:pPr>
             <w:r>
               <w:rPr>
-                <w:rFonts w:cs="Calibri" w:ascii="Calibri" w:hAnsi="Calibri"/>
+                <w:rFonts w:cs="Arial" w:ascii="Arial" w:hAnsi="Arial"/>
+                <w:sz w:val="16"/>
               </w:rPr>
               <w:t>Indirizzo e num. civico</w:t>
             </w:r>
@@ -1514,7 +1612,7 @@
             <w:pPr>
               <w:pStyle w:val="TextBody"/>
               <w:snapToGrid w:val="false"/>
-              <w:spacing w:before="1" w:after="0"/>
+              <w:spacing w:before="0" w:after="0" w:line="230" w:lineRule="auto"/>
               <w:ind w:right="56" w:hanging="0"/>
               <w:rPr>
                 <w:rFonts w:ascii="Calibri" w:hAnsi="Calibri" w:cs="Calibri"/>
@@ -1522,7 +1620,8 @@
             </w:pPr>
             <w:r>
               <w:rPr>
-                <w:rFonts w:cs="Calibri" w:ascii="Calibri" w:hAnsi="Calibri"/>
+                <w:rFonts w:cs="Arial" w:ascii="Arial" w:hAnsi="Arial"/>
+                <w:sz w:val="16"/>
               </w:rPr>
               <w:t>{{ signer.residence_street }} {{ signer.residence_street_number }}</w:t>
             </w:r>
@@ -1543,7 +1642,7 @@
           <w:p>
             <w:pPr>
               <w:pStyle w:val="TextBody"/>
-              <w:spacing w:before="1" w:after="0"/>
+              <w:spacing w:before="0" w:after="0" w:line="230" w:lineRule="auto"/>
               <w:ind w:right="56" w:hanging="0"/>
               <w:rPr>
                 <w:rFonts w:ascii="Calibri" w:hAnsi="Calibri" w:cs="Calibri"/>
@@ -1551,7 +1650,8 @@
             </w:pPr>
             <w:r>
               <w:rPr>
-                <w:rFonts w:cs="Calibri" w:ascii="Calibri" w:hAnsi="Calibri"/>
+                <w:rFonts w:cs="Arial" w:ascii="Arial" w:hAnsi="Arial"/>
+                <w:sz w:val="16"/>
               </w:rPr>
               <w:t>Prov.</w:t>
             </w:r>
@@ -1571,7 +1671,7 @@
             <w:pPr>
               <w:pStyle w:val="TextBody"/>
               <w:snapToGrid w:val="false"/>
-              <w:spacing w:before="1" w:after="0"/>
+              <w:spacing w:before="0" w:after="0" w:line="230" w:lineRule="auto"/>
               <w:ind w:right="56" w:hanging="0"/>
               <w:rPr>
                 <w:rFonts w:ascii="Calibri" w:hAnsi="Calibri" w:cs="Calibri"/>
@@ -1579,7 +1679,8 @@
             </w:pPr>
             <w:r>
               <w:rPr>
-                <w:rFonts w:cs="Calibri" w:ascii="Calibri" w:hAnsi="Calibri"/>
+                <w:rFonts w:cs="Arial" w:ascii="Arial" w:hAnsi="Arial"/>
+                <w:sz w:val="16"/>
               </w:rPr>
               <w:t>{{ signer.residence_province }}</w:t>
             </w:r>
@@ -1603,7 +1704,7 @@
           <w:p>
             <w:pPr>
               <w:pStyle w:val="TextBody"/>
-              <w:spacing w:before="1" w:after="0"/>
+              <w:spacing w:before="0" w:after="0" w:line="230" w:lineRule="auto"/>
               <w:ind w:right="56" w:hanging="0"/>
               <w:rPr>
                 <w:rFonts w:ascii="Calibri" w:hAnsi="Calibri" w:cs="Calibri"/>
@@ -1611,7 +1712,8 @@
             </w:pPr>
             <w:r>
               <w:rPr>
-                <w:rFonts w:cs="Calibri" w:ascii="Calibri" w:hAnsi="Calibri"/>
+                <w:rFonts w:cs="Arial" w:ascii="Arial" w:hAnsi="Arial"/>
+                <w:sz w:val="16"/>
               </w:rPr>
               <w:t>Carta Identità n°</w:t>
             </w:r>
@@ -1632,7 +1734,7 @@
             <w:pPr>
               <w:pStyle w:val="TextBody"/>
               <w:snapToGrid w:val="false"/>
-              <w:spacing w:before="1" w:after="0"/>
+              <w:spacing w:before="0" w:after="0" w:line="230" w:lineRule="auto"/>
               <w:ind w:right="56" w:hanging="0"/>
               <w:rPr>
                 <w:rFonts w:ascii="Calibri" w:hAnsi="Calibri" w:cs="Calibri"/>
@@ -1640,7 +1742,8 @@
             </w:pPr>
             <w:r>
               <w:rPr>
-                <w:rFonts w:cs="Calibri" w:ascii="Calibri" w:hAnsi="Calibri"/>
+                <w:rFonts w:cs="Arial" w:ascii="Arial" w:hAnsi="Arial"/>
+                <w:sz w:val="16"/>
               </w:rPr>
               <w:t>{{ signer.id_document_number }}</w:t>
             </w:r>
@@ -1660,7 +1763,7 @@
           <w:p>
             <w:pPr>
               <w:pStyle w:val="TextBody"/>
-              <w:spacing w:before="1" w:after="0"/>
+              <w:spacing w:before="0" w:after="0" w:line="230" w:lineRule="auto"/>
               <w:ind w:right="56" w:hanging="0"/>
               <w:rPr>
                 <w:rFonts w:ascii="Calibri" w:hAnsi="Calibri" w:cs="Calibri"/>
@@ -1668,7 +1771,8 @@
             </w:pPr>
             <w:r>
               <w:rPr>
-                <w:rFonts w:cs="Calibri" w:ascii="Calibri" w:hAnsi="Calibri"/>
+                <w:rFonts w:cs="Arial" w:ascii="Arial" w:hAnsi="Arial"/>
+                <w:sz w:val="16"/>
               </w:rPr>
               <w:t>Cod. Fisc.</w:t>
             </w:r>
@@ -1689,7 +1793,7 @@
             <w:pPr>
               <w:pStyle w:val="TextBody"/>
               <w:snapToGrid w:val="false"/>
-              <w:spacing w:before="1" w:after="0"/>
+              <w:spacing w:before="0" w:after="0" w:line="230" w:lineRule="auto"/>
               <w:ind w:right="56" w:hanging="0"/>
               <w:rPr>
                 <w:rFonts w:ascii="Calibri" w:hAnsi="Calibri" w:cs="Calibri"/>
@@ -1697,7 +1801,8 @@
             </w:pPr>
             <w:r>
               <w:rPr>
-                <w:rFonts w:cs="Calibri" w:ascii="Calibri" w:hAnsi="Calibri"/>
+                <w:rFonts w:cs="Arial" w:ascii="Arial" w:hAnsi="Arial"/>
+                <w:sz w:val="16"/>
               </w:rPr>
               <w:t>{{ signer.tax_code }}</w:t>
             </w:r>
@@ -1708,20 +1813,23 @@
     <w:p>
       <w:pPr>
         <w:pStyle w:val="Normal"/>
-        <w:jc w:val="both"/>
-        <w:rPr>
-          <w:rFonts w:ascii="Calibri" w:hAnsi="Calibri" w:cs="Calibri"/>
-        </w:rPr>
-      </w:pPr>
-      <w:r>
-        <w:rPr>
-          <w:rFonts w:cs="Calibri" w:ascii="Calibri" w:hAnsi="Calibri"/>
-        </w:rPr>
-      </w:r>
-    </w:p>
-    <w:p>
-      <w:pPr>
-        <w:pStyle w:val="Normal"/>
+        <w:spacing w:before="0" w:after="0" w:line="230" w:lineRule="auto"/>
+        <w:jc w:val="both"/>
+        <w:rPr>
+          <w:rFonts w:ascii="Calibri" w:hAnsi="Calibri" w:cs="Calibri"/>
+        </w:rPr>
+      </w:pPr>
+      <w:r>
+        <w:rPr>
+          <w:rFonts w:cs="Arial" w:ascii="Arial" w:hAnsi="Arial"/>
+          <w:sz w:val="16"/>
+        </w:rPr>
+      </w:r>
+    </w:p>
+    <w:p>
+      <w:pPr>
+        <w:pStyle w:val="Normal"/>
+        <w:spacing w:before="0" w:after="0" w:line="230" w:lineRule="auto"/>
         <w:jc w:val="center"/>
         <w:rPr>
           <w:rFonts w:ascii="Calibri" w:hAnsi="Calibri" w:cs="Calibri"/>
@@ -1732,9 +1840,10 @@
       </w:pPr>
       <w:r>
         <w:rPr>
-          <w:rFonts w:cs="Calibri" w:ascii="Calibri" w:hAnsi="Calibri"/>
-          <w:b/>
-          <w:bCs/>
+          <w:rFonts w:cs="Arial" w:ascii="Arial" w:hAnsi="Arial"/>
+          <w:b/>
+          <w:bCs/>
+          <w:sz w:val="16"/>
         </w:rPr>
         <w:t>PREMESSO CHE</w:t>
       </w:r>
@@ -1742,6 +1851,7 @@
     <w:p>
       <w:pPr>
         <w:pStyle w:val="Normal"/>
+        <w:spacing w:before="0" w:after="0" w:line="230" w:lineRule="auto"/>
         <w:jc w:val="center"/>
         <w:rPr>
           <w:rFonts w:ascii="Calibri" w:hAnsi="Calibri" w:cs="Calibri"/>
@@ -1752,23 +1862,26 @@
       </w:pPr>
       <w:r>
         <w:rPr>
-          <w:rFonts w:cs="Calibri" w:ascii="Calibri" w:hAnsi="Calibri"/>
-          <w:b/>
-          <w:bCs/>
-        </w:rPr>
-      </w:r>
-    </w:p>
-    <w:p>
-      <w:pPr>
-        <w:pStyle w:val="Normal"/>
+          <w:rFonts w:cs="Arial" w:ascii="Arial" w:hAnsi="Arial"/>
+          <w:b/>
+          <w:bCs/>
+          <w:sz w:val="16"/>
+        </w:rPr>
+      </w:r>
+    </w:p>
+    <w:p>
+      <w:pPr>
+        <w:pStyle w:val="Normal"/>
+        <w:spacing w:before="0" w:after="0" w:line="230" w:lineRule="auto"/>
         <w:jc w:val="both"/>
         <w:rPr/>
       </w:pPr>
       <w:r>
         <w:rPr>
-          <w:rFonts w:cs="Calibri" w:ascii="Calibri" w:hAnsi="Calibri"/>
-          <w:b/>
-          <w:bCs/>
+          <w:rFonts w:cs="Arial" w:ascii="Arial" w:hAnsi="Arial"/>
+          <w:b/>
+          <w:bCs/>
+          <w:sz w:val="16"/>
         </w:rPr>
         <w:t xml:space="preserve">a) La Segreteria Organizzativa, soggetto con esperienza comprovata, attivo nel campo dell’organizzazione e/o realizzazione di eventi nel rispetto dell’art. 124 del D. Lgs. 24 aprile 2006, n. 219, intende acquisire sponsorizzazioni per assicurarsi finanziamenti per la realizzazione dell’evento {{ event.name }} che si svolgerà a {{ event.location }} il {{ event.start_date|format_date }}{% if event.end_date and event.end_date != event.start_date %} – {{ event.end_date|format_date }}{% endif %} e destinato alla formazione di operatori sanitari; </w:t>
       </w:r>
@@ -1776,39 +1889,44 @@
     <w:p>
       <w:pPr>
         <w:pStyle w:val="Normal"/>
-        <w:jc w:val="both"/>
-        <w:rPr>
-          <w:rFonts w:ascii="Calibri" w:hAnsi="Calibri" w:cs="Calibri"/>
-          <w:b/>
-          <w:b/>
-          <w:bCs/>
-        </w:rPr>
-      </w:pPr>
-      <w:r>
-        <w:rPr>
-          <w:rFonts w:cs="Calibri" w:ascii="Calibri" w:hAnsi="Calibri"/>
-          <w:b/>
-          <w:bCs/>
-        </w:rPr>
-      </w:r>
-    </w:p>
-    <w:p>
-      <w:pPr>
-        <w:pStyle w:val="Normal"/>
+        <w:spacing w:before="0" w:after="0" w:line="230" w:lineRule="auto"/>
+        <w:jc w:val="both"/>
+        <w:rPr>
+          <w:rFonts w:ascii="Calibri" w:hAnsi="Calibri" w:cs="Calibri"/>
+          <w:b/>
+          <w:b/>
+          <w:bCs/>
+        </w:rPr>
+      </w:pPr>
+      <w:r>
+        <w:rPr>
+          <w:rFonts w:cs="Arial" w:ascii="Arial" w:hAnsi="Arial"/>
+          <w:b/>
+          <w:bCs/>
+          <w:sz w:val="16"/>
+        </w:rPr>
+      </w:r>
+    </w:p>
+    <w:p>
+      <w:pPr>
+        <w:pStyle w:val="Normal"/>
+        <w:spacing w:before="0" w:after="0" w:line="230" w:lineRule="auto"/>
         <w:jc w:val="both"/>
         <w:rPr/>
       </w:pPr>
       <w:r>
         <w:rPr>
-          <w:rFonts w:cs="Calibri" w:ascii="Calibri" w:hAnsi="Calibri"/>
-          <w:b/>
-          <w:bCs/>
+          <w:rFonts w:cs="Arial" w:ascii="Arial" w:hAnsi="Arial"/>
+          <w:b/>
+          <w:bCs/>
+          <w:sz w:val="16"/>
         </w:rPr>
         <w:t xml:space="preserve">b) </w:t>
       </w:r>
       <w:r>
         <w:rPr>
-          <w:rFonts w:cs="Calibri" w:ascii="Calibri" w:hAnsi="Calibri"/>
+          <w:rFonts w:cs="Arial" w:ascii="Arial" w:hAnsi="Arial"/>
+          <w:sz w:val="16"/>
         </w:rPr>
         <w:t xml:space="preserve">la Segreteria Organizzativa è attiva nella realizzazione e gestione di tutte le attività di servizi non istituzionali e dichiara di essere soggetto giuridico in possesso delle competenze necessarie per la realizzazione dell’Evento; </w:t>
       </w:r>
@@ -1816,41 +1934,46 @@
     <w:p>
       <w:pPr>
         <w:pStyle w:val="Normal"/>
-        <w:jc w:val="both"/>
-        <w:rPr>
-          <w:rFonts w:ascii="Calibri" w:hAnsi="Calibri" w:cs="Calibri"/>
-          <w:b/>
-          <w:b/>
-          <w:bCs/>
-        </w:rPr>
-      </w:pPr>
-      <w:r>
-        <w:rPr>
-          <w:rFonts w:cs="Calibri" w:ascii="Calibri" w:hAnsi="Calibri"/>
-          <w:b/>
-          <w:bCs/>
-        </w:rPr>
-      </w:r>
-    </w:p>
-    <w:p>
-      <w:pPr>
-        <w:pStyle w:val="Normal"/>
-        <w:jc w:val="both"/>
-        <w:rPr>
-          <w:rFonts w:ascii="Calibri" w:hAnsi="Calibri" w:cs="Calibri"/>
-        </w:rPr>
-      </w:pPr>
-      <w:r>
-        <w:rPr>
-          <w:rFonts w:cs="Calibri" w:ascii="Calibri" w:hAnsi="Calibri"/>
-          <w:b/>
-          <w:bCs/>
+        <w:spacing w:before="0" w:after="0" w:line="230" w:lineRule="auto"/>
+        <w:jc w:val="both"/>
+        <w:rPr>
+          <w:rFonts w:ascii="Calibri" w:hAnsi="Calibri" w:cs="Calibri"/>
+          <w:b/>
+          <w:b/>
+          <w:bCs/>
+        </w:rPr>
+      </w:pPr>
+      <w:r>
+        <w:rPr>
+          <w:rFonts w:cs="Arial" w:ascii="Arial" w:hAnsi="Arial"/>
+          <w:b/>
+          <w:bCs/>
+          <w:sz w:val="16"/>
+        </w:rPr>
+      </w:r>
+    </w:p>
+    <w:p>
+      <w:pPr>
+        <w:pStyle w:val="Normal"/>
+        <w:spacing w:before="0" w:after="0" w:line="230" w:lineRule="auto"/>
+        <w:jc w:val="both"/>
+        <w:rPr>
+          <w:rFonts w:ascii="Calibri" w:hAnsi="Calibri" w:cs="Calibri"/>
+        </w:rPr>
+      </w:pPr>
+      <w:r>
+        <w:rPr>
+          <w:rFonts w:cs="Arial" w:ascii="Arial" w:hAnsi="Arial"/>
+          <w:b/>
+          <w:bCs/>
+          <w:sz w:val="16"/>
         </w:rPr>
         <w:t xml:space="preserve">c) </w:t>
       </w:r>
       <w:r>
         <w:rPr>
-          <w:rFonts w:cs="Calibri" w:ascii="Calibri" w:hAnsi="Calibri"/>
+          <w:rFonts w:cs="Arial" w:ascii="Arial" w:hAnsi="Arial"/>
+          <w:sz w:val="16"/>
         </w:rPr>
         <w:t>la Segreteria Organizzativa è disponibile ad organizzare una serie di attività nell’ambito dell’Evento.</w:t>
       </w:r>
@@ -1858,41 +1981,46 @@
     <w:p>
       <w:pPr>
         <w:pStyle w:val="Normal"/>
-        <w:jc w:val="both"/>
-        <w:rPr>
-          <w:rFonts w:ascii="Calibri" w:hAnsi="Calibri" w:cs="Calibri"/>
-          <w:b/>
-          <w:b/>
-          <w:bCs/>
-        </w:rPr>
-      </w:pPr>
-      <w:r>
-        <w:rPr>
-          <w:rFonts w:cs="Calibri" w:ascii="Calibri" w:hAnsi="Calibri"/>
-          <w:b/>
-          <w:bCs/>
-        </w:rPr>
-      </w:r>
-    </w:p>
-    <w:p>
-      <w:pPr>
-        <w:pStyle w:val="Normal"/>
-        <w:jc w:val="both"/>
-        <w:rPr>
-          <w:rFonts w:ascii="Calibri" w:hAnsi="Calibri" w:cs="Calibri"/>
-        </w:rPr>
-      </w:pPr>
-      <w:r>
-        <w:rPr>
-          <w:rFonts w:cs="Calibri" w:ascii="Calibri" w:hAnsi="Calibri"/>
-          <w:b/>
-          <w:bCs/>
+        <w:spacing w:before="0" w:after="0" w:line="230" w:lineRule="auto"/>
+        <w:jc w:val="both"/>
+        <w:rPr>
+          <w:rFonts w:ascii="Calibri" w:hAnsi="Calibri" w:cs="Calibri"/>
+          <w:b/>
+          <w:b/>
+          <w:bCs/>
+        </w:rPr>
+      </w:pPr>
+      <w:r>
+        <w:rPr>
+          <w:rFonts w:cs="Arial" w:ascii="Arial" w:hAnsi="Arial"/>
+          <w:b/>
+          <w:bCs/>
+          <w:sz w:val="16"/>
+        </w:rPr>
+      </w:r>
+    </w:p>
+    <w:p>
+      <w:pPr>
+        <w:pStyle w:val="Normal"/>
+        <w:spacing w:before="0" w:after="0" w:line="230" w:lineRule="auto"/>
+        <w:jc w:val="both"/>
+        <w:rPr>
+          <w:rFonts w:ascii="Calibri" w:hAnsi="Calibri" w:cs="Calibri"/>
+        </w:rPr>
+      </w:pPr>
+      <w:r>
+        <w:rPr>
+          <w:rFonts w:cs="Arial" w:ascii="Arial" w:hAnsi="Arial"/>
+          <w:b/>
+          <w:bCs/>
+          <w:sz w:val="16"/>
         </w:rPr>
         <w:t xml:space="preserve">d) </w:t>
       </w:r>
       <w:r>
         <w:rPr>
-          <w:rFonts w:cs="Calibri" w:ascii="Calibri" w:hAnsi="Calibri"/>
+          <w:rFonts w:cs="Arial" w:ascii="Arial" w:hAnsi="Arial"/>
+          <w:sz w:val="16"/>
         </w:rPr>
         <w:t>Lo Sponsor opera nel settore della distribuzione e commercializzazione di prodotti per la medicina e la chirurgia estetica ed è interessato a supportare istituzionalmente e sponsorizzare eventi finalizzati alla formazione e all’aggiornamento professionale, anche in cambio di spazi pubblicitari o attività promozionali per il proprio nome e/o i propri prodotti presso gli operatori sanitari.</w:t>
       </w:r>
@@ -1900,41 +2028,46 @@
     <w:p>
       <w:pPr>
         <w:pStyle w:val="Normal"/>
-        <w:jc w:val="both"/>
-        <w:rPr>
-          <w:rFonts w:ascii="Calibri" w:hAnsi="Calibri" w:cs="Calibri"/>
-          <w:b/>
-          <w:b/>
-          <w:bCs/>
-        </w:rPr>
-      </w:pPr>
-      <w:r>
-        <w:rPr>
-          <w:rFonts w:cs="Calibri" w:ascii="Calibri" w:hAnsi="Calibri"/>
-          <w:b/>
-          <w:bCs/>
-        </w:rPr>
-      </w:r>
-    </w:p>
-    <w:p>
-      <w:pPr>
-        <w:pStyle w:val="Normal"/>
-        <w:jc w:val="both"/>
-        <w:rPr>
-          <w:rFonts w:ascii="Calibri" w:hAnsi="Calibri" w:cs="Calibri"/>
-        </w:rPr>
-      </w:pPr>
-      <w:r>
-        <w:rPr>
-          <w:rFonts w:cs="Calibri" w:ascii="Calibri" w:hAnsi="Calibri"/>
-          <w:b/>
-          <w:bCs/>
+        <w:spacing w:before="0" w:after="0" w:line="230" w:lineRule="auto"/>
+        <w:jc w:val="both"/>
+        <w:rPr>
+          <w:rFonts w:ascii="Calibri" w:hAnsi="Calibri" w:cs="Calibri"/>
+          <w:b/>
+          <w:b/>
+          <w:bCs/>
+        </w:rPr>
+      </w:pPr>
+      <w:r>
+        <w:rPr>
+          <w:rFonts w:cs="Arial" w:ascii="Arial" w:hAnsi="Arial"/>
+          <w:b/>
+          <w:bCs/>
+          <w:sz w:val="16"/>
+        </w:rPr>
+      </w:r>
+    </w:p>
+    <w:p>
+      <w:pPr>
+        <w:pStyle w:val="Normal"/>
+        <w:spacing w:before="0" w:after="0" w:line="230" w:lineRule="auto"/>
+        <w:jc w:val="both"/>
+        <w:rPr>
+          <w:rFonts w:ascii="Calibri" w:hAnsi="Calibri" w:cs="Calibri"/>
+        </w:rPr>
+      </w:pPr>
+      <w:r>
+        <w:rPr>
+          <w:rFonts w:cs="Arial" w:ascii="Arial" w:hAnsi="Arial"/>
+          <w:b/>
+          <w:bCs/>
+          <w:sz w:val="16"/>
         </w:rPr>
         <w:t xml:space="preserve">e) </w:t>
       </w:r>
       <w:r>
         <w:rPr>
-          <w:rFonts w:cs="Calibri" w:ascii="Calibri" w:hAnsi="Calibri"/>
+          <w:rFonts w:cs="Arial" w:ascii="Arial" w:hAnsi="Arial"/>
+          <w:sz w:val="16"/>
         </w:rPr>
         <w:t xml:space="preserve">la Segreteria organizzativa ha sottoposto allo Sponsor il programma dell’Evento, proponendogli di contribuirvi come sponsor; </w:t>
       </w:r>
@@ -1942,53 +2075,60 @@
     <w:p>
       <w:pPr>
         <w:pStyle w:val="Normal"/>
-        <w:jc w:val="both"/>
-        <w:rPr>
-          <w:rFonts w:ascii="Calibri" w:hAnsi="Calibri" w:cs="Calibri"/>
-          <w:b/>
-          <w:b/>
-          <w:bCs/>
-        </w:rPr>
-      </w:pPr>
-      <w:r>
-        <w:rPr>
-          <w:rFonts w:cs="Calibri" w:ascii="Calibri" w:hAnsi="Calibri"/>
-          <w:b/>
-          <w:bCs/>
-        </w:rPr>
-      </w:r>
-    </w:p>
-    <w:p>
-      <w:pPr>
-        <w:pStyle w:val="Normal"/>
+        <w:spacing w:before="0" w:after="0" w:line="230" w:lineRule="auto"/>
+        <w:jc w:val="both"/>
+        <w:rPr>
+          <w:rFonts w:ascii="Calibri" w:hAnsi="Calibri" w:cs="Calibri"/>
+          <w:b/>
+          <w:b/>
+          <w:bCs/>
+        </w:rPr>
+      </w:pPr>
+      <w:r>
+        <w:rPr>
+          <w:rFonts w:cs="Arial" w:ascii="Arial" w:hAnsi="Arial"/>
+          <w:b/>
+          <w:bCs/>
+          <w:sz w:val="16"/>
+        </w:rPr>
+      </w:r>
+    </w:p>
+    <w:p>
+      <w:pPr>
+        <w:pStyle w:val="Normal"/>
+        <w:spacing w:before="0" w:after="0" w:line="230" w:lineRule="auto"/>
         <w:jc w:val="both"/>
         <w:rPr/>
       </w:pPr>
       <w:r>
         <w:rPr>
-          <w:rFonts w:cs="Calibri" w:ascii="Calibri" w:hAnsi="Calibri"/>
-          <w:b/>
-          <w:bCs/>
+          <w:rFonts w:cs="Arial" w:ascii="Arial" w:hAnsi="Arial"/>
+          <w:b/>
+          <w:bCs/>
+          <w:sz w:val="16"/>
         </w:rPr>
         <w:t xml:space="preserve">f) </w:t>
       </w:r>
       <w:r>
         <w:rPr>
-          <w:rFonts w:cs="Calibri" w:ascii="Calibri" w:hAnsi="Calibri"/>
+          <w:rFonts w:cs="Arial" w:ascii="Arial" w:hAnsi="Arial"/>
+          <w:sz w:val="16"/>
         </w:rPr>
         <w:t>lo Sponsor e la Segreteria Organizzativa, (qui di seguito anche le “</w:t>
       </w:r>
       <w:r>
         <w:rPr>
-          <w:rFonts w:cs="Calibri" w:ascii="Calibri" w:hAnsi="Calibri"/>
-          <w:b/>
-          <w:bCs/>
+          <w:rFonts w:cs="Arial" w:ascii="Arial" w:hAnsi="Arial"/>
+          <w:b/>
+          <w:bCs/>
+          <w:sz w:val="16"/>
         </w:rPr>
         <w:t>Parti</w:t>
       </w:r>
       <w:r>
         <w:rPr>
-          <w:rFonts w:cs="Calibri" w:ascii="Calibri" w:hAnsi="Calibri"/>
+          <w:rFonts w:cs="Arial" w:ascii="Arial" w:hAnsi="Arial"/>
+          <w:sz w:val="16"/>
         </w:rPr>
         <w:t xml:space="preserve">”, se collettivamente indicate) riconoscendo espressamente che l’attività formativa realizzata attraverso l’Evento è finalizzata esclusivamente allo sviluppo delle conoscenze scientifiche e delle competenze tecnico professionali in ambito sanitario, ed è, pertanto, obiettiva ed indipendente da interessi commerciali direttamente o indirettamente ricollegabili allo Sponsor, intendono definire termini e condizioni per la sponsorizzazione dell’Evento come segue. </w:t>
       </w:r>
@@ -1996,20 +2136,23 @@
     <w:p>
       <w:pPr>
         <w:pStyle w:val="Normal"/>
-        <w:jc w:val="both"/>
-        <w:rPr>
-          <w:rFonts w:ascii="Calibri" w:hAnsi="Calibri" w:cs="Calibri"/>
-        </w:rPr>
-      </w:pPr>
-      <w:r>
-        <w:rPr>
-          <w:rFonts w:cs="Calibri" w:ascii="Calibri" w:hAnsi="Calibri"/>
-        </w:rPr>
-      </w:r>
-    </w:p>
-    <w:p>
-      <w:pPr>
-        <w:pStyle w:val="Normal"/>
+        <w:spacing w:before="0" w:after="0" w:line="230" w:lineRule="auto"/>
+        <w:jc w:val="both"/>
+        <w:rPr>
+          <w:rFonts w:ascii="Calibri" w:hAnsi="Calibri" w:cs="Calibri"/>
+        </w:rPr>
+      </w:pPr>
+      <w:r>
+        <w:rPr>
+          <w:rFonts w:cs="Arial" w:ascii="Arial" w:hAnsi="Arial"/>
+          <w:sz w:val="16"/>
+        </w:rPr>
+      </w:r>
+    </w:p>
+    <w:p>
+      <w:pPr>
+        <w:pStyle w:val="Normal"/>
+        <w:spacing w:before="0" w:after="0" w:line="230" w:lineRule="auto"/>
         <w:jc w:val="center"/>
         <w:rPr>
           <w:rFonts w:ascii="Calibri" w:hAnsi="Calibri" w:cs="Calibri"/>
@@ -2017,9 +2160,10 @@
       </w:pPr>
       <w:r>
         <w:rPr>
-          <w:rFonts w:cs="Calibri" w:ascii="Calibri" w:hAnsi="Calibri"/>
-          <w:b/>
-          <w:bCs/>
+          <w:rFonts w:cs="Arial" w:ascii="Arial" w:hAnsi="Arial"/>
+          <w:b/>
+          <w:bCs/>
+          <w:sz w:val="16"/>
         </w:rPr>
         <w:t>TUTTO CIÒ PREMESSO</w:t>
       </w:r>
@@ -2027,6 +2171,7 @@
     <w:p>
       <w:pPr>
         <w:pStyle w:val="Normal"/>
+        <w:spacing w:before="0" w:after="0" w:line="230" w:lineRule="auto"/>
         <w:jc w:val="center"/>
         <w:rPr>
           <w:rFonts w:ascii="Calibri" w:hAnsi="Calibri" w:cs="Calibri"/>
@@ -2034,7 +2179,8 @@
       </w:pPr>
       <w:r>
         <w:rPr>
-          <w:rFonts w:cs="Calibri" w:ascii="Calibri" w:hAnsi="Calibri"/>
+          <w:rFonts w:cs="Arial" w:ascii="Arial" w:hAnsi="Arial"/>
+          <w:sz w:val="16"/>
         </w:rPr>
         <w:t>le Parti stipulano e convengono quanto segue.</w:t>
       </w:r>
@@ -2042,19 +2188,21 @@
     <w:p>
       <w:pPr>
         <w:pStyle w:val="Normal"/>
-        <w:jc w:val="both"/>
-        <w:rPr>
-          <w:rFonts w:ascii="Calibri" w:hAnsi="Calibri" w:cs="Calibri"/>
-          <w:b/>
-          <w:b/>
-          <w:bCs/>
-        </w:rPr>
-      </w:pPr>
-      <w:r>
-        <w:rPr>
-          <w:rFonts w:cs="Calibri" w:ascii="Calibri" w:hAnsi="Calibri"/>
-          <w:b/>
-          <w:bCs/>
+        <w:spacing w:before="0" w:after="0" w:line="230" w:lineRule="auto"/>
+        <w:jc w:val="both"/>
+        <w:rPr>
+          <w:rFonts w:ascii="Calibri" w:hAnsi="Calibri" w:cs="Calibri"/>
+          <w:b/>
+          <w:b/>
+          <w:bCs/>
+        </w:rPr>
+      </w:pPr>
+      <w:r>
+        <w:rPr>
+          <w:rFonts w:cs="Arial" w:ascii="Arial" w:hAnsi="Arial"/>
+          <w:b/>
+          <w:bCs/>
+          <w:sz w:val="16"/>
         </w:rPr>
         <w:t>Oggetto del Contratto e generalità</w:t>
       </w:r>
@@ -2062,14 +2210,16 @@
     <w:p>
       <w:pPr>
         <w:pStyle w:val="Normal"/>
-        <w:jc w:val="both"/>
-        <w:rPr>
-          <w:rFonts w:ascii="Calibri" w:hAnsi="Calibri" w:cs="Calibri"/>
-        </w:rPr>
-      </w:pPr>
-      <w:r>
-        <w:rPr>
-          <w:rFonts w:cs="Calibri" w:ascii="Calibri" w:hAnsi="Calibri"/>
+        <w:spacing w:before="0" w:after="0" w:line="230" w:lineRule="auto"/>
+        <w:jc w:val="both"/>
+        <w:rPr>
+          <w:rFonts w:ascii="Calibri" w:hAnsi="Calibri" w:cs="Calibri"/>
+        </w:rPr>
+      </w:pPr>
+      <w:r>
+        <w:rPr>
+          <w:rFonts w:cs="Arial" w:ascii="Arial" w:hAnsi="Arial"/>
+          <w:sz w:val="16"/>
         </w:rPr>
         <w:t>Il presente contratto regola il rapporto di sponsorizzazione tra Segreteria Organizzativa e Sponsor con specifico riferimento all’Evento citato al paragrafo a) delle premesse</w:t>
       </w:r>
@@ -2077,6 +2227,7 @@
     <w:p>
       <w:pPr>
         <w:pStyle w:val="Normal"/>
+        <w:spacing w:before="0" w:after="0" w:line="230" w:lineRule="auto"/>
         <w:jc w:val="center"/>
         <w:rPr>
           <w:rFonts w:ascii="Calibri" w:hAnsi="Calibri" w:cs="Calibri"/>
@@ -2084,23 +2235,26 @@
       </w:pPr>
       <w:r>
         <w:rPr>
-          <w:rFonts w:cs="Calibri" w:ascii="Calibri" w:hAnsi="Calibri"/>
-        </w:rPr>
-      </w:r>
-    </w:p>
-    <w:p>
-      <w:pPr>
-        <w:pStyle w:val="Normal"/>
-        <w:jc w:val="both"/>
-        <w:rPr>
-          <w:rFonts w:ascii="Calibri" w:hAnsi="Calibri" w:cs="Calibri"/>
-        </w:rPr>
-      </w:pPr>
-      <w:r>
-        <w:rPr>
-          <w:rFonts w:cs="Calibri" w:ascii="Calibri" w:hAnsi="Calibri"/>
-          <w:b/>
-          <w:bCs/>
+          <w:rFonts w:cs="Arial" w:ascii="Arial" w:hAnsi="Arial"/>
+          <w:sz w:val="16"/>
+        </w:rPr>
+      </w:r>
+    </w:p>
+    <w:p>
+      <w:pPr>
+        <w:pStyle w:val="Normal"/>
+        <w:spacing w:before="0" w:after="0" w:line="230" w:lineRule="auto"/>
+        <w:jc w:val="both"/>
+        <w:rPr>
+          <w:rFonts w:ascii="Calibri" w:hAnsi="Calibri" w:cs="Calibri"/>
+        </w:rPr>
+      </w:pPr>
+      <w:r>
+        <w:rPr>
+          <w:rFonts w:cs="Arial" w:ascii="Arial" w:hAnsi="Arial"/>
+          <w:b/>
+          <w:bCs/>
+          <w:sz w:val="16"/>
         </w:rPr>
         <w:t xml:space="preserve">1. Obbligazioni della Segreteria Organizzativa </w:t>
       </w:r>
@@ -2108,21 +2262,24 @@
     <w:p>
       <w:pPr>
         <w:pStyle w:val="Normal"/>
-        <w:jc w:val="both"/>
-        <w:rPr>
-          <w:rFonts w:ascii="Calibri" w:hAnsi="Calibri" w:cs="Calibri"/>
-        </w:rPr>
-      </w:pPr>
-      <w:r>
-        <w:rPr>
-          <w:rFonts w:cs="Calibri" w:ascii="Calibri" w:hAnsi="Calibri"/>
-          <w:b/>
+        <w:spacing w:before="0" w:after="0" w:line="230" w:lineRule="auto"/>
+        <w:jc w:val="both"/>
+        <w:rPr>
+          <w:rFonts w:ascii="Calibri" w:hAnsi="Calibri" w:cs="Calibri"/>
+        </w:rPr>
+      </w:pPr>
+      <w:r>
+        <w:rPr>
+          <w:rFonts w:cs="Arial" w:ascii="Arial" w:hAnsi="Arial"/>
+          <w:b/>
+          <w:sz w:val="16"/>
         </w:rPr>
         <w:t>1.1</w:t>
       </w:r>
       <w:r>
         <w:rPr>
-          <w:rFonts w:cs="Calibri" w:ascii="Calibri" w:hAnsi="Calibri"/>
+          <w:rFonts w:cs="Arial" w:ascii="Arial" w:hAnsi="Arial"/>
+          <w:sz w:val="16"/>
         </w:rPr>
         <w:t xml:space="preserve"> Il reperimento di tutte le risorse e dei mezzi necessari a garantire il buon esito dello stesso è rimesso alla Segreteria Organizzativa. Resta inteso che i fondi necessari allo svolgimento della manifestazione potranno essere recuperati dalla Segreteria Organizzativa anche attraverso il ricorso ad altri Sponsor.</w:t>
       </w:r>
@@ -2130,20 +2287,23 @@
     <w:p>
       <w:pPr>
         <w:pStyle w:val="Normal"/>
+        <w:spacing w:before="0" w:after="0" w:line="230" w:lineRule="auto"/>
         <w:jc w:val="both"/>
         <w:rPr/>
       </w:pPr>
       <w:r>
         <w:rPr>
-          <w:rFonts w:cs="Calibri" w:ascii="Calibri" w:hAnsi="Calibri"/>
-          <w:b/>
-          <w:bCs/>
+          <w:rFonts w:cs="Arial" w:ascii="Arial" w:hAnsi="Arial"/>
+          <w:b/>
+          <w:bCs/>
+          <w:sz w:val="16"/>
         </w:rPr>
         <w:t xml:space="preserve">1.2 </w:t>
       </w:r>
       <w:r>
         <w:rPr>
-          <w:rFonts w:cs="Calibri" w:ascii="Calibri" w:hAnsi="Calibri"/>
+          <w:rFonts w:cs="Arial" w:ascii="Arial" w:hAnsi="Arial"/>
+          <w:sz w:val="16"/>
         </w:rPr>
         <w:t xml:space="preserve">La Segreteria Organizzativa dichiara che l’Evento è stato organizzato e sarà condotto dal Responsabile Scientifico in piena autonomia e senza alcuna influenza o interferenza. Interesse delle Parti è, infatti, quello che venga fornita ai discenti attività formativa condotta con professionalità e rigore scientifico e con la massima indipendenza, dal momento che le finalità dell’Evento sono e dovranno restare unicamente quelle di educazione e formazione. </w:t>
       </w:r>
@@ -2151,12 +2311,14 @@
     <w:p>
       <w:pPr>
         <w:pStyle w:val="Normal"/>
+        <w:spacing w:before="0" w:after="0" w:line="230" w:lineRule="auto"/>
         <w:jc w:val="both"/>
         <w:rPr/>
       </w:pPr>
       <w:r>
         <w:rPr>
-          <w:rFonts w:cs="Calibri" w:ascii="Calibri" w:hAnsi="Calibri"/>
+          <w:rFonts w:cs="Arial" w:ascii="Arial" w:hAnsi="Arial"/>
+          <w:sz w:val="16"/>
         </w:rPr>
         <w:t>La Segreteria Organizzativa indica come responsabile scientifico dell’Evento il {{ event.scientific_director|default('________________', true) }}  di seguito “Responsabile Scientifico”), mentre, ai fini del presente Contratto, il referente dello Sponsor sarà {{ signer.full_name }}  (di seguito “Referente”)</w:t>
       </w:r>
@@ -2164,54 +2326,61 @@
     <w:p>
       <w:pPr>
         <w:pStyle w:val="Normal"/>
-        <w:jc w:val="both"/>
-        <w:rPr>
-          <w:rFonts w:ascii="Calibri" w:hAnsi="Calibri" w:cs="Calibri"/>
-          <w:b/>
-          <w:b/>
-          <w:bCs/>
-        </w:rPr>
-      </w:pPr>
-      <w:r>
-        <w:rPr>
-          <w:rFonts w:cs="Calibri" w:ascii="Calibri" w:hAnsi="Calibri"/>
-          <w:b/>
-          <w:bCs/>
-        </w:rPr>
-      </w:r>
-    </w:p>
-    <w:p>
-      <w:pPr>
-        <w:pStyle w:val="Normal"/>
+        <w:spacing w:before="0" w:after="0" w:line="230" w:lineRule="auto"/>
+        <w:jc w:val="both"/>
+        <w:rPr>
+          <w:rFonts w:ascii="Calibri" w:hAnsi="Calibri" w:cs="Calibri"/>
+          <w:b/>
+          <w:b/>
+          <w:bCs/>
+        </w:rPr>
+      </w:pPr>
+      <w:r>
+        <w:rPr>
+          <w:rFonts w:cs="Arial" w:ascii="Arial" w:hAnsi="Arial"/>
+          <w:b/>
+          <w:bCs/>
+          <w:sz w:val="16"/>
+        </w:rPr>
+      </w:r>
+    </w:p>
+    <w:p>
+      <w:pPr>
+        <w:pStyle w:val="Normal"/>
+        <w:spacing w:before="0" w:after="0" w:line="230" w:lineRule="auto"/>
         <w:jc w:val="both"/>
         <w:rPr/>
       </w:pPr>
       <w:r>
         <w:rPr>
-          <w:rFonts w:cs="Calibri" w:ascii="Calibri" w:hAnsi="Calibri"/>
-          <w:b/>
-          <w:bCs/>
+          <w:rFonts w:cs="Arial" w:ascii="Arial" w:hAnsi="Arial"/>
+          <w:b/>
+          <w:bCs/>
+          <w:sz w:val="16"/>
         </w:rPr>
         <w:t xml:space="preserve">1.3 </w:t>
       </w:r>
       <w:r>
         <w:rPr>
-          <w:rFonts w:cs="Calibri" w:ascii="Calibri" w:hAnsi="Calibri"/>
-          <w:bCs/>
+          <w:rFonts w:cs="Arial" w:ascii="Arial" w:hAnsi="Arial"/>
+          <w:bCs/>
+          <w:sz w:val="16"/>
         </w:rPr>
         <w:t>La</w:t>
       </w:r>
       <w:r>
         <w:rPr>
-          <w:rFonts w:cs="Calibri" w:ascii="Calibri" w:hAnsi="Calibri"/>
-          <w:b/>
-          <w:bCs/>
+          <w:rFonts w:cs="Arial" w:ascii="Arial" w:hAnsi="Arial"/>
+          <w:b/>
+          <w:bCs/>
+          <w:sz w:val="16"/>
         </w:rPr>
         <w:t xml:space="preserve"> </w:t>
       </w:r>
       <w:r>
         <w:rPr>
-          <w:rFonts w:cs="Calibri" w:ascii="Calibri" w:hAnsi="Calibri"/>
+          <w:rFonts w:cs="Arial" w:ascii="Arial" w:hAnsi="Arial"/>
+          <w:sz w:val="16"/>
         </w:rPr>
         <w:t xml:space="preserve">Segreteria Organizzativa inoltre, si impegna a veicolare in termini pubblicitari, il nome e il logo dello Sponsor, come meglio specificato nei successivi articoli. </w:t>
       </w:r>
@@ -2219,53 +2388,60 @@
     <w:p>
       <w:pPr>
         <w:pStyle w:val="Normal"/>
-        <w:jc w:val="both"/>
-        <w:rPr>
-          <w:rFonts w:ascii="Calibri" w:hAnsi="Calibri" w:cs="Calibri"/>
-          <w:b/>
-          <w:b/>
-          <w:bCs/>
-        </w:rPr>
-      </w:pPr>
-      <w:r>
-        <w:rPr>
-          <w:rFonts w:cs="Calibri" w:ascii="Calibri" w:hAnsi="Calibri"/>
-          <w:b/>
-          <w:bCs/>
-        </w:rPr>
-      </w:r>
-    </w:p>
-    <w:p>
-      <w:pPr>
-        <w:pStyle w:val="Normal"/>
+        <w:spacing w:before="0" w:after="0" w:line="230" w:lineRule="auto"/>
+        <w:jc w:val="both"/>
+        <w:rPr>
+          <w:rFonts w:ascii="Calibri" w:hAnsi="Calibri" w:cs="Calibri"/>
+          <w:b/>
+          <w:b/>
+          <w:bCs/>
+        </w:rPr>
+      </w:pPr>
+      <w:r>
+        <w:rPr>
+          <w:rFonts w:cs="Arial" w:ascii="Arial" w:hAnsi="Arial"/>
+          <w:b/>
+          <w:bCs/>
+          <w:sz w:val="16"/>
+        </w:rPr>
+      </w:r>
+    </w:p>
+    <w:p>
+      <w:pPr>
+        <w:pStyle w:val="Normal"/>
+        <w:spacing w:before="0" w:after="0" w:line="230" w:lineRule="auto"/>
         <w:jc w:val="both"/>
         <w:rPr/>
       </w:pPr>
       <w:r>
         <w:rPr>
-          <w:rFonts w:cs="Calibri" w:ascii="Calibri" w:hAnsi="Calibri"/>
-          <w:b/>
-          <w:bCs/>
+          <w:rFonts w:cs="Arial" w:ascii="Arial" w:hAnsi="Arial"/>
+          <w:b/>
+          <w:bCs/>
+          <w:sz w:val="16"/>
         </w:rPr>
         <w:t xml:space="preserve">1.4 </w:t>
       </w:r>
       <w:r>
         <w:rPr>
-          <w:rFonts w:cs="Calibri" w:ascii="Calibri" w:hAnsi="Calibri"/>
+          <w:rFonts w:cs="Arial" w:ascii="Arial" w:hAnsi="Arial"/>
+          <w:sz w:val="16"/>
         </w:rPr>
         <w:t>Lo Sponsor, dal canto suo, corrisponderà, a titolo di sponsorizzazione, un contributo finanziario, nei limiti di quanto indicato nell’</w:t>
       </w:r>
       <w:r>
         <w:rPr>
-          <w:rFonts w:cs="Calibri" w:ascii="Calibri" w:hAnsi="Calibri"/>
-          <w:b/>
-          <w:bCs/>
+          <w:rFonts w:cs="Arial" w:ascii="Arial" w:hAnsi="Arial"/>
+          <w:b/>
+          <w:bCs/>
+          <w:sz w:val="16"/>
         </w:rPr>
         <w:t xml:space="preserve">Allegato 1) </w:t>
       </w:r>
       <w:r>
         <w:rPr>
-          <w:rFonts w:cs="Calibri" w:ascii="Calibri" w:hAnsi="Calibri"/>
+          <w:rFonts w:cs="Arial" w:ascii="Arial" w:hAnsi="Arial"/>
+          <w:sz w:val="16"/>
         </w:rPr>
         <w:t xml:space="preserve">al presente Contratto di cui è parte integrante. </w:t>
       </w:r>
@@ -2273,14 +2449,16 @@
     <w:p>
       <w:pPr>
         <w:pStyle w:val="Normal"/>
-        <w:jc w:val="both"/>
-        <w:rPr>
-          <w:rFonts w:ascii="Calibri" w:hAnsi="Calibri" w:cs="Calibri"/>
-        </w:rPr>
-      </w:pPr>
-      <w:r>
-        <w:rPr>
-          <w:rFonts w:cs="Calibri" w:ascii="Calibri" w:hAnsi="Calibri"/>
+        <w:spacing w:before="0" w:after="0" w:line="230" w:lineRule="auto"/>
+        <w:jc w:val="both"/>
+        <w:rPr>
+          <w:rFonts w:ascii="Calibri" w:hAnsi="Calibri" w:cs="Calibri"/>
+        </w:rPr>
+      </w:pPr>
+      <w:r>
+        <w:rPr>
+          <w:rFonts w:cs="Arial" w:ascii="Arial" w:hAnsi="Arial"/>
+          <w:sz w:val="16"/>
         </w:rPr>
         <w:t xml:space="preserve">Tale contributo dovrà essere destinato ed utilizzato dalla Segreteria Organizzativa esclusivamente per la realizzazione dell’Evento, in collaborazione con il Responsabile Scientifico dell’Evento stesso. </w:t>
       </w:r>
@@ -2288,14 +2466,16 @@
     <w:p>
       <w:pPr>
         <w:pStyle w:val="Normal"/>
-        <w:jc w:val="both"/>
-        <w:rPr>
-          <w:rFonts w:ascii="Calibri" w:hAnsi="Calibri" w:cs="Calibri"/>
-        </w:rPr>
-      </w:pPr>
-      <w:r>
-        <w:rPr>
-          <w:rFonts w:cs="Calibri" w:ascii="Calibri" w:hAnsi="Calibri"/>
+        <w:spacing w:before="0" w:after="0" w:line="230" w:lineRule="auto"/>
+        <w:jc w:val="both"/>
+        <w:rPr>
+          <w:rFonts w:ascii="Calibri" w:hAnsi="Calibri" w:cs="Calibri"/>
+        </w:rPr>
+      </w:pPr>
+      <w:r>
+        <w:rPr>
+          <w:rFonts w:cs="Arial" w:ascii="Arial" w:hAnsi="Arial"/>
+          <w:sz w:val="16"/>
         </w:rPr>
       </w:r>
     </w:p>
@@ -2310,6 +2490,7 @@
           <w:tab w:val="clear" w:pos="709"/>
           <w:tab w:val="left" w:pos="426" w:leader="none"/>
         </w:tabs>
+        <w:spacing w:before="0" w:after="0" w:line="230" w:lineRule="auto"/>
         <w:ind w:left="0" w:hanging="0"/>
         <w:jc w:val="both"/>
         <w:rPr>
@@ -2318,7 +2499,8 @@
       </w:pPr>
       <w:r>
         <w:rPr>
-          <w:rFonts w:cs="Calibri" w:ascii="Calibri" w:hAnsi="Calibri"/>
+          <w:rFonts w:cs="Arial" w:ascii="Arial" w:hAnsi="Arial"/>
+          <w:sz w:val="16"/>
         </w:rPr>
         <w:t>La Segreteria Organizzativa, potrà avvalersi, nell’esecuzione delle attività di cui sopra, anche di altri soggetti, ai quali potrà delegare in tutto o in parte l’effettuazione delle attività stesse.</w:t>
       </w:r>
@@ -2330,14 +2512,16 @@
           <w:tab w:val="clear" w:pos="709"/>
           <w:tab w:val="left" w:pos="426" w:leader="none"/>
         </w:tabs>
-        <w:jc w:val="both"/>
-        <w:rPr>
-          <w:rFonts w:ascii="Calibri" w:hAnsi="Calibri" w:cs="Calibri"/>
-        </w:rPr>
-      </w:pPr>
-      <w:r>
-        <w:rPr>
-          <w:rFonts w:cs="Calibri" w:ascii="Calibri" w:hAnsi="Calibri"/>
+        <w:spacing w:before="0" w:after="0" w:line="230" w:lineRule="auto"/>
+        <w:jc w:val="both"/>
+        <w:rPr>
+          <w:rFonts w:ascii="Calibri" w:hAnsi="Calibri" w:cs="Calibri"/>
+        </w:rPr>
+      </w:pPr>
+      <w:r>
+        <w:rPr>
+          <w:rFonts w:cs="Arial" w:ascii="Arial" w:hAnsi="Arial"/>
+          <w:sz w:val="16"/>
         </w:rPr>
       </w:r>
     </w:p>
@@ -2348,12 +2532,14 @@
           <w:ilvl w:val="1"/>
           <w:numId w:val="2"/>
         </w:numPr>
+        <w:spacing w:before="0" w:after="0" w:line="230" w:lineRule="auto"/>
         <w:jc w:val="both"/>
         <w:rPr/>
       </w:pPr>
       <w:r>
         <w:rPr>
-          <w:rFonts w:cs="Calibri" w:ascii="Calibri" w:hAnsi="Calibri"/>
+          <w:rFonts w:cs="Arial" w:ascii="Arial" w:hAnsi="Arial"/>
+          <w:sz w:val="16"/>
         </w:rPr>
         <w:t xml:space="preserve">La Segreteria Organizzativa si obbliga a: </w:t>
         <w:tab/>
@@ -2366,13 +2552,14 @@
           <w:tab w:val="clear" w:pos="709"/>
           <w:tab w:val="left" w:pos="284" w:leader="none"/>
         </w:tabs>
+        <w:spacing w:before="0" w:after="0" w:line="230" w:lineRule="auto"/>
         <w:jc w:val="both"/>
         <w:rPr/>
       </w:pPr>
       <w:r>
         <w:rPr>
-          <w:rFonts w:cs="Calibri" w:ascii="Calibri" w:hAnsi="Calibri"/>
-          <w:sz w:val="20"/>
+          <w:rFonts w:cs="Arial" w:ascii="Arial" w:hAnsi="Arial"/>
+          <w:sz w:val="16"/>
           <w:szCs w:val="20"/>
         </w:rPr>
         <w:t>a) veicolare il programma dell’Evento attraverso i suoi canali marketing/comunicativi;</w:t>
@@ -2385,13 +2572,14 @@
           <w:tab w:val="clear" w:pos="709"/>
           <w:tab w:val="left" w:pos="284" w:leader="none"/>
         </w:tabs>
+        <w:spacing w:before="0" w:after="0" w:line="230" w:lineRule="auto"/>
         <w:jc w:val="both"/>
         <w:rPr/>
       </w:pPr>
       <w:r>
         <w:rPr>
-          <w:rFonts w:cs="Calibri" w:ascii="Calibri" w:hAnsi="Calibri"/>
-          <w:sz w:val="20"/>
+          <w:rFonts w:cs="Arial" w:ascii="Arial" w:hAnsi="Arial"/>
+          <w:sz w:val="16"/>
           <w:szCs w:val="20"/>
         </w:rPr>
         <w:t>b) mettere a disposizione dello Sponsor quanto indicato nell’allegato 1) per l’esposizione ed illustrazione, da parte di personale qualificato e autorizzato dallo Sponsor, delle caratteristiche tecnico-scientifiche dei prodotti rientranti nel settore merceologico inerente l’evento che si svolgerà come specificato all’inizio del presente accordo.</w:t>
@@ -2402,578 +2590,645 @@
     <w:p>
       <w:pPr>
         <w:pStyle w:val="Default"/>
+        <w:spacing w:before="0" w:after="0" w:line="230" w:lineRule="auto"/>
         <w:jc w:val="both"/>
         <w:rPr/>
       </w:pPr>
       <w:r>
         <w:rPr>
-          <w:rFonts w:cs="Calibri" w:ascii="Calibri" w:hAnsi="Calibri"/>
+          <w:rFonts w:cs="Arial" w:ascii="Arial" w:hAnsi="Arial"/>
+          <w:bCs/>
+          <w:sz w:val="16"/>
+          <w:szCs w:val="20"/>
+        </w:rPr>
+        <w:t xml:space="preserve">c) </w:t>
+      </w:r>
+      <w:r>
+        <w:rPr>
+          <w:rFonts w:cs="Arial" w:ascii="Arial" w:hAnsi="Arial"/>
+          <w:sz w:val="16"/>
+          <w:szCs w:val="20"/>
+        </w:rPr>
+        <w:t xml:space="preserve">esporre il logo aziendale dello Sponsor, come più avanti specificato. </w:t>
+      </w:r>
+    </w:p>
+    <w:p>
+      <w:pPr>
+        <w:pStyle w:val="Default"/>
+        <w:spacing w:before="0" w:after="0" w:line="230" w:lineRule="auto"/>
+        <w:jc w:val="both"/>
+        <w:rPr/>
+      </w:pPr>
+      <w:r>
+        <w:rPr>
+          <w:rFonts w:cs="Arial" w:ascii="Arial" w:hAnsi="Arial"/>
+          <w:sz w:val="16"/>
+          <w:szCs w:val="20"/>
+        </w:rPr>
+        <w:t xml:space="preserve">La Segreteria Organizzativa potrà avvalersi, nell’esecuzione delle attività di cui sopra, anche di altri soggetti Partner, ai quali potrà delegare in tutto o in parte l’effettuazione delle attività stesse. </w:t>
+      </w:r>
+    </w:p>
+    <w:p>
+      <w:pPr>
+        <w:pStyle w:val="Normal"/>
+        <w:spacing w:before="0" w:after="0" w:line="230" w:lineRule="auto"/>
+        <w:jc w:val="both"/>
+        <w:rPr>
+          <w:rFonts w:ascii="Calibri" w:hAnsi="Calibri" w:cs="Calibri"/>
+          <w:b/>
+          <w:b/>
+          <w:bCs/>
+        </w:rPr>
+      </w:pPr>
+      <w:r>
+        <w:rPr>
+          <w:rFonts w:cs="Arial" w:ascii="Arial" w:hAnsi="Arial"/>
+          <w:b/>
+          <w:bCs/>
+          <w:sz w:val="16"/>
+        </w:rPr>
+        <w:t xml:space="preserve">1.7 </w:t>
+      </w:r>
+      <w:r>
+        <w:rPr>
+          <w:rFonts w:cs="Arial" w:ascii="Arial" w:hAnsi="Arial"/>
+          <w:sz w:val="16"/>
+        </w:rPr>
+        <w:t xml:space="preserve">La Segreteria Organizzativa fornirà allo Sponsor, su sua specifica richiesta, almeno 70 giorni prima dell’inizio dell’Evento, il programma definitivo, la documentazione e tutte le informazioni necessarie per procedere alla richiesta di autorizzazione all’AIFA prevista dall’art. 124 del D.Lgs. 219/2006, se applicabile. </w:t>
+      </w:r>
+    </w:p>
+    <w:p>
+      <w:pPr>
+        <w:pStyle w:val="Normal"/>
+        <w:spacing w:before="0" w:after="0" w:line="230" w:lineRule="auto"/>
+        <w:jc w:val="both"/>
+        <w:rPr>
+          <w:rFonts w:ascii="Calibri" w:hAnsi="Calibri" w:cs="Calibri"/>
+        </w:rPr>
+      </w:pPr>
+      <w:r>
+        <w:rPr>
+          <w:rFonts w:cs="Arial" w:ascii="Arial" w:hAnsi="Arial"/>
+          <w:b/>
+          <w:bCs/>
+          <w:sz w:val="16"/>
+        </w:rPr>
+        <w:t xml:space="preserve">1.8 </w:t>
+      </w:r>
+      <w:r>
+        <w:rPr>
+          <w:rFonts w:cs="Arial" w:ascii="Arial" w:hAnsi="Arial"/>
+          <w:sz w:val="16"/>
+        </w:rPr>
+        <w:t>La Segreteria Organizzativa si impegna a conservare una completa ed accurata documentazione relativa ai propri rapporti con lo Sponsor per un periodo di durata non inferiore a cinque anni.</w:t>
+      </w:r>
+    </w:p>
+    <w:p>
+      <w:pPr>
+        <w:pStyle w:val="Paragrafoelenco"/>
+        <w:widowControl w:val="false"/>
+        <w:spacing w:lineRule="auto" w:line="230" w:before="0" w:after="0"/>
+        <w:ind w:left="0" w:right="83" w:hanging="0"/>
+        <w:contextualSpacing w:val="false"/>
+        <w:jc w:val="both"/>
+        <w:rPr/>
+      </w:pPr>
+      <w:r>
+        <w:rPr>
+          <w:rFonts w:cs="Arial" w:ascii="Arial" w:hAnsi="Arial"/>
+          <w:b/>
+          <w:bCs/>
+          <w:sz w:val="16"/>
+          <w:szCs w:val="20"/>
+        </w:rPr>
+        <w:t xml:space="preserve">1.9 </w:t>
+      </w:r>
+      <w:r>
+        <w:rPr>
+          <w:rFonts w:cs="Arial" w:ascii="Arial" w:hAnsi="Arial"/>
+          <w:sz w:val="16"/>
+          <w:szCs w:val="20"/>
+        </w:rPr>
+        <w:t>L’elenco e gli indirizzi dei partecipanti all’evento verranno mantenuti riservati e non saranno trasmessi allo Sponsor. Tuttavia, sarà possibile comunicare allo Sponsor solo il numero complessivo dei discenti presenti all’evento formativo. Nel caso di reclutamento diretto è possibile per La Segreteria organizzativa dare un riscontro solamente sui nominativi segnalati dallo Sponsor.</w:t>
+      </w:r>
+    </w:p>
+    <w:p>
+      <w:pPr>
+        <w:pStyle w:val="Normal"/>
+        <w:spacing w:before="0" w:after="0" w:line="230" w:lineRule="auto"/>
+        <w:jc w:val="both"/>
+        <w:rPr>
+          <w:rFonts w:ascii="Calibri" w:hAnsi="Calibri" w:cs="Calibri"/>
+          <w:b/>
+          <w:b/>
           <w:bCs/>
           <w:sz w:val="20"/>
           <w:szCs w:val="20"/>
         </w:rPr>
-        <w:t xml:space="preserve">c) </w:t>
-      </w:r>
-      <w:r>
-        <w:rPr>
-          <w:rFonts w:cs="Calibri" w:ascii="Calibri" w:hAnsi="Calibri"/>
-          <w:sz w:val="20"/>
+      </w:pPr>
+      <w:r>
+        <w:rPr>
+          <w:rFonts w:cs="Arial" w:ascii="Arial" w:hAnsi="Arial"/>
+          <w:b/>
+          <w:bCs/>
+          <w:sz w:val="16"/>
           <w:szCs w:val="20"/>
         </w:rPr>
-        <w:t xml:space="preserve">esporre il logo aziendale dello Sponsor, come più avanti specificato. </w:t>
-      </w:r>
-    </w:p>
-    <w:p>
-      <w:pPr>
-        <w:pStyle w:val="Default"/>
+      </w:r>
+    </w:p>
+    <w:p>
+      <w:pPr>
+        <w:pStyle w:val="Normal"/>
+        <w:spacing w:before="0" w:after="0" w:line="230" w:lineRule="auto"/>
+        <w:jc w:val="both"/>
+        <w:rPr>
+          <w:rFonts w:ascii="Calibri" w:hAnsi="Calibri" w:cs="Calibri"/>
+        </w:rPr>
+      </w:pPr>
+      <w:r>
+        <w:rPr>
+          <w:rFonts w:cs="Arial" w:ascii="Arial" w:hAnsi="Arial"/>
+          <w:b/>
+          <w:bCs/>
+          <w:sz w:val="16"/>
+        </w:rPr>
+        <w:t xml:space="preserve">2. Obblighi dello Sponsor </w:t>
+      </w:r>
+    </w:p>
+    <w:p>
+      <w:pPr>
+        <w:pStyle w:val="Normal"/>
+        <w:spacing w:before="0" w:after="0" w:line="230" w:lineRule="auto"/>
+        <w:jc w:val="both"/>
+        <w:rPr>
+          <w:rFonts w:ascii="Calibri" w:hAnsi="Calibri" w:cs="Calibri"/>
+          <w:b/>
+          <w:b/>
+          <w:bCs/>
+        </w:rPr>
+      </w:pPr>
+      <w:r>
+        <w:rPr>
+          <w:rFonts w:cs="Arial" w:ascii="Arial" w:hAnsi="Arial"/>
+          <w:b/>
+          <w:bCs/>
+          <w:sz w:val="16"/>
+        </w:rPr>
+        <w:t xml:space="preserve">2.1 </w:t>
+      </w:r>
+      <w:r>
+        <w:rPr>
+          <w:rFonts w:cs="Arial" w:ascii="Arial" w:hAnsi="Arial"/>
+          <w:sz w:val="16"/>
+        </w:rPr>
+        <w:t>Lo Sponsor si obbliga a sostenere l’Evento di cui al punto a) delle premesse e come da specifica nell’allegato 1) e a fornire le indicazioni necessarie alla realizzazione della pubblicità nel rispetto dei limiti di cui presente Contratto.</w:t>
+      </w:r>
+    </w:p>
+    <w:p>
+      <w:pPr>
+        <w:pStyle w:val="Normal"/>
+        <w:spacing w:before="0" w:after="0" w:line="230" w:lineRule="auto"/>
         <w:jc w:val="both"/>
         <w:rPr/>
       </w:pPr>
       <w:r>
         <w:rPr>
-          <w:rFonts w:cs="Calibri" w:ascii="Calibri" w:hAnsi="Calibri"/>
-          <w:sz w:val="20"/>
-          <w:szCs w:val="20"/>
-        </w:rPr>
-        <w:t xml:space="preserve">La Segreteria Organizzativa potrà avvalersi, nell’esecuzione delle attività di cui sopra, anche di altri soggetti Partner, ai quali potrà delegare in tutto o in parte l’effettuazione delle attività stesse. </w:t>
-      </w:r>
-    </w:p>
-    <w:p>
-      <w:pPr>
-        <w:pStyle w:val="Normal"/>
-        <w:jc w:val="both"/>
-        <w:rPr>
-          <w:rFonts w:ascii="Calibri" w:hAnsi="Calibri" w:cs="Calibri"/>
-          <w:b/>
-          <w:b/>
-          <w:bCs/>
-        </w:rPr>
-      </w:pPr>
-      <w:r>
-        <w:rPr>
-          <w:rFonts w:cs="Calibri" w:ascii="Calibri" w:hAnsi="Calibri"/>
-          <w:b/>
-          <w:bCs/>
-        </w:rPr>
-        <w:t xml:space="preserve">1.7 </w:t>
-      </w:r>
-      <w:r>
-        <w:rPr>
-          <w:rFonts w:cs="Calibri" w:ascii="Calibri" w:hAnsi="Calibri"/>
-        </w:rPr>
-        <w:t xml:space="preserve">La Segreteria Organizzativa fornirà allo Sponsor, su sua specifica richiesta, almeno 70 giorni prima dell’inizio dell’Evento, il programma definitivo, la documentazione e tutte le informazioni necessarie per procedere alla richiesta di autorizzazione all’AIFA prevista dall’art. 124 del D.Lgs. 219/2006, se applicabile. </w:t>
-      </w:r>
-    </w:p>
-    <w:p>
-      <w:pPr>
-        <w:pStyle w:val="Normal"/>
-        <w:jc w:val="both"/>
-        <w:rPr>
-          <w:rFonts w:ascii="Calibri" w:hAnsi="Calibri" w:cs="Calibri"/>
-        </w:rPr>
-      </w:pPr>
-      <w:r>
-        <w:rPr>
-          <w:rFonts w:cs="Calibri" w:ascii="Calibri" w:hAnsi="Calibri"/>
-          <w:b/>
-          <w:bCs/>
-        </w:rPr>
-        <w:t xml:space="preserve">1.8 </w:t>
-      </w:r>
-      <w:r>
-        <w:rPr>
-          <w:rFonts w:cs="Calibri" w:ascii="Calibri" w:hAnsi="Calibri"/>
-        </w:rPr>
-        <w:t>La Segreteria Organizzativa si impegna a conservare una completa ed accurata documentazione relativa ai propri rapporti con lo Sponsor per un periodo di durata non inferiore a cinque anni.</w:t>
-      </w:r>
-    </w:p>
-    <w:p>
-      <w:pPr>
-        <w:pStyle w:val="Paragrafoelenco"/>
-        <w:widowControl w:val="false"/>
-        <w:spacing w:lineRule="auto" w:line="240" w:before="69" w:after="0"/>
-        <w:ind w:left="0" w:right="83" w:hanging="0"/>
-        <w:contextualSpacing w:val="false"/>
+          <w:rFonts w:cs="Arial" w:ascii="Arial" w:hAnsi="Arial"/>
+          <w:b/>
+          <w:bCs/>
+          <w:sz w:val="16"/>
+        </w:rPr>
+        <w:t>2.2</w:t>
+      </w:r>
+      <w:r>
+        <w:rPr>
+          <w:rFonts w:cs="Arial" w:ascii="Arial" w:hAnsi="Arial"/>
+          <w:sz w:val="16"/>
+        </w:rPr>
+        <w:t xml:space="preserve"> </w:t>
+      </w:r>
+      <w:r>
+        <w:rPr>
+          <w:rFonts w:cs="Arial" w:ascii="Arial" w:hAnsi="Arial"/>
+          <w:bCs/>
+          <w:sz w:val="16"/>
+        </w:rPr>
+        <w:t>L</w:t>
+      </w:r>
+      <w:r>
+        <w:rPr>
+          <w:rFonts w:cs="Arial" w:ascii="Arial" w:hAnsi="Arial"/>
+          <w:sz w:val="16"/>
+        </w:rPr>
+        <w:t>e attività inerenti i trasferimenti e l’ospitalità alberghiera dei partecipanti invitati dallo Sponsor sono gestite direttamente da quest’ultimo.</w:t>
+      </w:r>
+    </w:p>
+    <w:p>
+      <w:pPr>
+        <w:pStyle w:val="Normal"/>
+        <w:spacing w:before="0" w:after="0" w:line="230" w:lineRule="auto"/>
+        <w:jc w:val="both"/>
+        <w:rPr>
+          <w:rFonts w:ascii="Calibri" w:hAnsi="Calibri" w:cs="Calibri"/>
+        </w:rPr>
+      </w:pPr>
+      <w:r>
+        <w:rPr>
+          <w:rFonts w:cs="Arial" w:ascii="Arial" w:hAnsi="Arial"/>
+          <w:sz w:val="16"/>
+        </w:rPr>
+      </w:r>
+    </w:p>
+    <w:p>
+      <w:pPr>
+        <w:pStyle w:val="Normal"/>
+        <w:spacing w:before="0" w:after="0" w:line="230" w:lineRule="auto"/>
+        <w:jc w:val="both"/>
+        <w:rPr>
+          <w:rFonts w:ascii="Calibri" w:hAnsi="Calibri" w:cs="Calibri"/>
+        </w:rPr>
+      </w:pPr>
+      <w:r>
+        <w:rPr>
+          <w:rFonts w:cs="Arial" w:ascii="Arial" w:hAnsi="Arial"/>
+          <w:b/>
+          <w:bCs/>
+          <w:sz w:val="16"/>
+        </w:rPr>
+        <w:t xml:space="preserve">3. Corrispettivo e modalità di pagamento </w:t>
+      </w:r>
+    </w:p>
+    <w:p>
+      <w:pPr>
+        <w:pStyle w:val="Normal"/>
+        <w:spacing w:before="0" w:after="0" w:line="230" w:lineRule="auto"/>
         <w:jc w:val="both"/>
         <w:rPr/>
       </w:pPr>
       <w:r>
         <w:rPr>
-          <w:rFonts w:cs="Calibri"/>
-          <w:b/>
-          <w:bCs/>
-          <w:sz w:val="20"/>
-          <w:szCs w:val="20"/>
-        </w:rPr>
-        <w:t xml:space="preserve">1.9 </w:t>
-      </w:r>
-      <w:r>
-        <w:rPr>
-          <w:rFonts w:cs="Calibri"/>
-          <w:sz w:val="20"/>
-          <w:szCs w:val="20"/>
-        </w:rPr>
-        <w:t>L’elenco e gli indirizzi dei partecipanti all’evento verranno mantenuti riservati e non saranno trasmessi allo Sponsor. Tuttavia, sarà possibile comunicare allo Sponsor solo il numero complessivo dei discenti presenti all’evento formativo. Nel caso di reclutamento diretto è possibile per La Segreteria organizzativa dare un riscontro solamente sui nominativi segnalati dallo Sponsor.</w:t>
-      </w:r>
-    </w:p>
-    <w:p>
-      <w:pPr>
-        <w:pStyle w:val="Normal"/>
-        <w:jc w:val="both"/>
-        <w:rPr>
-          <w:rFonts w:ascii="Calibri" w:hAnsi="Calibri" w:cs="Calibri"/>
-          <w:b/>
-          <w:b/>
-          <w:bCs/>
-          <w:sz w:val="20"/>
-          <w:szCs w:val="20"/>
-        </w:rPr>
-      </w:pPr>
-      <w:r>
-        <w:rPr>
-          <w:rFonts w:cs="Calibri" w:ascii="Calibri" w:hAnsi="Calibri"/>
-          <w:b/>
-          <w:bCs/>
-          <w:sz w:val="20"/>
-          <w:szCs w:val="20"/>
-        </w:rPr>
-      </w:r>
-    </w:p>
-    <w:p>
-      <w:pPr>
-        <w:pStyle w:val="Normal"/>
-        <w:jc w:val="both"/>
-        <w:rPr>
-          <w:rFonts w:ascii="Calibri" w:hAnsi="Calibri" w:cs="Calibri"/>
-        </w:rPr>
-      </w:pPr>
-      <w:r>
-        <w:rPr>
-          <w:rFonts w:cs="Calibri" w:ascii="Calibri" w:hAnsi="Calibri"/>
-          <w:b/>
-          <w:bCs/>
-        </w:rPr>
-        <w:t xml:space="preserve">2. Obblighi dello Sponsor </w:t>
-      </w:r>
-    </w:p>
-    <w:p>
-      <w:pPr>
-        <w:pStyle w:val="Normal"/>
-        <w:jc w:val="both"/>
-        <w:rPr>
-          <w:rFonts w:ascii="Calibri" w:hAnsi="Calibri" w:cs="Calibri"/>
-          <w:b/>
-          <w:b/>
-          <w:bCs/>
-        </w:rPr>
-      </w:pPr>
-      <w:r>
-        <w:rPr>
-          <w:rFonts w:cs="Calibri" w:ascii="Calibri" w:hAnsi="Calibri"/>
-          <w:b/>
-          <w:bCs/>
-        </w:rPr>
-        <w:t xml:space="preserve">2.1 </w:t>
-      </w:r>
-      <w:r>
-        <w:rPr>
-          <w:rFonts w:cs="Calibri" w:ascii="Calibri" w:hAnsi="Calibri"/>
-        </w:rPr>
-        <w:t>Lo Sponsor si obbliga a sostenere l’Evento di cui al punto a) delle premesse e come da specifica nell’allegato 1) e a fornire le indicazioni necessarie alla realizzazione della pubblicità nel rispetto dei limiti di cui presente Contratto.</w:t>
-      </w:r>
-    </w:p>
-    <w:p>
-      <w:pPr>
-        <w:pStyle w:val="Normal"/>
+          <w:rFonts w:cs="Arial" w:ascii="Arial" w:hAnsi="Arial"/>
+          <w:b/>
+          <w:bCs/>
+          <w:sz w:val="16"/>
+        </w:rPr>
+        <w:t xml:space="preserve">3.1 </w:t>
+      </w:r>
+      <w:r>
+        <w:rPr>
+          <w:rFonts w:cs="Arial" w:ascii="Arial" w:hAnsi="Arial"/>
+          <w:sz w:val="16"/>
+        </w:rPr>
+        <w:t>Lo Sponsor garantisce di corrispondere alla Segreteria Organizzativa il compenso concordato per la sponsorizzazione dell’Evento, così come definito nell’</w:t>
+      </w:r>
+      <w:r>
+        <w:rPr>
+          <w:rFonts w:cs="Arial" w:ascii="Arial" w:hAnsi="Arial"/>
+          <w:b/>
+          <w:bCs/>
+          <w:sz w:val="16"/>
+        </w:rPr>
+        <w:t>Allegato 1).</w:t>
+      </w:r>
+    </w:p>
+    <w:p>
+      <w:pPr>
+        <w:pStyle w:val="Normal"/>
+        <w:spacing w:before="0" w:after="0" w:line="230" w:lineRule="auto"/>
+        <w:jc w:val="both"/>
+        <w:rPr>
+          <w:rFonts w:ascii="Calibri" w:hAnsi="Calibri" w:cs="Calibri"/>
+          <w:b/>
+          <w:b/>
+          <w:bCs/>
+        </w:rPr>
+      </w:pPr>
+      <w:r>
+        <w:rPr>
+          <w:rFonts w:cs="Arial" w:ascii="Arial" w:hAnsi="Arial"/>
+          <w:b/>
+          <w:bCs/>
+          <w:sz w:val="16"/>
+        </w:rPr>
+        <w:t xml:space="preserve">3.2 </w:t>
+      </w:r>
+      <w:r>
+        <w:rPr>
+          <w:rFonts w:cs="Arial" w:ascii="Arial" w:hAnsi="Arial"/>
+          <w:iCs/>
+          <w:sz w:val="16"/>
+        </w:rPr>
+        <w:t>La Segreteria Organizzativa garantisce e dichiara che il compenso corrisposto dallo Sponsor, indicato nel presente Contratto, quanto all’importo e alle modalità di pagamento, non è condizionante sui contenuti delle attività, ma ha la finalità di fornire il necessario supporto finanziario per la buona riuscita dell’evento stesso</w:t>
+      </w:r>
+    </w:p>
+    <w:p>
+      <w:pPr>
+        <w:pStyle w:val="Normal"/>
+        <w:spacing w:before="0" w:after="0" w:line="230" w:lineRule="auto"/>
+        <w:jc w:val="both"/>
+        <w:rPr>
+          <w:rFonts w:ascii="Calibri" w:hAnsi="Calibri" w:cs="Calibri"/>
+          <w:b/>
+          <w:b/>
+          <w:bCs/>
+        </w:rPr>
+      </w:pPr>
+      <w:r>
+        <w:rPr>
+          <w:rFonts w:cs="Arial" w:ascii="Arial" w:hAnsi="Arial"/>
+          <w:b/>
+          <w:bCs/>
+          <w:sz w:val="16"/>
+        </w:rPr>
+      </w:r>
+    </w:p>
+    <w:p>
+      <w:pPr>
+        <w:pStyle w:val="Normal"/>
+        <w:spacing w:before="0" w:after="0" w:line="230" w:lineRule="auto"/>
+        <w:jc w:val="both"/>
+        <w:rPr>
+          <w:rFonts w:ascii="Calibri" w:hAnsi="Calibri" w:cs="Calibri"/>
+        </w:rPr>
+      </w:pPr>
+      <w:r>
+        <w:rPr>
+          <w:rFonts w:cs="Arial" w:ascii="Arial" w:hAnsi="Arial"/>
+          <w:b/>
+          <w:bCs/>
+          <w:sz w:val="16"/>
+        </w:rPr>
+        <w:t xml:space="preserve">4. Durata e Scioglimento del Contratto </w:t>
+      </w:r>
+    </w:p>
+    <w:p>
+      <w:pPr>
+        <w:pStyle w:val="Normal"/>
+        <w:spacing w:before="0" w:after="0" w:line="230" w:lineRule="auto"/>
         <w:jc w:val="both"/>
         <w:rPr/>
       </w:pPr>
       <w:r>
         <w:rPr>
-          <w:rFonts w:cs="Calibri" w:ascii="Calibri" w:hAnsi="Calibri"/>
-          <w:b/>
-          <w:bCs/>
-        </w:rPr>
-        <w:t>2.2</w:t>
-      </w:r>
-      <w:r>
-        <w:rPr>
-          <w:rFonts w:cs="Calibri" w:ascii="Calibri" w:hAnsi="Calibri"/>
-        </w:rPr>
-        <w:t xml:space="preserve"> </w:t>
-      </w:r>
-      <w:r>
-        <w:rPr>
-          <w:rFonts w:cs="Calibri" w:ascii="Calibri" w:hAnsi="Calibri"/>
-          <w:bCs/>
-        </w:rPr>
-        <w:t>L</w:t>
-      </w:r>
-      <w:r>
-        <w:rPr>
-          <w:rFonts w:cs="Calibri" w:ascii="Calibri" w:hAnsi="Calibri"/>
-        </w:rPr>
-        <w:t>e attività inerenti i trasferimenti e l’ospitalità alberghiera dei partecipanti invitati dallo Sponsor sono gestite direttamente da quest’ultimo.</w:t>
-      </w:r>
-    </w:p>
-    <w:p>
-      <w:pPr>
-        <w:pStyle w:val="Normal"/>
-        <w:jc w:val="both"/>
-        <w:rPr>
-          <w:rFonts w:ascii="Calibri" w:hAnsi="Calibri" w:cs="Calibri"/>
-        </w:rPr>
-      </w:pPr>
-      <w:r>
-        <w:rPr>
-          <w:rFonts w:cs="Calibri" w:ascii="Calibri" w:hAnsi="Calibri"/>
-        </w:rPr>
-      </w:r>
-    </w:p>
-    <w:p>
-      <w:pPr>
-        <w:pStyle w:val="Normal"/>
-        <w:jc w:val="both"/>
-        <w:rPr>
-          <w:rFonts w:ascii="Calibri" w:hAnsi="Calibri" w:cs="Calibri"/>
-        </w:rPr>
-      </w:pPr>
-      <w:r>
-        <w:rPr>
-          <w:rFonts w:cs="Calibri" w:ascii="Calibri" w:hAnsi="Calibri"/>
-          <w:b/>
-          <w:bCs/>
-        </w:rPr>
-        <w:t xml:space="preserve">3. Corrispettivo e modalità di pagamento </w:t>
-      </w:r>
-    </w:p>
-    <w:p>
-      <w:pPr>
-        <w:pStyle w:val="Normal"/>
+          <w:rFonts w:cs="Arial" w:ascii="Arial" w:hAnsi="Arial"/>
+          <w:b/>
+          <w:bCs/>
+          <w:sz w:val="16"/>
+        </w:rPr>
+        <w:t xml:space="preserve">4.1 </w:t>
+      </w:r>
+      <w:r>
+        <w:rPr>
+          <w:rFonts w:cs="Arial" w:ascii="Arial" w:hAnsi="Arial"/>
+          <w:sz w:val="16"/>
+        </w:rPr>
+        <w:t xml:space="preserve">Il presente Contratto è efficace dalla data di sottoscrizione fino alla conclusione di tutte le procedure relative all’Evento. </w:t>
+      </w:r>
+    </w:p>
+    <w:p>
+      <w:pPr>
+        <w:pStyle w:val="Normal"/>
+        <w:spacing w:before="0" w:after="0" w:line="230" w:lineRule="auto"/>
+        <w:jc w:val="both"/>
+        <w:rPr>
+          <w:rFonts w:ascii="Calibri" w:hAnsi="Calibri" w:cs="Calibri"/>
+        </w:rPr>
+      </w:pPr>
+      <w:r>
+        <w:rPr>
+          <w:rFonts w:cs="Arial" w:ascii="Arial" w:hAnsi="Arial"/>
+          <w:b/>
+          <w:bCs/>
+          <w:sz w:val="16"/>
+        </w:rPr>
+        <w:t xml:space="preserve">4.2 </w:t>
+      </w:r>
+      <w:r>
+        <w:rPr>
+          <w:rFonts w:cs="Arial" w:ascii="Arial" w:hAnsi="Arial"/>
+          <w:sz w:val="16"/>
+        </w:rPr>
+        <w:t>Lo Sponsor avrà facoltà di risolvere di diritto il presente contratto, ai sensi e per gli effetti dall’Art. 1456 del cod. civ., tramite PEC qualora la Segreteria Organizzativa non adempia agli accordi stabiliti dal presente contratto.</w:t>
+      </w:r>
+    </w:p>
+    <w:p>
+      <w:pPr>
+        <w:pStyle w:val="Normal"/>
+        <w:spacing w:before="0" w:after="0" w:line="230" w:lineRule="auto"/>
         <w:jc w:val="both"/>
         <w:rPr/>
       </w:pPr>
       <w:r>
         <w:rPr>
-          <w:rFonts w:cs="Calibri" w:ascii="Calibri" w:hAnsi="Calibri"/>
-          <w:b/>
-          <w:bCs/>
-        </w:rPr>
-        <w:t xml:space="preserve">3.1 </w:t>
-      </w:r>
-      <w:r>
-        <w:rPr>
-          <w:rFonts w:cs="Calibri" w:ascii="Calibri" w:hAnsi="Calibri"/>
-        </w:rPr>
-        <w:t>Lo Sponsor garantisce di corrispondere alla Segreteria Organizzativa il compenso concordato per la sponsorizzazione dell’Evento, così come definito nell’</w:t>
-      </w:r>
-      <w:r>
-        <w:rPr>
-          <w:rFonts w:cs="Calibri" w:ascii="Calibri" w:hAnsi="Calibri"/>
-          <w:b/>
-          <w:bCs/>
-        </w:rPr>
-        <w:t>Allegato 1).</w:t>
-      </w:r>
-    </w:p>
-    <w:p>
-      <w:pPr>
-        <w:pStyle w:val="Normal"/>
-        <w:jc w:val="both"/>
-        <w:rPr>
-          <w:rFonts w:ascii="Calibri" w:hAnsi="Calibri" w:cs="Calibri"/>
-          <w:b/>
-          <w:b/>
-          <w:bCs/>
-        </w:rPr>
-      </w:pPr>
-      <w:r>
-        <w:rPr>
-          <w:rFonts w:cs="Calibri" w:ascii="Calibri" w:hAnsi="Calibri"/>
-          <w:b/>
-          <w:bCs/>
-        </w:rPr>
-        <w:t xml:space="preserve">3.2 </w:t>
-      </w:r>
-      <w:r>
-        <w:rPr>
-          <w:rFonts w:cs="Calibri" w:ascii="Calibri" w:hAnsi="Calibri"/>
-          <w:iCs/>
-        </w:rPr>
-        <w:t>La Segreteria Organizzativa garantisce e dichiara che il compenso corrisposto dallo Sponsor, indicato nel presente Contratto, quanto all’importo e alle modalità di pagamento, non è condizionante sui contenuti delle attività, ma ha la finalità di fornire il necessario supporto finanziario per la buona riuscita dell’evento stesso</w:t>
-      </w:r>
-    </w:p>
-    <w:p>
-      <w:pPr>
-        <w:pStyle w:val="Normal"/>
-        <w:jc w:val="both"/>
-        <w:rPr>
-          <w:rFonts w:ascii="Calibri" w:hAnsi="Calibri" w:cs="Calibri"/>
-          <w:b/>
-          <w:b/>
-          <w:bCs/>
-        </w:rPr>
-      </w:pPr>
-      <w:r>
-        <w:rPr>
-          <w:rFonts w:cs="Calibri" w:ascii="Calibri" w:hAnsi="Calibri"/>
-          <w:b/>
-          <w:bCs/>
-        </w:rPr>
-      </w:r>
-    </w:p>
-    <w:p>
-      <w:pPr>
-        <w:pStyle w:val="Normal"/>
-        <w:jc w:val="both"/>
-        <w:rPr>
-          <w:rFonts w:ascii="Calibri" w:hAnsi="Calibri" w:cs="Calibri"/>
-        </w:rPr>
-      </w:pPr>
-      <w:r>
-        <w:rPr>
-          <w:rFonts w:cs="Calibri" w:ascii="Calibri" w:hAnsi="Calibri"/>
-          <w:b/>
-          <w:bCs/>
-        </w:rPr>
-        <w:t xml:space="preserve">4. Durata e Scioglimento del Contratto </w:t>
-      </w:r>
-    </w:p>
-    <w:p>
-      <w:pPr>
-        <w:pStyle w:val="Normal"/>
+          <w:rFonts w:cs="Arial" w:ascii="Arial" w:hAnsi="Arial"/>
+          <w:b/>
+          <w:bCs/>
+          <w:sz w:val="16"/>
+        </w:rPr>
+        <w:t xml:space="preserve">4.3 </w:t>
+      </w:r>
+      <w:r>
+        <w:rPr>
+          <w:rFonts w:cs="Arial" w:ascii="Arial" w:hAnsi="Arial"/>
+          <w:sz w:val="16"/>
+        </w:rPr>
+        <w:t xml:space="preserve">La Segreteria organizzativa avrà facoltà di risolvere di diritto il presente contratto, nei confronti dello Sponsor, ai sensi e per gli effetti dall’Art. 1456 del cod. civ., tramite pec: valet@pec.it nella quale dichiari di volersi avvalere della presente clausola, qualora quest’ultimo violi uno qualsiasi degli impegni assunti in premessa ed ai sensi degli artt. 1 e ss. del presente Contratto. </w:t>
+      </w:r>
+    </w:p>
+    <w:p>
+      <w:pPr>
+        <w:pStyle w:val="Normal"/>
+        <w:spacing w:before="0" w:after="0" w:line="230" w:lineRule="auto"/>
         <w:jc w:val="both"/>
         <w:rPr/>
       </w:pPr>
       <w:r>
         <w:rPr>
-          <w:rFonts w:cs="Calibri" w:ascii="Calibri" w:hAnsi="Calibri"/>
-          <w:b/>
-          <w:bCs/>
-        </w:rPr>
-        <w:t xml:space="preserve">4.1 </w:t>
-      </w:r>
-      <w:r>
-        <w:rPr>
-          <w:rFonts w:cs="Calibri" w:ascii="Calibri" w:hAnsi="Calibri"/>
-        </w:rPr>
-        <w:t xml:space="preserve">Il presente Contratto è efficace dalla data di sottoscrizione fino alla conclusione di tutte le procedure relative all’Evento. </w:t>
-      </w:r>
-    </w:p>
-    <w:p>
-      <w:pPr>
-        <w:pStyle w:val="Normal"/>
-        <w:jc w:val="both"/>
-        <w:rPr>
-          <w:rFonts w:ascii="Calibri" w:hAnsi="Calibri" w:cs="Calibri"/>
-        </w:rPr>
-      </w:pPr>
-      <w:r>
-        <w:rPr>
-          <w:rFonts w:cs="Calibri" w:ascii="Calibri" w:hAnsi="Calibri"/>
-          <w:b/>
-          <w:bCs/>
-        </w:rPr>
-        <w:t xml:space="preserve">4.2 </w:t>
-      </w:r>
-      <w:r>
-        <w:rPr>
-          <w:rFonts w:cs="Calibri" w:ascii="Calibri" w:hAnsi="Calibri"/>
-        </w:rPr>
-        <w:t>Lo Sponsor avrà facoltà di risolvere di diritto il presente contratto, ai sensi e per gli effetti dall’Art. 1456 del cod. civ., tramite PEC qualora la Segreteria Organizzativa non adempia agli accordi stabiliti dal presente contratto.</w:t>
-      </w:r>
-    </w:p>
-    <w:p>
-      <w:pPr>
-        <w:pStyle w:val="Normal"/>
+          <w:rFonts w:cs="Arial" w:ascii="Arial" w:hAnsi="Arial"/>
+          <w:b/>
+          <w:bCs/>
+          <w:sz w:val="16"/>
+        </w:rPr>
+        <w:t xml:space="preserve">4.4 </w:t>
+      </w:r>
+      <w:r>
+        <w:rPr>
+          <w:rFonts w:cs="Arial" w:ascii="Arial" w:hAnsi="Arial"/>
+          <w:sz w:val="16"/>
+        </w:rPr>
+        <w:t xml:space="preserve">In caso di scioglimento del presente contratto, per qualsiasi ragione ciò avvenga, o nel caso in cui l’Evento non venga svolto o venga interrotto e, comunque, al termine dell’Evento, la Segreteria Organizzativa e lo Sponsor dovranno astenersi dall’utilizzare qualsiasi materiale e/o informazione confidenziale acquisita in costanza di rapporto. </w:t>
+      </w:r>
+    </w:p>
+    <w:p>
+      <w:pPr>
+        <w:pStyle w:val="Normal"/>
+        <w:spacing w:before="0" w:after="0" w:line="230" w:lineRule="auto"/>
+        <w:jc w:val="both"/>
+        <w:rPr>
+          <w:rFonts w:ascii="Calibri" w:hAnsi="Calibri" w:cs="Calibri"/>
+        </w:rPr>
+      </w:pPr>
+      <w:r>
+        <w:rPr>
+          <w:rFonts w:cs="Arial" w:ascii="Arial" w:hAnsi="Arial"/>
+          <w:sz w:val="16"/>
+        </w:rPr>
+      </w:r>
+    </w:p>
+    <w:p>
+      <w:pPr>
+        <w:pStyle w:val="Normal"/>
+        <w:spacing w:before="0" w:after="0" w:line="230" w:lineRule="auto"/>
+        <w:jc w:val="both"/>
+        <w:rPr>
+          <w:rFonts w:ascii="Calibri" w:hAnsi="Calibri" w:cs="Calibri"/>
+        </w:rPr>
+      </w:pPr>
+      <w:r>
+        <w:rPr>
+          <w:rFonts w:cs="Arial" w:ascii="Arial" w:hAnsi="Arial"/>
+          <w:b/>
+          <w:bCs/>
+          <w:sz w:val="16"/>
+        </w:rPr>
+        <w:t xml:space="preserve">5. Confidenzialità e riservatezza </w:t>
+      </w:r>
+    </w:p>
+    <w:p>
+      <w:pPr>
+        <w:pStyle w:val="Normal"/>
+        <w:spacing w:before="0" w:after="0" w:line="230" w:lineRule="auto"/>
         <w:jc w:val="both"/>
         <w:rPr/>
       </w:pPr>
       <w:r>
         <w:rPr>
-          <w:rFonts w:cs="Calibri" w:ascii="Calibri" w:hAnsi="Calibri"/>
-          <w:b/>
-          <w:bCs/>
-        </w:rPr>
-        <w:t xml:space="preserve">4.3 </w:t>
-      </w:r>
-      <w:r>
-        <w:rPr>
-          <w:rFonts w:cs="Calibri" w:ascii="Calibri" w:hAnsi="Calibri"/>
-        </w:rPr>
-        <w:t xml:space="preserve">La Segreteria organizzativa avrà facoltà di risolvere di diritto il presente contratto, nei confronti dello Sponsor, ai sensi e per gli effetti dall’Art. 1456 del cod. civ., tramite pec: valet@pec.it nella quale dichiari di volersi avvalere della presente clausola, qualora quest’ultimo violi uno qualsiasi degli impegni assunti in premessa ed ai sensi degli artt. 1 e ss. del presente Contratto. </w:t>
-      </w:r>
-    </w:p>
-    <w:p>
-      <w:pPr>
-        <w:pStyle w:val="Normal"/>
+          <w:rFonts w:cs="Arial" w:ascii="Arial" w:hAnsi="Arial"/>
+          <w:b/>
+          <w:bCs/>
+          <w:sz w:val="16"/>
+        </w:rPr>
+        <w:t xml:space="preserve">5.1 </w:t>
+      </w:r>
+      <w:r>
+        <w:rPr>
+          <w:rFonts w:cs="Arial" w:ascii="Arial" w:hAnsi="Arial"/>
+          <w:sz w:val="16"/>
+        </w:rPr>
+        <w:t>La Segreteria Organizzativa dichiara e garantisce che i dati personali relativi ai propri dipendenti e collaboratori, nonché ai partecipanti all’Evento e/o a terzi raccolti od utilizzati in occasione dell’Evento stesso (di seguito “</w:t>
+      </w:r>
+      <w:r>
+        <w:rPr>
+          <w:rFonts w:cs="Arial" w:ascii="Arial" w:hAnsi="Arial"/>
+          <w:b/>
+          <w:bCs/>
+          <w:sz w:val="16"/>
+        </w:rPr>
+        <w:t>Dati Personali</w:t>
+      </w:r>
+      <w:r>
+        <w:rPr>
+          <w:rFonts w:cs="Arial" w:ascii="Arial" w:hAnsi="Arial"/>
+          <w:sz w:val="16"/>
+        </w:rPr>
+        <w:t>”) saranno trattati in conformità a quanto stabilito dal D.Lgs. n. 196/2003 e successive modifiche ed integrazioni e dal nuovo Regolamento Europeo 679/2016 (di seguito “</w:t>
+      </w:r>
+      <w:r>
+        <w:rPr>
+          <w:rFonts w:cs="Arial" w:ascii="Arial" w:hAnsi="Arial"/>
+          <w:b/>
+          <w:bCs/>
+          <w:sz w:val="16"/>
+        </w:rPr>
+        <w:t>Codice della Privacy</w:t>
+      </w:r>
+      <w:r>
+        <w:rPr>
+          <w:rFonts w:cs="Arial" w:ascii="Arial" w:hAnsi="Arial"/>
+          <w:sz w:val="16"/>
+        </w:rPr>
+        <w:t xml:space="preserve">”). </w:t>
+      </w:r>
+    </w:p>
+    <w:p>
+      <w:pPr>
+        <w:pStyle w:val="Normal"/>
+        <w:spacing w:before="0" w:after="0" w:line="230" w:lineRule="auto"/>
         <w:jc w:val="both"/>
         <w:rPr/>
       </w:pPr>
       <w:r>
         <w:rPr>
-          <w:rFonts w:cs="Calibri" w:ascii="Calibri" w:hAnsi="Calibri"/>
-          <w:b/>
-          <w:bCs/>
-        </w:rPr>
-        <w:t xml:space="preserve">4.4 </w:t>
-      </w:r>
-      <w:r>
-        <w:rPr>
-          <w:rFonts w:cs="Calibri" w:ascii="Calibri" w:hAnsi="Calibri"/>
-        </w:rPr>
-        <w:t xml:space="preserve">In caso di scioglimento del presente contratto, per qualsiasi ragione ciò avvenga, o nel caso in cui l’Evento non venga svolto o venga interrotto e, comunque, al termine dell’Evento, la Segreteria Organizzativa e lo Sponsor dovranno astenersi dall’utilizzare qualsiasi materiale e/o informazione confidenziale acquisita in costanza di rapporto. </w:t>
-      </w:r>
-    </w:p>
-    <w:p>
-      <w:pPr>
-        <w:pStyle w:val="Normal"/>
-        <w:jc w:val="both"/>
-        <w:rPr>
-          <w:rFonts w:ascii="Calibri" w:hAnsi="Calibri" w:cs="Calibri"/>
-        </w:rPr>
-      </w:pPr>
-      <w:r>
-        <w:rPr>
-          <w:rFonts w:cs="Calibri" w:ascii="Calibri" w:hAnsi="Calibri"/>
-        </w:rPr>
-      </w:r>
-    </w:p>
-    <w:p>
-      <w:pPr>
-        <w:pStyle w:val="Normal"/>
-        <w:jc w:val="both"/>
-        <w:rPr>
-          <w:rFonts w:ascii="Calibri" w:hAnsi="Calibri" w:cs="Calibri"/>
-        </w:rPr>
-      </w:pPr>
-      <w:r>
-        <w:rPr>
-          <w:rFonts w:cs="Calibri" w:ascii="Calibri" w:hAnsi="Calibri"/>
-          <w:b/>
-          <w:bCs/>
-        </w:rPr>
-        <w:t xml:space="preserve">5. Confidenzialità e riservatezza </w:t>
-      </w:r>
-    </w:p>
-    <w:p>
-      <w:pPr>
-        <w:pStyle w:val="Normal"/>
+          <w:rFonts w:cs="Arial" w:ascii="Arial" w:hAnsi="Arial"/>
+          <w:b/>
+          <w:bCs/>
+          <w:sz w:val="16"/>
+        </w:rPr>
+        <w:t xml:space="preserve">5.2 </w:t>
+      </w:r>
+      <w:r>
+        <w:rPr>
+          <w:rFonts w:cs="Arial" w:ascii="Arial" w:hAnsi="Arial"/>
+          <w:sz w:val="16"/>
+        </w:rPr>
+        <w:t xml:space="preserve">Resta peraltro inteso che, ai fini del Codice della Privacy, titolare del trattamento dei dati personali è e resterà la Segreteria Organizzativa in persona del suo legale rappresentante. </w:t>
+      </w:r>
+    </w:p>
+    <w:p>
+      <w:pPr>
+        <w:pStyle w:val="Normal"/>
+        <w:spacing w:before="0" w:after="0" w:line="230" w:lineRule="auto"/>
+        <w:jc w:val="both"/>
+        <w:rPr>
+          <w:rFonts w:ascii="Calibri" w:hAnsi="Calibri" w:cs="Calibri"/>
+        </w:rPr>
+      </w:pPr>
+      <w:r>
+        <w:rPr>
+          <w:rFonts w:cs="Arial" w:ascii="Arial" w:hAnsi="Arial"/>
+          <w:sz w:val="16"/>
+        </w:rPr>
+      </w:r>
+    </w:p>
+    <w:p>
+      <w:pPr>
+        <w:pStyle w:val="Normal"/>
+        <w:spacing w:before="0" w:after="0" w:line="230" w:lineRule="auto"/>
+        <w:jc w:val="both"/>
+        <w:rPr>
+          <w:rFonts w:ascii="Calibri" w:hAnsi="Calibri" w:cs="Calibri"/>
+        </w:rPr>
+      </w:pPr>
+      <w:r>
+        <w:rPr>
+          <w:rFonts w:cs="Arial" w:ascii="Arial" w:hAnsi="Arial"/>
+          <w:b/>
+          <w:bCs/>
+          <w:sz w:val="16"/>
+        </w:rPr>
+        <w:t xml:space="preserve">6. Ulteriori obbligazioni delle Parti </w:t>
+      </w:r>
+    </w:p>
+    <w:p>
+      <w:pPr>
+        <w:pStyle w:val="Normal"/>
+        <w:spacing w:before="0" w:after="0" w:line="230" w:lineRule="auto"/>
         <w:jc w:val="both"/>
         <w:rPr/>
       </w:pPr>
       <w:r>
         <w:rPr>
-          <w:rFonts w:cs="Calibri" w:ascii="Calibri" w:hAnsi="Calibri"/>
-          <w:b/>
-          <w:bCs/>
-        </w:rPr>
-        <w:t xml:space="preserve">5.1 </w:t>
-      </w:r>
-      <w:r>
-        <w:rPr>
-          <w:rFonts w:cs="Calibri" w:ascii="Calibri" w:hAnsi="Calibri"/>
-        </w:rPr>
-        <w:t>La Segreteria Organizzativa dichiara e garantisce che i dati personali relativi ai propri dipendenti e collaboratori, nonché ai partecipanti all’Evento e/o a terzi raccolti od utilizzati in occasione dell’Evento stesso (di seguito “</w:t>
-      </w:r>
-      <w:r>
-        <w:rPr>
-          <w:rFonts w:cs="Calibri" w:ascii="Calibri" w:hAnsi="Calibri"/>
-          <w:b/>
-          <w:bCs/>
-        </w:rPr>
-        <w:t>Dati Personali</w:t>
-      </w:r>
-      <w:r>
-        <w:rPr>
-          <w:rFonts w:cs="Calibri" w:ascii="Calibri" w:hAnsi="Calibri"/>
-        </w:rPr>
-        <w:t>”) saranno trattati in conformità a quanto stabilito dal D.Lgs. n. 196/2003 e successive modifiche ed integrazioni e dal nuovo Regolamento Europeo 679/2016 (di seguito “</w:t>
-      </w:r>
-      <w:r>
-        <w:rPr>
-          <w:rFonts w:cs="Calibri" w:ascii="Calibri" w:hAnsi="Calibri"/>
-          <w:b/>
-          <w:bCs/>
-        </w:rPr>
-        <w:t>Codice della Privacy</w:t>
-      </w:r>
-      <w:r>
-        <w:rPr>
-          <w:rFonts w:cs="Calibri" w:ascii="Calibri" w:hAnsi="Calibri"/>
-        </w:rPr>
-        <w:t xml:space="preserve">”). </w:t>
-      </w:r>
-    </w:p>
-    <w:p>
-      <w:pPr>
-        <w:pStyle w:val="Normal"/>
-        <w:jc w:val="both"/>
-        <w:rPr/>
-      </w:pPr>
-      <w:r>
-        <w:rPr>
-          <w:rFonts w:cs="Calibri" w:ascii="Calibri" w:hAnsi="Calibri"/>
-          <w:b/>
-          <w:bCs/>
-        </w:rPr>
-        <w:t xml:space="preserve">5.2 </w:t>
-      </w:r>
-      <w:r>
-        <w:rPr>
-          <w:rFonts w:cs="Calibri" w:ascii="Calibri" w:hAnsi="Calibri"/>
-        </w:rPr>
-        <w:t xml:space="preserve">Resta peraltro inteso che, ai fini del Codice della Privacy, titolare del trattamento dei dati personali è e resterà la Segreteria Organizzativa in persona del suo legale rappresentante. </w:t>
-      </w:r>
-    </w:p>
-    <w:p>
-      <w:pPr>
-        <w:pStyle w:val="Normal"/>
-        <w:jc w:val="both"/>
-        <w:rPr>
-          <w:rFonts w:ascii="Calibri" w:hAnsi="Calibri" w:cs="Calibri"/>
-        </w:rPr>
-      </w:pPr>
-      <w:r>
-        <w:rPr>
-          <w:rFonts w:cs="Calibri" w:ascii="Calibri" w:hAnsi="Calibri"/>
-        </w:rPr>
-      </w:r>
-    </w:p>
-    <w:p>
-      <w:pPr>
-        <w:pStyle w:val="Normal"/>
-        <w:jc w:val="both"/>
-        <w:rPr>
-          <w:rFonts w:ascii="Calibri" w:hAnsi="Calibri" w:cs="Calibri"/>
-        </w:rPr>
-      </w:pPr>
-      <w:r>
-        <w:rPr>
-          <w:rFonts w:cs="Calibri" w:ascii="Calibri" w:hAnsi="Calibri"/>
-          <w:b/>
-          <w:bCs/>
-        </w:rPr>
-        <w:t xml:space="preserve">6. Ulteriori obbligazioni delle Parti </w:t>
-      </w:r>
-    </w:p>
-    <w:p>
-      <w:pPr>
-        <w:pStyle w:val="Normal"/>
-        <w:jc w:val="both"/>
-        <w:rPr/>
-      </w:pPr>
-      <w:r>
-        <w:rPr>
-          <w:rFonts w:cs="Calibri" w:ascii="Calibri" w:hAnsi="Calibri"/>
-          <w:b/>
-          <w:bCs/>
+          <w:rFonts w:cs="Arial" w:ascii="Arial" w:hAnsi="Arial"/>
+          <w:b/>
+          <w:bCs/>
+          <w:sz w:val="16"/>
         </w:rPr>
         <w:t xml:space="preserve">6.1 </w:t>
       </w:r>
       <w:r>
         <w:rPr>
-          <w:rFonts w:cs="Calibri" w:ascii="Calibri" w:hAnsi="Calibri"/>
+          <w:rFonts w:cs="Arial" w:ascii="Arial" w:hAnsi="Arial"/>
+          <w:sz w:val="16"/>
         </w:rPr>
         <w:t xml:space="preserve">La Segreteria Organizzativa si impegna a conservare una completa ed accurata documentazione relativa ai propri rapporti con lo Sponsor per un periodo di tempo di durata non inferiore a cinque anni. </w:t>
       </w:r>
@@ -2981,30 +3236,34 @@
     <w:p>
       <w:pPr>
         <w:pStyle w:val="Normal"/>
-        <w:jc w:val="both"/>
-        <w:rPr>
-          <w:rFonts w:ascii="Calibri" w:hAnsi="Calibri" w:cs="Calibri"/>
-        </w:rPr>
-      </w:pPr>
-      <w:r>
-        <w:rPr>
-          <w:rFonts w:cs="Calibri" w:ascii="Calibri" w:hAnsi="Calibri"/>
-        </w:rPr>
-      </w:r>
-    </w:p>
-    <w:p>
-      <w:pPr>
-        <w:pStyle w:val="Normal"/>
-        <w:jc w:val="both"/>
-        <w:rPr>
-          <w:rFonts w:ascii="Calibri" w:hAnsi="Calibri" w:cs="Calibri"/>
-        </w:rPr>
-      </w:pPr>
-      <w:r>
-        <w:rPr>
-          <w:rFonts w:cs="Calibri" w:ascii="Calibri" w:hAnsi="Calibri"/>
-          <w:b/>
-          <w:bCs/>
+        <w:spacing w:before="0" w:after="0" w:line="230" w:lineRule="auto"/>
+        <w:jc w:val="both"/>
+        <w:rPr>
+          <w:rFonts w:ascii="Calibri" w:hAnsi="Calibri" w:cs="Calibri"/>
+        </w:rPr>
+      </w:pPr>
+      <w:r>
+        <w:rPr>
+          <w:rFonts w:cs="Arial" w:ascii="Arial" w:hAnsi="Arial"/>
+          <w:sz w:val="16"/>
+        </w:rPr>
+      </w:r>
+    </w:p>
+    <w:p>
+      <w:pPr>
+        <w:pStyle w:val="Normal"/>
+        <w:spacing w:before="0" w:after="0" w:line="230" w:lineRule="auto"/>
+        <w:jc w:val="both"/>
+        <w:rPr>
+          <w:rFonts w:ascii="Calibri" w:hAnsi="Calibri" w:cs="Calibri"/>
+        </w:rPr>
+      </w:pPr>
+      <w:r>
+        <w:rPr>
+          <w:rFonts w:cs="Arial" w:ascii="Arial" w:hAnsi="Arial"/>
+          <w:b/>
+          <w:bCs/>
+          <w:sz w:val="16"/>
         </w:rPr>
         <w:t xml:space="preserve">7. Varie </w:t>
       </w:r>
@@ -3012,22 +3271,25 @@
     <w:p>
       <w:pPr>
         <w:pStyle w:val="Normal"/>
-        <w:jc w:val="both"/>
-        <w:rPr>
-          <w:rFonts w:ascii="Calibri" w:hAnsi="Calibri" w:cs="Calibri"/>
-        </w:rPr>
-      </w:pPr>
-      <w:r>
-        <w:rPr>
-          <w:rFonts w:cs="Calibri" w:ascii="Calibri" w:hAnsi="Calibri"/>
-          <w:b/>
-          <w:bCs/>
+        <w:spacing w:before="0" w:after="0" w:line="230" w:lineRule="auto"/>
+        <w:jc w:val="both"/>
+        <w:rPr>
+          <w:rFonts w:ascii="Calibri" w:hAnsi="Calibri" w:cs="Calibri"/>
+        </w:rPr>
+      </w:pPr>
+      <w:r>
+        <w:rPr>
+          <w:rFonts w:cs="Arial" w:ascii="Arial" w:hAnsi="Arial"/>
+          <w:b/>
+          <w:bCs/>
+          <w:sz w:val="16"/>
         </w:rPr>
         <w:t xml:space="preserve">7.1 </w:t>
       </w:r>
       <w:r>
         <w:rPr>
-          <w:rFonts w:cs="Calibri" w:ascii="Calibri" w:hAnsi="Calibri"/>
+          <w:rFonts w:cs="Arial" w:ascii="Arial" w:hAnsi="Arial"/>
+          <w:sz w:val="16"/>
         </w:rPr>
         <w:t xml:space="preserve">Le premesse e gli Allegati costituiscono parte integrante e sostanziale del presente contratto. </w:t>
       </w:r>
@@ -3035,36 +3297,41 @@
     <w:p>
       <w:pPr>
         <w:pStyle w:val="Normal"/>
-        <w:jc w:val="both"/>
-        <w:rPr>
-          <w:rFonts w:ascii="Calibri" w:hAnsi="Calibri" w:cs="Calibri"/>
-        </w:rPr>
-      </w:pPr>
-      <w:r>
-        <w:rPr>
-          <w:rFonts w:cs="Calibri" w:ascii="Calibri" w:hAnsi="Calibri"/>
-        </w:rPr>
-      </w:r>
-    </w:p>
-    <w:p>
-      <w:pPr>
-        <w:pStyle w:val="Normal"/>
-        <w:jc w:val="both"/>
-        <w:rPr>
-          <w:rFonts w:ascii="Calibri" w:hAnsi="Calibri" w:cs="Calibri"/>
-        </w:rPr>
-      </w:pPr>
-      <w:r>
-        <w:rPr>
-          <w:rFonts w:cs="Calibri" w:ascii="Calibri" w:hAnsi="Calibri"/>
-          <w:b/>
-          <w:bCs/>
+        <w:spacing w:before="0" w:after="0" w:line="230" w:lineRule="auto"/>
+        <w:jc w:val="both"/>
+        <w:rPr>
+          <w:rFonts w:ascii="Calibri" w:hAnsi="Calibri" w:cs="Calibri"/>
+        </w:rPr>
+      </w:pPr>
+      <w:r>
+        <w:rPr>
+          <w:rFonts w:cs="Arial" w:ascii="Arial" w:hAnsi="Arial"/>
+          <w:sz w:val="16"/>
+        </w:rPr>
+      </w:r>
+    </w:p>
+    <w:p>
+      <w:pPr>
+        <w:pStyle w:val="Normal"/>
+        <w:spacing w:before="0" w:after="0" w:line="230" w:lineRule="auto"/>
+        <w:jc w:val="both"/>
+        <w:rPr>
+          <w:rFonts w:ascii="Calibri" w:hAnsi="Calibri" w:cs="Calibri"/>
+        </w:rPr>
+      </w:pPr>
+      <w:r>
+        <w:rPr>
+          <w:rFonts w:cs="Arial" w:ascii="Arial" w:hAnsi="Arial"/>
+          <w:b/>
+          <w:bCs/>
+          <w:sz w:val="16"/>
         </w:rPr>
         <w:t xml:space="preserve">7.2 </w:t>
       </w:r>
       <w:r>
         <w:rPr>
-          <w:rFonts w:cs="Calibri" w:ascii="Calibri" w:hAnsi="Calibri"/>
+          <w:rFonts w:cs="Arial" w:ascii="Arial" w:hAnsi="Arial"/>
+          <w:sz w:val="16"/>
         </w:rPr>
         <w:t xml:space="preserve">Nessuna modifica al presente Contratto sarà efficace se non avverrà per iscritto e non sarà debitamente sottoscritta da tutte le Parti. </w:t>
       </w:r>
@@ -3072,14 +3339,16 @@
     <w:p>
       <w:pPr>
         <w:pStyle w:val="Normal"/>
-        <w:jc w:val="both"/>
-        <w:rPr>
-          <w:rFonts w:ascii="Calibri" w:hAnsi="Calibri" w:cs="Calibri"/>
-        </w:rPr>
-      </w:pPr>
-      <w:r>
-        <w:rPr>
-          <w:rFonts w:cs="Calibri" w:ascii="Calibri" w:hAnsi="Calibri"/>
+        <w:spacing w:before="0" w:after="0" w:line="230" w:lineRule="auto"/>
+        <w:jc w:val="both"/>
+        <w:rPr>
+          <w:rFonts w:ascii="Calibri" w:hAnsi="Calibri" w:cs="Calibri"/>
+        </w:rPr>
+      </w:pPr>
+      <w:r>
+        <w:rPr>
+          <w:rFonts w:cs="Arial" w:ascii="Arial" w:hAnsi="Arial"/>
+          <w:sz w:val="16"/>
         </w:rPr>
         <w:t>Qualsiasi comunicazione fra le Parti avverrà per iscritto e dovrà essere effettuata unicamente ai reciproci indirizzi indicati nella prima parte del presente accordo</w:t>
       </w:r>
@@ -3087,36 +3356,41 @@
     <w:p>
       <w:pPr>
         <w:pStyle w:val="Normal"/>
-        <w:jc w:val="both"/>
-        <w:rPr>
-          <w:rFonts w:ascii="Calibri" w:hAnsi="Calibri" w:cs="Calibri"/>
-        </w:rPr>
-      </w:pPr>
-      <w:r>
-        <w:rPr>
-          <w:rFonts w:cs="Calibri" w:ascii="Calibri" w:hAnsi="Calibri"/>
-        </w:rPr>
-      </w:r>
-    </w:p>
-    <w:p>
-      <w:pPr>
-        <w:pStyle w:val="Normal"/>
-        <w:jc w:val="both"/>
-        <w:rPr>
-          <w:rFonts w:ascii="Calibri" w:hAnsi="Calibri" w:cs="Calibri"/>
-        </w:rPr>
-      </w:pPr>
-      <w:r>
-        <w:rPr>
-          <w:rFonts w:cs="Calibri" w:ascii="Calibri" w:hAnsi="Calibri"/>
-          <w:b/>
-          <w:bCs/>
+        <w:spacing w:before="0" w:after="0" w:line="230" w:lineRule="auto"/>
+        <w:jc w:val="both"/>
+        <w:rPr>
+          <w:rFonts w:ascii="Calibri" w:hAnsi="Calibri" w:cs="Calibri"/>
+        </w:rPr>
+      </w:pPr>
+      <w:r>
+        <w:rPr>
+          <w:rFonts w:cs="Arial" w:ascii="Arial" w:hAnsi="Arial"/>
+          <w:sz w:val="16"/>
+        </w:rPr>
+      </w:r>
+    </w:p>
+    <w:p>
+      <w:pPr>
+        <w:pStyle w:val="Normal"/>
+        <w:spacing w:before="0" w:after="0" w:line="230" w:lineRule="auto"/>
+        <w:jc w:val="both"/>
+        <w:rPr>
+          <w:rFonts w:ascii="Calibri" w:hAnsi="Calibri" w:cs="Calibri"/>
+        </w:rPr>
+      </w:pPr>
+      <w:r>
+        <w:rPr>
+          <w:rFonts w:cs="Arial" w:ascii="Arial" w:hAnsi="Arial"/>
+          <w:b/>
+          <w:bCs/>
+          <w:sz w:val="16"/>
         </w:rPr>
         <w:t xml:space="preserve">7.3 </w:t>
       </w:r>
       <w:r>
         <w:rPr>
-          <w:rFonts w:cs="Calibri" w:ascii="Calibri" w:hAnsi="Calibri"/>
+          <w:rFonts w:cs="Arial" w:ascii="Arial" w:hAnsi="Arial"/>
+          <w:sz w:val="16"/>
         </w:rPr>
         <w:t xml:space="preserve">Per qualsiasi controversia dovesse sorgere in relazione al presente Contratto, la sua interpretazione, esecuzione o risoluzione, sarà competente esclusivamente il Foro di Bologna. </w:t>
       </w:r>
@@ -3124,36 +3398,41 @@
     <w:p>
       <w:pPr>
         <w:pStyle w:val="Normal"/>
-        <w:jc w:val="both"/>
-        <w:rPr>
-          <w:rFonts w:ascii="Calibri" w:hAnsi="Calibri" w:cs="Calibri"/>
-        </w:rPr>
-      </w:pPr>
-      <w:r>
-        <w:rPr>
-          <w:rFonts w:cs="Calibri" w:ascii="Calibri" w:hAnsi="Calibri"/>
-        </w:rPr>
-      </w:r>
-    </w:p>
-    <w:p>
-      <w:pPr>
-        <w:pStyle w:val="Normal"/>
-        <w:jc w:val="both"/>
-        <w:rPr>
-          <w:rFonts w:ascii="Calibri" w:hAnsi="Calibri" w:cs="Calibri"/>
-        </w:rPr>
-      </w:pPr>
-      <w:r>
-        <w:rPr>
-          <w:rFonts w:cs="Calibri" w:ascii="Calibri" w:hAnsi="Calibri"/>
-          <w:b/>
-          <w:bCs/>
+        <w:spacing w:before="0" w:after="0" w:line="230" w:lineRule="auto"/>
+        <w:jc w:val="both"/>
+        <w:rPr>
+          <w:rFonts w:ascii="Calibri" w:hAnsi="Calibri" w:cs="Calibri"/>
+        </w:rPr>
+      </w:pPr>
+      <w:r>
+        <w:rPr>
+          <w:rFonts w:cs="Arial" w:ascii="Arial" w:hAnsi="Arial"/>
+          <w:sz w:val="16"/>
+        </w:rPr>
+      </w:r>
+    </w:p>
+    <w:p>
+      <w:pPr>
+        <w:pStyle w:val="Normal"/>
+        <w:spacing w:before="0" w:after="0" w:line="230" w:lineRule="auto"/>
+        <w:jc w:val="both"/>
+        <w:rPr>
+          <w:rFonts w:ascii="Calibri" w:hAnsi="Calibri" w:cs="Calibri"/>
+        </w:rPr>
+      </w:pPr>
+      <w:r>
+        <w:rPr>
+          <w:rFonts w:cs="Arial" w:ascii="Arial" w:hAnsi="Arial"/>
+          <w:b/>
+          <w:bCs/>
+          <w:sz w:val="16"/>
         </w:rPr>
         <w:t xml:space="preserve">7.4 </w:t>
       </w:r>
       <w:r>
         <w:rPr>
-          <w:rFonts w:cs="Calibri" w:ascii="Calibri" w:hAnsi="Calibri"/>
+          <w:rFonts w:cs="Arial" w:ascii="Arial" w:hAnsi="Arial"/>
+          <w:sz w:val="16"/>
         </w:rPr>
         <w:t>La Segreteria Organizzativa si impegna a non rivelare a terzi e/o utilizzare le informazioni aventi natura confidenziale relative allo Sponsor, intendendosi come tali dati, notizie e informazioni relativi a analisi, prodotti, attività, progetti, tecnologie, know-how, organizzazione, processi industriali e clienti dello Sponsor.</w:t>
       </w:r>
@@ -3161,14 +3440,16 @@
     <w:p>
       <w:pPr>
         <w:pStyle w:val="Normal"/>
-        <w:jc w:val="both"/>
-        <w:rPr>
-          <w:rFonts w:ascii="Calibri" w:hAnsi="Calibri" w:cs="Calibri"/>
-        </w:rPr>
-      </w:pPr>
-      <w:r>
-        <w:rPr>
-          <w:rFonts w:cs="Calibri" w:ascii="Calibri" w:hAnsi="Calibri"/>
+        <w:spacing w:before="0" w:after="0" w:line="230" w:lineRule="auto"/>
+        <w:jc w:val="both"/>
+        <w:rPr>
+          <w:rFonts w:ascii="Calibri" w:hAnsi="Calibri" w:cs="Calibri"/>
+        </w:rPr>
+      </w:pPr>
+      <w:r>
+        <w:rPr>
+          <w:rFonts w:cs="Arial" w:ascii="Arial" w:hAnsi="Arial"/>
+          <w:sz w:val="16"/>
         </w:rPr>
       </w:r>
     </w:p>
@@ -3182,7 +3463,7 @@
           <w:tab w:val="left" w:pos="1765" w:leader="none"/>
         </w:tabs>
         <w:autoSpaceDE w:val="false"/>
-        <w:spacing w:lineRule="auto" w:line="240" w:before="1" w:after="0"/>
+        <w:spacing w:lineRule="auto" w:line="230" w:before="0" w:after="0"/>
         <w:ind w:left="0" w:right="56" w:hanging="0"/>
         <w:contextualSpacing w:val="false"/>
         <w:jc w:val="both"/>
@@ -3190,49 +3471,51 @@
       </w:pPr>
       <w:r>
         <w:rPr>
-          <w:rFonts w:cs="Calibri"/>
+          <w:rFonts w:cs="Arial" w:ascii="Arial" w:hAnsi="Arial"/>
+          <w:b/>
+          <w:bCs/>
+          <w:sz w:val="16"/>
+          <w:szCs w:val="20"/>
+        </w:rPr>
+        <w:t xml:space="preserve">7.4 </w:t>
+      </w:r>
+      <w:r>
+        <w:rPr>
+          <w:rFonts w:cs="Arial" w:ascii="Arial" w:hAnsi="Arial"/>
+          <w:sz w:val="16"/>
+          <w:szCs w:val="20"/>
+        </w:rPr>
+        <w:t xml:space="preserve">Nel caso in cui la Manifestazione, per casi imprevisti o per una ragione di qualsiasi natura eccezionale ed imprevista, non potesse aver luogo, verrà data immediata comunicazione a tutti coloro che già abbiano presentato domanda di ammissione/partecipazione. In tal caso la Segreteria Organizzativa procederà ad una nuova programmazione e sarà facoltà dello Sponsor aderire o richiedere il rimborso di quando versato. Con il rimborso della somma predetta non potrà essere avanzata nei confronti della Segreteria Organizzativa altra richiesta di alcun genere per nessun titolo o causale. Nel caso in cui la Manifestazione dovesse per qualunque motivo subire una anticipata chiusura o una temporanea sospensione, indipendentemente dalla volontà della Segreteria Organizzativa, nessun indennizzo sarà dovuto agli Sponsor per nessun titolo o causale. </w:t>
+      </w:r>
+    </w:p>
+    <w:p>
+      <w:pPr>
+        <w:pStyle w:val="Normal"/>
+        <w:spacing w:before="0" w:after="0" w:line="230" w:lineRule="auto"/>
+        <w:jc w:val="both"/>
+        <w:rPr>
+          <w:rFonts w:ascii="Calibri" w:hAnsi="Calibri" w:cs="Calibri"/>
+          <w:b/>
           <w:b/>
           <w:bCs/>
           <w:sz w:val="20"/>
           <w:szCs w:val="20"/>
         </w:rPr>
-        <w:t xml:space="preserve">7.4 </w:t>
-      </w:r>
-      <w:r>
-        <w:rPr>
-          <w:rFonts w:cs="Calibri"/>
-          <w:sz w:val="20"/>
+      </w:pPr>
+      <w:r>
+        <w:rPr>
+          <w:rFonts w:cs="Arial" w:ascii="Arial" w:hAnsi="Arial"/>
+          <w:b/>
+          <w:bCs/>
+          <w:sz w:val="16"/>
           <w:szCs w:val="20"/>
         </w:rPr>
-        <w:t xml:space="preserve">Nel caso in cui la Manifestazione, per casi imprevisti o per una ragione di qualsiasi natura eccezionale ed imprevista, non potesse aver luogo, verrà data immediata comunicazione a tutti coloro che già abbiano presentato domanda di ammissione/partecipazione. In tal caso la Segreteria Organizzativa procederà ad una nuova programmazione e sarà facoltà dello Sponsor aderire o richiedere il rimborso di quando versato. Con il rimborso della somma predetta non potrà essere avanzata nei confronti della Segreteria Organizzativa altra richiesta di alcun genere per nessun titolo o causale. Nel caso in cui la Manifestazione dovesse per qualunque motivo subire una anticipata chiusura o una temporanea sospensione, indipendentemente dalla volontà della Segreteria Organizzativa, nessun indennizzo sarà dovuto agli Sponsor per nessun titolo o causale. </w:t>
-      </w:r>
-    </w:p>
-    <w:p>
-      <w:pPr>
-        <w:pStyle w:val="Normal"/>
-        <w:jc w:val="both"/>
-        <w:rPr>
-          <w:rFonts w:ascii="Calibri" w:hAnsi="Calibri" w:cs="Calibri"/>
-          <w:b/>
-          <w:b/>
-          <w:bCs/>
-          <w:sz w:val="20"/>
-          <w:szCs w:val="20"/>
-        </w:rPr>
-      </w:pPr>
-      <w:r>
-        <w:rPr>
-          <w:rFonts w:cs="Calibri" w:ascii="Calibri" w:hAnsi="Calibri"/>
-          <w:b/>
-          <w:bCs/>
-          <w:sz w:val="20"/>
-          <w:szCs w:val="20"/>
-        </w:rPr>
-      </w:r>
-    </w:p>
-    <w:p>
-      <w:pPr>
-        <w:pStyle w:val="Normal"/>
+      </w:r>
+    </w:p>
+    <w:p>
+      <w:pPr>
+        <w:pStyle w:val="Normal"/>
+        <w:spacing w:before="0" w:after="0" w:line="230" w:lineRule="auto"/>
         <w:jc w:val="both"/>
         <w:rPr>
           <w:rFonts w:ascii="Calibri" w:hAnsi="Calibri" w:eastAsia="Calibri" w:cs="Calibri"/>
@@ -3240,7 +3523,8 @@
       </w:pPr>
       <w:r>
         <w:rPr>
-          <w:rFonts w:eastAsia="Calibri" w:cs="Calibri" w:ascii="Calibri" w:hAnsi="Calibri"/>
+          <w:rFonts w:eastAsia="Calibri" w:cs="Arial" w:ascii="Arial" w:hAnsi="Arial"/>
+          <w:sz w:val="16"/>
         </w:rPr>
         <w:t xml:space="preserve"> </w:t>
       </w:r>
@@ -3248,14 +3532,16 @@
     <w:p>
       <w:pPr>
         <w:pStyle w:val="Normal"/>
-        <w:jc w:val="both"/>
-        <w:rPr>
-          <w:rFonts w:ascii="Calibri" w:hAnsi="Calibri" w:cs="Calibri"/>
-        </w:rPr>
-      </w:pPr>
-      <w:r>
-        <w:rPr>
-          <w:rFonts w:cs="Calibri" w:ascii="Calibri" w:hAnsi="Calibri"/>
+        <w:spacing w:before="0" w:after="0" w:line="230" w:lineRule="auto"/>
+        <w:jc w:val="both"/>
+        <w:rPr>
+          <w:rFonts w:ascii="Calibri" w:hAnsi="Calibri" w:cs="Calibri"/>
+        </w:rPr>
+      </w:pPr>
+      <w:r>
+        <w:rPr>
+          <w:rFonts w:cs="Arial" w:ascii="Arial" w:hAnsi="Arial"/>
+          <w:sz w:val="16"/>
         </w:rPr>
         <w:t>Bologna,  {{ contract.signed_date|format_date|default('___________', true) }}</w:t>
       </w:r>
@@ -3263,46 +3549,51 @@
     <w:p>
       <w:pPr>
         <w:pStyle w:val="Normal"/>
-        <w:jc w:val="both"/>
-        <w:rPr>
-          <w:rFonts w:ascii="Calibri" w:hAnsi="Calibri" w:cs="Calibri"/>
-          <w:b/>
-          <w:b/>
-          <w:bCs/>
-        </w:rPr>
-      </w:pPr>
-      <w:r>
-        <w:rPr>
-          <w:rFonts w:cs="Calibri" w:ascii="Calibri" w:hAnsi="Calibri"/>
-          <w:b/>
-          <w:bCs/>
-        </w:rPr>
-      </w:r>
-    </w:p>
-    <w:p>
-      <w:pPr>
-        <w:pStyle w:val="Normal"/>
-        <w:jc w:val="both"/>
-        <w:rPr>
-          <w:rFonts w:ascii="Calibri" w:hAnsi="Calibri" w:cs="Calibri"/>
-          <w:b/>
-          <w:b/>
-          <w:bCs/>
-        </w:rPr>
-      </w:pPr>
-      <w:r>
-        <w:rPr>
-          <w:rFonts w:cs="Calibri" w:ascii="Calibri" w:hAnsi="Calibri"/>
-          <w:b/>
-          <w:bCs/>
-        </w:rPr>
-      </w:r>
-    </w:p>
-    <w:p>
-      <w:pPr>
-        <w:pStyle w:val="Normal"/>
+        <w:spacing w:before="0" w:after="0" w:line="230" w:lineRule="auto"/>
+        <w:jc w:val="both"/>
+        <w:rPr>
+          <w:rFonts w:ascii="Calibri" w:hAnsi="Calibri" w:cs="Calibri"/>
+          <w:b/>
+          <w:b/>
+          <w:bCs/>
+        </w:rPr>
+      </w:pPr>
+      <w:r>
+        <w:rPr>
+          <w:rFonts w:cs="Arial" w:ascii="Arial" w:hAnsi="Arial"/>
+          <w:b/>
+          <w:bCs/>
+          <w:sz w:val="16"/>
+        </w:rPr>
+      </w:r>
+    </w:p>
+    <w:p>
+      <w:pPr>
+        <w:pStyle w:val="Normal"/>
+        <w:spacing w:before="0" w:after="0" w:line="230" w:lineRule="auto"/>
+        <w:jc w:val="both"/>
+        <w:rPr>
+          <w:rFonts w:ascii="Calibri" w:hAnsi="Calibri" w:cs="Calibri"/>
+          <w:b/>
+          <w:b/>
+          <w:bCs/>
+        </w:rPr>
+      </w:pPr>
+      <w:r>
+        <w:rPr>
+          <w:rFonts w:cs="Arial" w:ascii="Arial" w:hAnsi="Arial"/>
+          <w:b/>
+          <w:bCs/>
+          <w:sz w:val="16"/>
+        </w:rPr>
+      </w:r>
+    </w:p>
+    <w:p>
+      <w:pPr>
+        <w:pStyle w:val="Normal"/>
+        <w:spacing w:before="0" w:after="0" w:line="230" w:lineRule="auto"/>
         <w:ind w:left="7090" w:firstLine="709"/>
-        <w:jc w:val="both"/>
+        <w:jc w:val="center"/>
         <w:rPr>
           <w:rFonts w:ascii="Calibri" w:hAnsi="Calibri" w:cs="Calibri"/>
           <w:highlight w:val="cyan"/>
@@ -3312,7 +3603,7 @@
         <w:rPr>
           <w:rFonts w:ascii="Arial" w:hAnsi="Arial" w:cs="Arial"/>
           <w:b w:val="0"/>
-          <w:sz w:val="20"/>
+          <w:sz w:val="16"/>
         </w:rPr>
         <w:t>Sponsor</w:t>
       </w:r>
@@ -3320,7 +3611,7 @@
         <w:rPr>
           <w:rFonts w:ascii="Arial" w:hAnsi="Arial" w:cs="Arial"/>
           <w:b w:val="0"/>
-          <w:sz w:val="20"/>
+          <w:sz w:val="16"/>
         </w:rPr>
         <w:br/>
       </w:r>
@@ -3328,7 +3619,7 @@
         <w:rPr>
           <w:rFonts w:ascii="Arial" w:hAnsi="Arial" w:cs="Arial"/>
           <w:b/>
-          <w:sz w:val="20"/>
+          <w:sz w:val="16"/>
         </w:rPr>
         <w:t>{{ sponsor.legal_name }}</w:t>
       </w:r>
@@ -3336,7 +3627,7 @@
         <w:rPr>
           <w:rFonts w:ascii="Arial" w:hAnsi="Arial" w:cs="Arial"/>
           <w:b w:val="0"/>
-          <w:sz w:val="20"/>
+          <w:sz w:val="16"/>
         </w:rPr>
         <w:br/>
       </w:r>
@@ -3344,7 +3635,7 @@
         <w:rPr>
           <w:rFonts w:ascii="Arial" w:hAnsi="Arial" w:cs="Arial"/>
           <w:b/>
-          <w:sz w:val="20"/>
+          <w:sz w:val="16"/>
         </w:rPr>
         <w:t>{% if signer.full_name %}{{ signer.full_name }}</w:t>
         <w:br/>
@@ -3354,7 +3645,7 @@
         <w:rPr>
           <w:rFonts w:ascii="Arial" w:hAnsi="Arial" w:cs="Arial"/>
           <w:b w:val="0"/>
-          <w:sz w:val="20"/>
+          <w:sz w:val="16"/>
         </w:rPr>
         <w:t>_______________________________________</w:t>
       </w:r>
@@ -3362,16 +3653,18 @@
     <w:p>
       <w:pPr>
         <w:pStyle w:val="Normal"/>
-        <w:jc w:val="both"/>
-        <w:rPr>
-          <w:rFonts w:ascii="Calibri" w:hAnsi="Calibri" w:cs="Calibri"/>
-        </w:rPr>
-      </w:pPr>
-      <w:r>
-        <w:rPr>
-          <w:rFonts w:cs="Calibri" w:ascii="Calibri" w:hAnsi="Calibri"/>
-          <w:b/>
-          <w:bCs/>
+        <w:spacing w:before="0" w:after="0" w:line="230" w:lineRule="auto"/>
+        <w:jc w:val="both"/>
+        <w:rPr>
+          <w:rFonts w:ascii="Calibri" w:hAnsi="Calibri" w:cs="Calibri"/>
+        </w:rPr>
+      </w:pPr>
+      <w:r>
+        <w:rPr>
+          <w:rFonts w:cs="Arial" w:ascii="Arial" w:hAnsi="Arial"/>
+          <w:b/>
+          <w:bCs/>
+          <w:sz w:val="16"/>
         </w:rPr>
         <w:t xml:space="preserve">Segreteria Organizzativa: </w:t>
       </w:r>
@@ -3379,14 +3672,16 @@
     <w:p>
       <w:pPr>
         <w:pStyle w:val="Normal"/>
-        <w:jc w:val="both"/>
-        <w:rPr>
-          <w:rFonts w:ascii="Calibri" w:hAnsi="Calibri" w:cs="Calibri"/>
-        </w:rPr>
-      </w:pPr>
-      <w:r>
-        <w:rPr>
-          <w:rFonts w:cs="Calibri" w:ascii="Calibri" w:hAnsi="Calibri"/>
+        <w:spacing w:before="0" w:after="0" w:line="230" w:lineRule="auto"/>
+        <w:jc w:val="both"/>
+        <w:rPr>
+          <w:rFonts w:ascii="Calibri" w:hAnsi="Calibri" w:cs="Calibri"/>
+        </w:rPr>
+      </w:pPr>
+      <w:r>
+        <w:rPr>
+          <w:rFonts w:cs="Arial" w:ascii="Arial" w:hAnsi="Arial"/>
+          <w:sz w:val="16"/>
         </w:rPr>
         <w:t xml:space="preserve">VALET SRL </w:t>
       </w:r>
@@ -3394,12 +3689,17 @@
     <w:p>
       <w:pPr>
         <w:pStyle w:val="Normal"/>
-        <w:jc w:val="both"/>
-        <w:rPr>
-          <w:rFonts w:ascii="Calibri" w:hAnsi="Calibri" w:cs="Calibri"/>
-        </w:rPr>
-      </w:pPr>
-      <w:r>
+        <w:spacing w:before="0" w:after="0" w:line="230" w:lineRule="auto"/>
+        <w:jc w:val="both"/>
+        <w:rPr>
+          <w:rFonts w:ascii="Calibri" w:hAnsi="Calibri" w:cs="Calibri"/>
+        </w:rPr>
+      </w:pPr>
+      <w:r>
+        <w:rPr>
+          <w:rFonts w:ascii="Arial" w:hAnsi="Arial" w:cs="Arial"/>
+          <w:sz w:val="16"/>
+        </w:rPr>
         <w:drawing>
           <wp:anchor behindDoc="1" distT="0" distB="0" distL="114935" distR="114935" simplePos="0" locked="0" layoutInCell="0" allowOverlap="1" relativeHeight="2">
             <wp:simplePos x="0" y="0"/>
@@ -3449,7 +3749,8 @@
       </w:r>
       <w:r>
         <w:rPr>
-          <w:rFonts w:cs="Calibri" w:ascii="Calibri" w:hAnsi="Calibri"/>
+          <w:rFonts w:cs="Arial" w:ascii="Arial" w:hAnsi="Arial"/>
+          <w:sz w:val="16"/>
         </w:rPr>
         <w:t>Il legale Rappresentate</w:t>
       </w:r>
@@ -3457,14 +3758,16 @@
     <w:p>
       <w:pPr>
         <w:pStyle w:val="Normal"/>
-        <w:jc w:val="both"/>
-        <w:rPr>
-          <w:rFonts w:ascii="Calibri" w:hAnsi="Calibri" w:cs="Calibri"/>
-        </w:rPr>
-      </w:pPr>
-      <w:r>
-        <w:rPr>
-          <w:rFonts w:cs="Calibri" w:ascii="Calibri" w:hAnsi="Calibri"/>
+        <w:spacing w:before="0" w:after="0" w:line="230" w:lineRule="auto"/>
+        <w:jc w:val="both"/>
+        <w:rPr>
+          <w:rFonts w:ascii="Calibri" w:hAnsi="Calibri" w:cs="Calibri"/>
+        </w:rPr>
+      </w:pPr>
+      <w:r>
+        <w:rPr>
+          <w:rFonts w:cs="Arial" w:ascii="Arial" w:hAnsi="Arial"/>
+          <w:sz w:val="16"/>
         </w:rPr>
         <w:t>(Daniele Morini)</w:t>
       </w:r>
@@ -3472,14 +3775,16 @@
     <w:p>
       <w:pPr>
         <w:pStyle w:val="Normal"/>
-        <w:jc w:val="both"/>
-        <w:rPr>
-          <w:rFonts w:ascii="Calibri" w:hAnsi="Calibri" w:cs="Calibri"/>
-        </w:rPr>
-      </w:pPr>
-      <w:r>
-        <w:rPr>
-          <w:rFonts w:cs="Calibri" w:ascii="Calibri" w:hAnsi="Calibri"/>
+        <w:spacing w:before="0" w:after="0" w:line="230" w:lineRule="auto"/>
+        <w:jc w:val="both"/>
+        <w:rPr>
+          <w:rFonts w:ascii="Calibri" w:hAnsi="Calibri" w:cs="Calibri"/>
+        </w:rPr>
+      </w:pPr>
+      <w:r>
+        <w:rPr>
+          <w:rFonts w:cs="Arial" w:ascii="Arial" w:hAnsi="Arial"/>
+          <w:sz w:val="16"/>
         </w:rPr>
         <w:t>____________________</w:t>
       </w:r>
@@ -3487,37 +3792,46 @@
     <w:p>
       <w:pPr>
         <w:pStyle w:val="Normal"/>
-        <w:jc w:val="both"/>
-        <w:rPr>
-          <w:rFonts w:ascii="Calibri" w:hAnsi="Calibri" w:cs="Calibri"/>
-        </w:rPr>
-      </w:pPr>
-      <w:r>
-        <w:rPr>
-          <w:rFonts w:cs="Calibri" w:ascii="Calibri" w:hAnsi="Calibri"/>
-        </w:rPr>
-      </w:r>
-    </w:p>
-    <w:p>
-      <w:pPr>
-        <w:pStyle w:val="Normal"/>
-        <w:jc w:val="both"/>
-        <w:rPr>
-          <w:rFonts w:ascii="Calibri" w:hAnsi="Calibri" w:cs="Calibri"/>
-        </w:rPr>
-      </w:pPr>
-      <w:r>
-        <w:rPr>
-          <w:rFonts w:cs="Calibri" w:ascii="Calibri" w:hAnsi="Calibri"/>
-        </w:rPr>
-      </w:r>
-      <w:r>
+        <w:spacing w:before="0" w:after="0" w:line="230" w:lineRule="auto"/>
+        <w:jc w:val="both"/>
+        <w:rPr>
+          <w:rFonts w:ascii="Calibri" w:hAnsi="Calibri" w:cs="Calibri"/>
+        </w:rPr>
+      </w:pPr>
+      <w:r>
+        <w:rPr>
+          <w:rFonts w:cs="Arial" w:ascii="Arial" w:hAnsi="Arial"/>
+          <w:sz w:val="16"/>
+        </w:rPr>
+      </w:r>
+    </w:p>
+    <w:p>
+      <w:pPr>
+        <w:pStyle w:val="Normal"/>
+        <w:spacing w:before="0" w:after="0" w:line="230" w:lineRule="auto"/>
+        <w:jc w:val="both"/>
+        <w:rPr>
+          <w:rFonts w:ascii="Calibri" w:hAnsi="Calibri" w:cs="Calibri"/>
+        </w:rPr>
+      </w:pPr>
+      <w:r>
+        <w:rPr>
+          <w:rFonts w:cs="Arial" w:ascii="Arial" w:hAnsi="Arial"/>
+          <w:sz w:val="16"/>
+        </w:rPr>
+      </w:r>
+      <w:r>
+        <w:rPr>
+          <w:rFonts w:ascii="Arial" w:hAnsi="Arial" w:cs="Arial"/>
+          <w:sz w:val="16"/>
+        </w:rPr>
         <w:br w:type="page"/>
       </w:r>
     </w:p>
     <w:p>
       <w:pPr>
         <w:pStyle w:val="Normal"/>
+        <w:spacing w:before="0" w:after="0" w:line="230" w:lineRule="auto"/>
         <w:jc w:val="center"/>
         <w:rPr>
           <w:rFonts w:ascii="Calibri" w:hAnsi="Calibri" w:cs="Calibri"/>
@@ -3528,44 +3842,17 @@
       </w:pPr>
       <w:r>
         <w:rPr>
-          <w:rFonts w:ascii="Arial" w:hAnsi="Arial" w:cs="Arial"/>
-          <w:b/>
-          <w:sz w:val="24"/>
-        </w:rPr>
-        <w:t>ALLEGATO 1 – DOMANDA DI AMMISSIONE</w:t>
-      </w:r>
-      <w:r>
-        <w:rPr>
-          <w:rFonts w:ascii="Arial" w:hAnsi="Arial" w:cs="Arial"/>
-          <w:b w:val="0"/>
-          <w:sz w:val="20"/>
-        </w:rPr>
-        <w:br/>
-        <w:t>Il presente allegato è parte integrante dell’accordo. Segue la domanda di ammissione.</w:t>
-      </w:r>
-    </w:p>
-    <w:p>
-      <w:pPr>
-        <w:pStyle w:val="Normal"/>
-        <w:jc w:val="center"/>
-        <w:rPr>
-          <w:rFonts w:ascii="Calibri" w:hAnsi="Calibri" w:cs="Calibri"/>
-          <w:b/>
-          <w:b/>
-          <w:bCs/>
-        </w:rPr>
-      </w:pPr>
-      <w:r>
-        <w:rPr>
-          <w:rFonts w:cs="Calibri" w:ascii="Calibri" w:hAnsi="Calibri"/>
-          <w:b/>
-          <w:bCs/>
-        </w:rPr>
-      </w:r>
-    </w:p>
-    <w:p>
-      <w:pPr>
-        <w:pStyle w:val="Normal"/>
+          <w:rFonts w:cs="Arial" w:ascii="Arial" w:hAnsi="Arial"/>
+          <w:b/>
+          <w:bCs/>
+          <w:sz w:val="16"/>
+        </w:rPr>
+      </w:r>
+    </w:p>
+    <w:p>
+      <w:pPr>
+        <w:pStyle w:val="Normal"/>
+        <w:spacing w:before="0" w:after="0" w:line="230" w:lineRule="auto"/>
         <w:jc w:val="center"/>
         <w:rPr>
           <w:rFonts w:ascii="Calibri" w:hAnsi="Calibri" w:cs="Calibri"/>
@@ -3578,10 +3865,11 @@
       </w:pPr>
       <w:r>
         <w:rPr>
-          <w:rFonts w:cs="Calibri" w:ascii="Calibri" w:hAnsi="Calibri"/>
+          <w:rFonts w:cs="Arial" w:ascii="Arial" w:hAnsi="Arial"/>
           <w:b/>
           <w:bCs/>
           <w:i/>
+          <w:sz w:val="16"/>
         </w:rPr>
       </w:r>
     </w:p>
@@ -3590,7 +3878,7 @@
       <w:footerReference w:type="default" r:id="rId4"/>
       <w:type w:val="nextPage"/>
       <w:pgSz w:w="11906" w:h="16838"/>
-      <w:pgMar w:left="1134" w:right="1134" w:gutter="0" w:header="426" w:top="482" w:footer="468" w:bottom="1418"/>
+      <w:pgMar w:left="850" w:right="850" w:gutter="0" w:header="426" w:top="567" w:footer="468" w:bottom="510"/>
       <w:pgNumType w:fmt="decimal"/>
       <w:formProt w:val="false"/>
       <w:textDirection w:val="lrTb"/>

</xml_diff>

<commit_message>
Preventivo 1 pagina + sconto prominente (fix bug is_included che nascondeva sempre lo sconto); domanda TERMINI heading sinistra + testo normale; contratto senza pagina bianca (3+1) e 1.6 a sinistra
</commit_message>
<xml_diff>
--- a/contracts/templates_pdf/template_contratto_sponsor_non_ecm_it.docx
+++ b/contracts/templates_pdf/template_contratto_sponsor_non_ecm_it.docx
@@ -2573,7 +2573,7 @@
           <w:tab w:val="left" w:pos="284" w:leader="none"/>
         </w:tabs>
         <w:spacing w:before="0" w:after="0" w:line="230" w:lineRule="auto"/>
-        <w:jc w:val="both"/>
+        <w:jc w:val="left"/>
         <w:rPr/>
       </w:pPr>
       <w:r>
@@ -3787,90 +3787,6 @@
           <w:sz w:val="16"/>
         </w:rPr>
         <w:t>____________________</w:t>
-      </w:r>
-    </w:p>
-    <w:p>
-      <w:pPr>
-        <w:pStyle w:val="Normal"/>
-        <w:spacing w:before="0" w:after="0" w:line="230" w:lineRule="auto"/>
-        <w:jc w:val="both"/>
-        <w:rPr>
-          <w:rFonts w:ascii="Calibri" w:hAnsi="Calibri" w:cs="Calibri"/>
-        </w:rPr>
-      </w:pPr>
-      <w:r>
-        <w:rPr>
-          <w:rFonts w:cs="Arial" w:ascii="Arial" w:hAnsi="Arial"/>
-          <w:sz w:val="16"/>
-        </w:rPr>
-      </w:r>
-    </w:p>
-    <w:p>
-      <w:pPr>
-        <w:pStyle w:val="Normal"/>
-        <w:spacing w:before="0" w:after="0" w:line="230" w:lineRule="auto"/>
-        <w:jc w:val="both"/>
-        <w:rPr>
-          <w:rFonts w:ascii="Calibri" w:hAnsi="Calibri" w:cs="Calibri"/>
-        </w:rPr>
-      </w:pPr>
-      <w:r>
-        <w:rPr>
-          <w:rFonts w:cs="Arial" w:ascii="Arial" w:hAnsi="Arial"/>
-          <w:sz w:val="16"/>
-        </w:rPr>
-      </w:r>
-      <w:r>
-        <w:rPr>
-          <w:rFonts w:ascii="Arial" w:hAnsi="Arial" w:cs="Arial"/>
-          <w:sz w:val="16"/>
-        </w:rPr>
-        <w:br w:type="page"/>
-      </w:r>
-    </w:p>
-    <w:p>
-      <w:pPr>
-        <w:pStyle w:val="Normal"/>
-        <w:spacing w:before="0" w:after="0" w:line="230" w:lineRule="auto"/>
-        <w:jc w:val="center"/>
-        <w:rPr>
-          <w:rFonts w:ascii="Calibri" w:hAnsi="Calibri" w:cs="Calibri"/>
-          <w:b/>
-          <w:b/>
-          <w:bCs/>
-        </w:rPr>
-      </w:pPr>
-      <w:r>
-        <w:rPr>
-          <w:rFonts w:cs="Arial" w:ascii="Arial" w:hAnsi="Arial"/>
-          <w:b/>
-          <w:bCs/>
-          <w:sz w:val="16"/>
-        </w:rPr>
-      </w:r>
-    </w:p>
-    <w:p>
-      <w:pPr>
-        <w:pStyle w:val="Normal"/>
-        <w:spacing w:before="0" w:after="0" w:line="230" w:lineRule="auto"/>
-        <w:jc w:val="center"/>
-        <w:rPr>
-          <w:rFonts w:ascii="Calibri" w:hAnsi="Calibri" w:cs="Calibri"/>
-          <w:b/>
-          <w:b/>
-          <w:bCs/>
-          <w:i/>
-          <w:i/>
-        </w:rPr>
-      </w:pPr>
-      <w:r>
-        <w:rPr>
-          <w:rFonts w:cs="Arial" w:ascii="Arial" w:hAnsi="Arial"/>
-          <w:b/>
-          <w:bCs/>
-          <w:i/>
-          <w:sz w:val="16"/>
-        </w:rPr>
       </w:r>
     </w:p>
     <w:sectPr>

</xml_diff>

<commit_message>
Conferma preventivo: genera subito il contratto sponsor (visibile senza refresh); domanda-allegato nascosta al cliente; contratto font 8->9pt (resta 4 pagine)
</commit_message>
<xml_diff>
--- a/contracts/templates_pdf/template_contratto_sponsor_non_ecm_it.docx
+++ b/contracts/templates_pdf/template_contratto_sponsor_non_ecm_it.docx
@@ -16,7 +16,7 @@
           <w:rFonts w:cs="Arial" w:ascii="Arial" w:hAnsi="Arial"/>
           <w:b/>
           <w:bCs/>
-          <w:sz w:val="16"/>
+          <w:sz w:val="18"/>
         </w:rPr>
         <w:t>CONTRATTO DI SPONSORIZZAZIONE Evento non ECM</w:t>
       </w:r>
@@ -35,7 +35,7 @@
           <w:rFonts w:cs="Arial" w:ascii="Arial" w:hAnsi="Arial"/>
           <w:b/>
           <w:bCs/>
-          <w:sz w:val="16"/>
+          <w:sz w:val="18"/>
         </w:rPr>
         <w:t>tra</w:t>
       </w:r>
@@ -59,7 +59,7 @@
       <w:r>
         <w:rPr>
           <w:rFonts w:cs="Arial" w:ascii="Arial" w:hAnsi="Arial"/>
-          <w:sz w:val="16"/>
+          <w:sz w:val="18"/>
         </w:rPr>
         <w:t>La</w:t>
       </w:r>
@@ -67,14 +67,14 @@
         <w:rPr>
           <w:rFonts w:cs="Arial" w:ascii="Arial" w:hAnsi="Arial"/>
           <w:spacing w:val="25"/>
-          <w:sz w:val="16"/>
+          <w:sz w:val="18"/>
         </w:rPr>
         <w:t xml:space="preserve"> </w:t>
       </w:r>
       <w:r>
         <w:rPr>
           <w:rFonts w:cs="Arial" w:ascii="Arial" w:hAnsi="Arial"/>
-          <w:sz w:val="16"/>
+          <w:sz w:val="18"/>
         </w:rPr>
         <w:t>Società VALET SRL, con sede legale in Bologna,</w:t>
       </w:r>
@@ -82,14 +82,14 @@
         <w:rPr>
           <w:rFonts w:cs="Arial" w:ascii="Arial" w:hAnsi="Arial"/>
           <w:spacing w:val="26"/>
-          <w:sz w:val="16"/>
+          <w:sz w:val="18"/>
         </w:rPr>
         <w:t xml:space="preserve"> </w:t>
       </w:r>
       <w:r>
         <w:rPr>
           <w:rFonts w:cs="Arial" w:ascii="Arial" w:hAnsi="Arial"/>
-          <w:sz w:val="16"/>
+          <w:sz w:val="18"/>
         </w:rPr>
         <w:t>CAP 40129, prov.</w:t>
       </w:r>
@@ -97,14 +97,14 @@
         <w:rPr>
           <w:rFonts w:cs="Arial" w:ascii="Arial" w:hAnsi="Arial"/>
           <w:spacing w:val="48"/>
-          <w:sz w:val="16"/>
+          <w:sz w:val="18"/>
         </w:rPr>
         <w:t xml:space="preserve"> </w:t>
       </w:r>
       <w:r>
         <w:rPr>
           <w:rFonts w:cs="Arial" w:ascii="Arial" w:hAnsi="Arial"/>
-          <w:sz w:val="16"/>
+          <w:sz w:val="18"/>
         </w:rPr>
         <w:t xml:space="preserve">di </w:t>
       </w:r>
@@ -112,7 +112,7 @@
         <w:rPr>
           <w:rFonts w:cs="Arial" w:ascii="Arial" w:hAnsi="Arial"/>
           <w:w w:val="99"/>
-          <w:sz w:val="16"/>
+          <w:sz w:val="18"/>
         </w:rPr>
         <w:t>Bologna</w:t>
       </w:r>
@@ -120,14 +120,14 @@
         <w:rPr>
           <w:rFonts w:cs="Arial" w:ascii="Arial" w:hAnsi="Arial"/>
           <w:spacing w:val="-25"/>
-          <w:sz w:val="16"/>
+          <w:sz w:val="18"/>
         </w:rPr>
         <w:t xml:space="preserve"> </w:t>
       </w:r>
       <w:r>
         <w:rPr>
           <w:rFonts w:cs="Arial" w:ascii="Arial" w:hAnsi="Arial"/>
-          <w:sz w:val="16"/>
+          <w:sz w:val="18"/>
         </w:rPr>
         <w:t>,</w:t>
       </w:r>
@@ -135,14 +135,14 @@
         <w:rPr>
           <w:rFonts w:cs="Arial" w:ascii="Arial" w:hAnsi="Arial"/>
           <w:spacing w:val="16"/>
-          <w:sz w:val="16"/>
+          <w:sz w:val="18"/>
         </w:rPr>
         <w:t xml:space="preserve"> </w:t>
       </w:r>
       <w:r>
         <w:rPr>
           <w:rFonts w:cs="Arial" w:ascii="Arial" w:hAnsi="Arial"/>
-          <w:sz w:val="16"/>
+          <w:sz w:val="18"/>
         </w:rPr>
         <w:t>via Dei Fornaciai, n.29/B, Partita</w:t>
       </w:r>
@@ -150,14 +150,14 @@
         <w:rPr>
           <w:rFonts w:cs="Arial" w:ascii="Arial" w:hAnsi="Arial"/>
           <w:spacing w:val="18"/>
-          <w:sz w:val="16"/>
+          <w:sz w:val="18"/>
         </w:rPr>
         <w:t xml:space="preserve"> </w:t>
       </w:r>
       <w:r>
         <w:rPr>
           <w:rFonts w:cs="Arial" w:ascii="Arial" w:hAnsi="Arial"/>
-          <w:sz w:val="16"/>
+          <w:sz w:val="18"/>
         </w:rPr>
         <w:t>IVA</w:t>
       </w:r>
@@ -165,14 +165,14 @@
         <w:rPr>
           <w:rFonts w:cs="Arial" w:ascii="Arial" w:hAnsi="Arial"/>
           <w:spacing w:val="-15"/>
-          <w:sz w:val="16"/>
+          <w:sz w:val="18"/>
         </w:rPr>
         <w:t xml:space="preserve"> e  </w:t>
       </w:r>
       <w:r>
         <w:rPr>
           <w:rFonts w:cs="Arial" w:ascii="Arial" w:hAnsi="Arial"/>
-          <w:sz w:val="16"/>
+          <w:sz w:val="18"/>
         </w:rPr>
         <w:t>Codice Fiscale: 02107230373, iscritta al Registro delle Imprese</w:t>
       </w:r>
@@ -180,14 +180,14 @@
         <w:rPr>
           <w:rFonts w:cs="Arial" w:ascii="Arial" w:hAnsi="Arial"/>
           <w:spacing w:val="18"/>
-          <w:sz w:val="16"/>
+          <w:sz w:val="18"/>
         </w:rPr>
         <w:t xml:space="preserve"> </w:t>
       </w:r>
       <w:r>
         <w:rPr>
           <w:rFonts w:cs="Arial" w:ascii="Arial" w:hAnsi="Arial"/>
-          <w:sz w:val="16"/>
+          <w:sz w:val="18"/>
         </w:rPr>
         <w:t xml:space="preserve">di Bologna al </w:t>
       </w:r>
@@ -195,21 +195,21 @@
         <w:rPr>
           <w:rFonts w:cs="Arial" w:ascii="Arial" w:hAnsi="Arial"/>
           <w:spacing w:val="-16"/>
-          <w:sz w:val="16"/>
+          <w:sz w:val="18"/>
         </w:rPr>
         <w:t xml:space="preserve">n. 27958 | </w:t>
       </w:r>
       <w:r>
         <w:rPr>
           <w:rFonts w:cs="Arial" w:ascii="Arial" w:hAnsi="Arial"/>
-          <w:sz w:val="16"/>
+          <w:sz w:val="18"/>
         </w:rPr>
         <w:t>REA</w:t>
       </w:r>
       <w:r>
         <w:rPr>
           <w:rFonts w:cs="Arial" w:ascii="Arial" w:hAnsi="Arial"/>
-          <w:sz w:val="16"/>
+          <w:sz w:val="18"/>
           <w:u w:val="single"/>
         </w:rPr>
         <w:t xml:space="preserve"> </w:t>
@@ -217,7 +217,7 @@
       <w:r>
         <w:rPr>
           <w:rFonts w:cs="Arial" w:ascii="Arial" w:hAnsi="Arial"/>
-          <w:sz w:val="16"/>
+          <w:sz w:val="18"/>
         </w:rPr>
         <w:t>BO252016, nella persona del suo Rappresentante Legale in carica Sig. Daniele Morini,</w:t>
       </w:r>
@@ -225,14 +225,14 @@
         <w:rPr>
           <w:rFonts w:cs="Arial" w:ascii="Arial" w:hAnsi="Arial"/>
           <w:spacing w:val="4"/>
-          <w:sz w:val="16"/>
+          <w:sz w:val="18"/>
         </w:rPr>
         <w:t xml:space="preserve"> </w:t>
       </w:r>
       <w:r>
         <w:rPr>
           <w:rFonts w:cs="Arial" w:ascii="Arial" w:hAnsi="Arial"/>
-          <w:sz w:val="16"/>
+          <w:sz w:val="18"/>
         </w:rPr>
         <w:t>nato</w:t>
       </w:r>
@@ -240,14 +240,14 @@
         <w:rPr>
           <w:rFonts w:cs="Arial" w:ascii="Arial" w:hAnsi="Arial"/>
           <w:spacing w:val="8"/>
-          <w:sz w:val="16"/>
+          <w:sz w:val="18"/>
         </w:rPr>
         <w:t xml:space="preserve"> </w:t>
       </w:r>
       <w:r>
         <w:rPr>
           <w:rFonts w:cs="Arial" w:ascii="Arial" w:hAnsi="Arial"/>
-          <w:sz w:val="16"/>
+          <w:sz w:val="18"/>
         </w:rPr>
         <w:t>il 23/07/1965,</w:t>
       </w:r>
@@ -255,14 +255,14 @@
         <w:rPr>
           <w:rFonts w:cs="Arial" w:ascii="Arial" w:hAnsi="Arial"/>
           <w:spacing w:val="7"/>
-          <w:sz w:val="16"/>
+          <w:sz w:val="18"/>
         </w:rPr>
         <w:t xml:space="preserve"> </w:t>
       </w:r>
       <w:r>
         <w:rPr>
           <w:rFonts w:cs="Arial" w:ascii="Arial" w:hAnsi="Arial"/>
-          <w:sz w:val="16"/>
+          <w:sz w:val="18"/>
         </w:rPr>
         <w:t>a Castel San Pietro Terme, (BO)</w:t>
       </w:r>
@@ -270,14 +270,14 @@
         <w:rPr>
           <w:rFonts w:cs="Arial" w:ascii="Arial" w:hAnsi="Arial"/>
           <w:spacing w:val="-1"/>
-          <w:sz w:val="16"/>
+          <w:sz w:val="18"/>
         </w:rPr>
         <w:t xml:space="preserve"> </w:t>
       </w:r>
       <w:r>
         <w:rPr>
           <w:rFonts w:cs="Arial" w:ascii="Arial" w:hAnsi="Arial"/>
-          <w:sz w:val="16"/>
+          <w:sz w:val="18"/>
         </w:rPr>
         <w:t>residente</w:t>
       </w:r>
@@ -285,14 +285,14 @@
         <w:rPr>
           <w:rFonts w:cs="Arial" w:ascii="Arial" w:hAnsi="Arial"/>
           <w:spacing w:val="-1"/>
-          <w:sz w:val="16"/>
+          <w:sz w:val="18"/>
         </w:rPr>
         <w:t xml:space="preserve"> </w:t>
       </w:r>
       <w:r>
         <w:rPr>
           <w:rFonts w:cs="Arial" w:ascii="Arial" w:hAnsi="Arial"/>
-          <w:sz w:val="16"/>
+          <w:sz w:val="18"/>
         </w:rPr>
         <w:t>in Pianoro (BO),</w:t>
       </w:r>
@@ -300,14 +300,14 @@
         <w:rPr>
           <w:rFonts w:cs="Arial" w:ascii="Arial" w:hAnsi="Arial"/>
           <w:spacing w:val="-2"/>
-          <w:sz w:val="16"/>
+          <w:sz w:val="18"/>
         </w:rPr>
         <w:t xml:space="preserve"> CAP</w:t>
       </w:r>
       <w:r>
         <w:rPr>
           <w:rFonts w:cs="Arial" w:ascii="Arial" w:hAnsi="Arial"/>
-          <w:sz w:val="16"/>
+          <w:sz w:val="18"/>
         </w:rPr>
         <w:t xml:space="preserve"> 40065, via Marzabotto, n</w:t>
       </w:r>
@@ -315,14 +315,14 @@
         <w:rPr>
           <w:rFonts w:cs="Arial" w:ascii="Arial" w:hAnsi="Arial"/>
           <w:spacing w:val="49"/>
-          <w:sz w:val="16"/>
+          <w:sz w:val="18"/>
         </w:rPr>
         <w:t xml:space="preserve">21 </w:t>
       </w:r>
       <w:r>
         <w:rPr>
           <w:rFonts w:cs="Arial" w:ascii="Arial" w:hAnsi="Arial"/>
-          <w:sz w:val="16"/>
+          <w:sz w:val="18"/>
         </w:rPr>
         <w:t>Carta</w:t>
       </w:r>
@@ -330,14 +330,14 @@
         <w:rPr>
           <w:rFonts w:cs="Arial" w:ascii="Arial" w:hAnsi="Arial"/>
           <w:spacing w:val="40"/>
-          <w:sz w:val="16"/>
+          <w:sz w:val="18"/>
         </w:rPr>
         <w:t xml:space="preserve"> </w:t>
       </w:r>
       <w:r>
         <w:rPr>
           <w:rFonts w:cs="Arial" w:ascii="Arial" w:hAnsi="Arial"/>
-          <w:sz w:val="16"/>
+          <w:sz w:val="18"/>
         </w:rPr>
         <w:t>d’Identità</w:t>
       </w:r>
@@ -345,14 +345,14 @@
         <w:rPr>
           <w:rFonts w:cs="Arial" w:ascii="Arial" w:hAnsi="Arial"/>
           <w:spacing w:val="38"/>
-          <w:sz w:val="16"/>
+          <w:sz w:val="18"/>
         </w:rPr>
         <w:t xml:space="preserve"> </w:t>
       </w:r>
       <w:r>
         <w:rPr>
           <w:rFonts w:cs="Arial" w:ascii="Arial" w:hAnsi="Arial"/>
-          <w:sz w:val="16"/>
+          <w:sz w:val="18"/>
         </w:rPr>
         <w:t>n. CA36209QA,</w:t>
       </w:r>
@@ -360,14 +360,14 @@
         <w:rPr>
           <w:rFonts w:cs="Arial" w:ascii="Arial" w:hAnsi="Arial"/>
           <w:spacing w:val="38"/>
-          <w:sz w:val="16"/>
+          <w:sz w:val="18"/>
         </w:rPr>
         <w:t xml:space="preserve"> </w:t>
       </w:r>
       <w:r>
         <w:rPr>
           <w:rFonts w:cs="Arial" w:ascii="Arial" w:hAnsi="Arial"/>
-          <w:sz w:val="16"/>
+          <w:sz w:val="18"/>
         </w:rPr>
         <w:t>Codice</w:t>
       </w:r>
@@ -375,14 +375,14 @@
         <w:rPr>
           <w:rFonts w:cs="Arial" w:ascii="Arial" w:hAnsi="Arial"/>
           <w:spacing w:val="36"/>
-          <w:sz w:val="16"/>
+          <w:sz w:val="18"/>
         </w:rPr>
         <w:t xml:space="preserve"> </w:t>
       </w:r>
       <w:r>
         <w:rPr>
           <w:rFonts w:cs="Arial" w:ascii="Arial" w:hAnsi="Arial"/>
-          <w:sz w:val="16"/>
+          <w:sz w:val="18"/>
         </w:rPr>
         <w:t>Fiscale: MRN DNL 65L23 C265S occorrenti poteri (denominata di seguito come “</w:t>
       </w:r>
@@ -391,14 +391,14 @@
           <w:rFonts w:cs="Arial" w:ascii="Arial" w:hAnsi="Arial"/>
           <w:b/>
           <w:bCs/>
-          <w:sz w:val="16"/>
+          <w:sz w:val="18"/>
         </w:rPr>
         <w:t>Segreteria Organizzativa</w:t>
       </w:r>
       <w:r>
         <w:rPr>
           <w:rFonts w:cs="Arial" w:ascii="Arial" w:hAnsi="Arial"/>
-          <w:sz w:val="16"/>
+          <w:sz w:val="18"/>
         </w:rPr>
         <w:t xml:space="preserve">”, </w:t>
       </w:r>
@@ -406,14 +406,14 @@
         <w:rPr>
           <w:rFonts w:cs="Arial" w:ascii="Arial" w:hAnsi="Arial"/>
           <w:spacing w:val="-14"/>
-          <w:sz w:val="16"/>
+          <w:sz w:val="18"/>
         </w:rPr>
         <w:t xml:space="preserve"> </w:t>
       </w:r>
       <w:r>
         <w:rPr>
           <w:rFonts w:cs="Arial" w:ascii="Arial" w:hAnsi="Arial"/>
-          <w:sz w:val="16"/>
+          <w:sz w:val="18"/>
         </w:rPr>
         <w:t>pec valet@pec.it</w:t>
       </w:r>
@@ -437,7 +437,7 @@
           <w:rFonts w:cs="Arial" w:ascii="Arial" w:hAnsi="Arial"/>
           <w:b/>
           <w:bCs/>
-          <w:sz w:val="16"/>
+          <w:sz w:val="18"/>
         </w:rPr>
         <w:t>e</w:t>
       </w:r>
@@ -494,7 +494,7 @@
             <w:r>
               <w:rPr>
                 <w:rFonts w:cs="Arial" w:ascii="Arial" w:hAnsi="Arial"/>
-                <w:sz w:val="16"/>
+                <w:sz w:val="18"/>
               </w:rPr>
               <w:t xml:space="preserve">la </w:t>
             </w:r>
@@ -502,14 +502,14 @@
               <w:rPr>
                 <w:rFonts w:cs="Arial" w:ascii="Arial" w:hAnsi="Arial"/>
                 <w:spacing w:val="25"/>
-                <w:sz w:val="16"/>
+                <w:sz w:val="18"/>
               </w:rPr>
               <w:t xml:space="preserve"> </w:t>
             </w:r>
             <w:r>
               <w:rPr>
                 <w:rFonts w:cs="Arial" w:ascii="Arial" w:hAnsi="Arial"/>
-                <w:sz w:val="16"/>
+                <w:sz w:val="18"/>
               </w:rPr>
               <w:t>Società</w:t>
             </w:r>
@@ -538,7 +538,7 @@
             <w:r>
               <w:rPr>
                 <w:rFonts w:cs="Arial" w:ascii="Arial" w:hAnsi="Arial"/>
-                <w:sz w:val="16"/>
+                <w:sz w:val="18"/>
               </w:rPr>
               <w:t>{{ sponsor.legal_name }}</w:t>
             </w:r>
@@ -569,7 +569,7 @@
             <w:r>
               <w:rPr>
                 <w:rFonts w:cs="Arial" w:ascii="Arial" w:hAnsi="Arial"/>
-                <w:sz w:val="16"/>
+                <w:sz w:val="18"/>
               </w:rPr>
               <w:t xml:space="preserve">con   sede  legale </w:t>
             </w:r>
@@ -577,14 +577,14 @@
               <w:rPr>
                 <w:rFonts w:cs="Arial" w:ascii="Arial" w:hAnsi="Arial"/>
                 <w:spacing w:val="25"/>
-                <w:sz w:val="16"/>
+                <w:sz w:val="18"/>
               </w:rPr>
               <w:t xml:space="preserve"> </w:t>
             </w:r>
             <w:r>
               <w:rPr>
                 <w:rFonts w:cs="Arial" w:ascii="Arial" w:hAnsi="Arial"/>
-                <w:sz w:val="16"/>
+                <w:sz w:val="18"/>
               </w:rPr>
               <w:t>in</w:t>
             </w:r>
@@ -613,7 +613,7 @@
             <w:r>
               <w:rPr>
                 <w:rFonts w:cs="Arial" w:ascii="Arial" w:hAnsi="Arial"/>
-                <w:sz w:val="16"/>
+                <w:sz w:val="18"/>
               </w:rPr>
               <w:t>{{ sponsor.billing_city }}</w:t>
             </w:r>
@@ -646,7 +646,7 @@
             <w:r>
               <w:rPr>
                 <w:rFonts w:cs="Arial" w:ascii="Arial" w:hAnsi="Arial"/>
-                <w:sz w:val="16"/>
+                <w:sz w:val="18"/>
               </w:rPr>
               <w:t>Indirizzo e num. civico</w:t>
             </w:r>
@@ -675,7 +675,7 @@
             <w:r>
               <w:rPr>
                 <w:rFonts w:cs="Arial" w:ascii="Arial" w:hAnsi="Arial"/>
-                <w:sz w:val="16"/>
+                <w:sz w:val="18"/>
               </w:rPr>
               <w:t>{{ sponsor.billing_street }} {{ sponsor.billing_street_number }}</w:t>
             </w:r>
@@ -707,7 +707,7 @@
             <w:r>
               <w:rPr>
                 <w:rFonts w:cs="Arial" w:ascii="Arial" w:hAnsi="Arial"/>
-                <w:sz w:val="16"/>
+                <w:sz w:val="18"/>
               </w:rPr>
               <w:t>CAP</w:t>
             </w:r>
@@ -736,7 +736,7 @@
             <w:r>
               <w:rPr>
                 <w:rFonts w:cs="Arial" w:ascii="Arial" w:hAnsi="Arial"/>
-                <w:sz w:val="16"/>
+                <w:sz w:val="18"/>
               </w:rPr>
               <w:t>{{ sponsor.billing_zip }}</w:t>
             </w:r>
@@ -766,7 +766,7 @@
             <w:r>
               <w:rPr>
                 <w:rFonts w:cs="Arial" w:ascii="Arial" w:hAnsi="Arial"/>
-                <w:sz w:val="16"/>
+                <w:sz w:val="18"/>
               </w:rPr>
               <w:t>Prov.</w:t>
             </w:r>
@@ -797,7 +797,7 @@
             <w:r>
               <w:rPr>
                 <w:rFonts w:cs="Arial" w:ascii="Arial" w:hAnsi="Arial"/>
-                <w:sz w:val="16"/>
+                <w:sz w:val="18"/>
                 <w:szCs w:val="18"/>
               </w:rPr>
               <w:t>{{ sponsor.billing_province }}</w:t>
@@ -827,7 +827,7 @@
             <w:r>
               <w:rPr>
                 <w:rFonts w:cs="Arial" w:ascii="Arial" w:hAnsi="Arial"/>
-                <w:sz w:val="16"/>
+                <w:sz w:val="18"/>
               </w:rPr>
               <w:t>P. IVA</w:t>
             </w:r>
@@ -856,7 +856,7 @@
             <w:r>
               <w:rPr>
                 <w:rFonts w:cs="Arial" w:ascii="Arial" w:hAnsi="Arial"/>
-                <w:sz w:val="16"/>
+                <w:sz w:val="18"/>
               </w:rPr>
               <w:t>{{ sponsor.vat_number }}</w:t>
             </w:r>
@@ -885,7 +885,7 @@
             <w:r>
               <w:rPr>
                 <w:rFonts w:cs="Arial" w:ascii="Arial" w:hAnsi="Arial"/>
-                <w:sz w:val="16"/>
+                <w:sz w:val="18"/>
               </w:rPr>
               <w:t>C.F.</w:t>
             </w:r>
@@ -914,7 +914,7 @@
             <w:r>
               <w:rPr>
                 <w:rFonts w:cs="Arial" w:ascii="Arial" w:hAnsi="Arial"/>
-                <w:sz w:val="16"/>
+                <w:sz w:val="18"/>
               </w:rPr>
               <w:t>{{ sponsor.tax_code }}</w:t>
             </w:r>
@@ -947,7 +947,7 @@
             <w:r>
               <w:rPr>
                 <w:rFonts w:cs="Arial" w:ascii="Arial" w:hAnsi="Arial"/>
-                <w:sz w:val="16"/>
+                <w:sz w:val="18"/>
               </w:rPr>
               <w:t xml:space="preserve">Indirizzo email </w:t>
             </w:r>
@@ -976,7 +976,7 @@
             <w:r>
               <w:rPr>
                 <w:rFonts w:cs="Arial" w:ascii="Arial" w:hAnsi="Arial"/>
-                <w:sz w:val="16"/>
+                <w:sz w:val="18"/>
               </w:rPr>
               <w:t>{{ operational_email }}</w:t>
             </w:r>
@@ -1006,7 +1006,7 @@
             <w:r>
               <w:rPr>
                 <w:rFonts w:cs="Arial" w:ascii="Arial" w:hAnsi="Arial"/>
-                <w:sz w:val="16"/>
+                <w:sz w:val="18"/>
               </w:rPr>
               <w:t>PEC</w:t>
             </w:r>
@@ -1035,7 +1035,7 @@
             <w:r>
               <w:rPr>
                 <w:rFonts w:cs="Arial" w:ascii="Arial" w:hAnsi="Arial"/>
-                <w:sz w:val="16"/>
+                <w:sz w:val="18"/>
               </w:rPr>
               <w:t>{{ sponsor.pec_email }}</w:t>
             </w:r>
@@ -1068,7 +1068,7 @@
             <w:r>
               <w:rPr>
                 <w:rFonts w:cs="Arial" w:ascii="Arial" w:hAnsi="Arial"/>
-                <w:sz w:val="16"/>
+                <w:sz w:val="18"/>
               </w:rPr>
               <w:t xml:space="preserve">iscritta  al  Reg.delle </w:t>
             </w:r>
@@ -1076,14 +1076,14 @@
               <w:rPr>
                 <w:rFonts w:cs="Arial" w:ascii="Arial" w:hAnsi="Arial"/>
                 <w:spacing w:val="40"/>
-                <w:sz w:val="16"/>
+                <w:sz w:val="18"/>
               </w:rPr>
               <w:t xml:space="preserve"> </w:t>
             </w:r>
             <w:r>
               <w:rPr>
                 <w:rFonts w:cs="Arial" w:ascii="Arial" w:hAnsi="Arial"/>
-                <w:sz w:val="16"/>
+                <w:sz w:val="18"/>
               </w:rPr>
               <w:t xml:space="preserve">Imprese </w:t>
             </w:r>
@@ -1091,7 +1091,7 @@
               <w:rPr>
                 <w:rFonts w:cs="Arial" w:ascii="Arial" w:hAnsi="Arial"/>
                 <w:spacing w:val="18"/>
-                <w:sz w:val="16"/>
+                <w:sz w:val="18"/>
               </w:rPr>
               <w:t xml:space="preserve"> di</w:t>
             </w:r>
@@ -1121,7 +1121,7 @@
             <w:r>
               <w:rPr>
                 <w:rFonts w:cs="Arial" w:ascii="Arial" w:hAnsi="Arial"/>
-                <w:sz w:val="16"/>
+                <w:sz w:val="18"/>
               </w:rPr>
               <w:t>{{ sponsor.rea_city }}</w:t>
             </w:r>
@@ -1151,7 +1151,7 @@
             <w:r>
               <w:rPr>
                 <w:rFonts w:cs="Arial" w:ascii="Arial" w:hAnsi="Arial"/>
-                <w:sz w:val="16"/>
+                <w:sz w:val="18"/>
               </w:rPr>
               <w:t>al n° REA</w:t>
             </w:r>
@@ -1180,7 +1180,7 @@
             <w:r>
               <w:rPr>
                 <w:rFonts w:cs="Arial" w:ascii="Arial" w:hAnsi="Arial"/>
-                <w:sz w:val="16"/>
+                <w:sz w:val="18"/>
               </w:rPr>
               <w:t>{{ sponsor.rea_number }}</w:t>
             </w:r>
@@ -1213,7 +1213,7 @@
             <w:r>
               <w:rPr>
                 <w:rFonts w:cs="Arial" w:ascii="Arial" w:hAnsi="Arial"/>
-                <w:sz w:val="16"/>
+                <w:sz w:val="18"/>
               </w:rPr>
               <w:t>nella persona del suo Rappresentante Legale in carica Sig</w:t>
             </w:r>
@@ -1242,7 +1242,7 @@
             <w:r>
               <w:rPr>
                 <w:rFonts w:cs="Arial" w:ascii="Arial" w:hAnsi="Arial"/>
-                <w:sz w:val="16"/>
+                <w:sz w:val="18"/>
               </w:rPr>
               <w:t>{{ signer.full_name }}</w:t>
             </w:r>
@@ -1273,7 +1273,7 @@
             <w:r>
               <w:rPr>
                 <w:rFonts w:cs="Arial" w:ascii="Arial" w:hAnsi="Arial"/>
-                <w:sz w:val="16"/>
+                <w:sz w:val="18"/>
               </w:rPr>
               <w:t>nato</w:t>
             </w:r>
@@ -1281,14 +1281,14 @@
               <w:rPr>
                 <w:rFonts w:cs="Arial" w:ascii="Arial" w:hAnsi="Arial"/>
                 <w:spacing w:val="8"/>
-                <w:sz w:val="16"/>
+                <w:sz w:val="18"/>
               </w:rPr>
               <w:t xml:space="preserve"> </w:t>
             </w:r>
             <w:r>
               <w:rPr>
                 <w:rFonts w:cs="Arial" w:ascii="Arial" w:hAnsi="Arial"/>
-                <w:sz w:val="16"/>
+                <w:sz w:val="18"/>
               </w:rPr>
               <w:t>il</w:t>
             </w:r>
@@ -1318,7 +1318,7 @@
             <w:r>
               <w:rPr>
                 <w:rFonts w:cs="Arial" w:ascii="Arial" w:hAnsi="Arial"/>
-                <w:sz w:val="16"/>
+                <w:sz w:val="18"/>
               </w:rPr>
               <w:t>{{ signer.birth_date|format_date }}</w:t>
             </w:r>
@@ -1347,7 +1347,7 @@
             <w:r>
               <w:rPr>
                 <w:rFonts w:cs="Arial" w:ascii="Arial" w:hAnsi="Arial"/>
-                <w:sz w:val="16"/>
+                <w:sz w:val="18"/>
               </w:rPr>
               <w:t>a</w:t>
             </w:r>
@@ -1377,7 +1377,7 @@
             <w:r>
               <w:rPr>
                 <w:rFonts w:cs="Arial" w:ascii="Arial" w:hAnsi="Arial"/>
-                <w:sz w:val="16"/>
+                <w:sz w:val="18"/>
               </w:rPr>
               <w:t>{{ signer.birth_place }}</w:t>
             </w:r>
@@ -1407,7 +1407,7 @@
             <w:r>
               <w:rPr>
                 <w:rFonts w:cs="Arial" w:ascii="Arial" w:hAnsi="Arial"/>
-                <w:sz w:val="16"/>
+                <w:sz w:val="18"/>
               </w:rPr>
               <w:t>Prov. di</w:t>
             </w:r>
@@ -1436,7 +1436,7 @@
             <w:r>
               <w:rPr>
                 <w:rFonts w:cs="Arial" w:ascii="Arial" w:hAnsi="Arial"/>
-                <w:sz w:val="16"/>
+                <w:sz w:val="18"/>
               </w:rPr>
               <w:t>{{ signer.birth_province }}</w:t>
             </w:r>
@@ -1469,7 +1469,7 @@
             <w:r>
               <w:rPr>
                 <w:rFonts w:cs="Arial" w:ascii="Arial" w:hAnsi="Arial"/>
-                <w:sz w:val="16"/>
+                <w:sz w:val="18"/>
               </w:rPr>
               <w:t>Residente in</w:t>
             </w:r>
@@ -1499,7 +1499,7 @@
             <w:r>
               <w:rPr>
                 <w:rFonts w:cs="Arial" w:ascii="Arial" w:hAnsi="Arial"/>
-                <w:sz w:val="16"/>
+                <w:sz w:val="18"/>
               </w:rPr>
               <w:t>{{ signer.residence_city }}</w:t>
             </w:r>
@@ -1529,7 +1529,7 @@
             <w:r>
               <w:rPr>
                 <w:rFonts w:cs="Arial" w:ascii="Arial" w:hAnsi="Arial"/>
-                <w:sz w:val="16"/>
+                <w:sz w:val="18"/>
               </w:rPr>
               <w:t>CAP</w:t>
             </w:r>
@@ -1558,7 +1558,7 @@
             <w:r>
               <w:rPr>
                 <w:rFonts w:cs="Arial" w:ascii="Arial" w:hAnsi="Arial"/>
-                <w:sz w:val="16"/>
+                <w:sz w:val="18"/>
               </w:rPr>
               <w:t>{{ signer.residence_zip }}</w:t>
             </w:r>
@@ -1591,7 +1591,7 @@
             <w:r>
               <w:rPr>
                 <w:rFonts w:cs="Arial" w:ascii="Arial" w:hAnsi="Arial"/>
-                <w:sz w:val="16"/>
+                <w:sz w:val="18"/>
               </w:rPr>
               <w:t>Indirizzo e num. civico</w:t>
             </w:r>
@@ -1621,7 +1621,7 @@
             <w:r>
               <w:rPr>
                 <w:rFonts w:cs="Arial" w:ascii="Arial" w:hAnsi="Arial"/>
-                <w:sz w:val="16"/>
+                <w:sz w:val="18"/>
               </w:rPr>
               <w:t>{{ signer.residence_street }} {{ signer.residence_street_number }}</w:t>
             </w:r>
@@ -1651,7 +1651,7 @@
             <w:r>
               <w:rPr>
                 <w:rFonts w:cs="Arial" w:ascii="Arial" w:hAnsi="Arial"/>
-                <w:sz w:val="16"/>
+                <w:sz w:val="18"/>
               </w:rPr>
               <w:t>Prov.</w:t>
             </w:r>
@@ -1680,7 +1680,7 @@
             <w:r>
               <w:rPr>
                 <w:rFonts w:cs="Arial" w:ascii="Arial" w:hAnsi="Arial"/>
-                <w:sz w:val="16"/>
+                <w:sz w:val="18"/>
               </w:rPr>
               <w:t>{{ signer.residence_province }}</w:t>
             </w:r>
@@ -1713,7 +1713,7 @@
             <w:r>
               <w:rPr>
                 <w:rFonts w:cs="Arial" w:ascii="Arial" w:hAnsi="Arial"/>
-                <w:sz w:val="16"/>
+                <w:sz w:val="18"/>
               </w:rPr>
               <w:t>Carta Identità n°</w:t>
             </w:r>
@@ -1743,7 +1743,7 @@
             <w:r>
               <w:rPr>
                 <w:rFonts w:cs="Arial" w:ascii="Arial" w:hAnsi="Arial"/>
-                <w:sz w:val="16"/>
+                <w:sz w:val="18"/>
               </w:rPr>
               <w:t>{{ signer.id_document_number }}</w:t>
             </w:r>
@@ -1772,7 +1772,7 @@
             <w:r>
               <w:rPr>
                 <w:rFonts w:cs="Arial" w:ascii="Arial" w:hAnsi="Arial"/>
-                <w:sz w:val="16"/>
+                <w:sz w:val="18"/>
               </w:rPr>
               <w:t>Cod. Fisc.</w:t>
             </w:r>
@@ -1802,7 +1802,7 @@
             <w:r>
               <w:rPr>
                 <w:rFonts w:cs="Arial" w:ascii="Arial" w:hAnsi="Arial"/>
-                <w:sz w:val="16"/>
+                <w:sz w:val="18"/>
               </w:rPr>
               <w:t>{{ signer.tax_code }}</w:t>
             </w:r>
@@ -1822,7 +1822,7 @@
       <w:r>
         <w:rPr>
           <w:rFonts w:cs="Arial" w:ascii="Arial" w:hAnsi="Arial"/>
-          <w:sz w:val="16"/>
+          <w:sz w:val="18"/>
         </w:rPr>
       </w:r>
     </w:p>
@@ -1843,7 +1843,7 @@
           <w:rFonts w:cs="Arial" w:ascii="Arial" w:hAnsi="Arial"/>
           <w:b/>
           <w:bCs/>
-          <w:sz w:val="16"/>
+          <w:sz w:val="18"/>
         </w:rPr>
         <w:t>PREMESSO CHE</w:t>
       </w:r>
@@ -1865,7 +1865,7 @@
           <w:rFonts w:cs="Arial" w:ascii="Arial" w:hAnsi="Arial"/>
           <w:b/>
           <w:bCs/>
-          <w:sz w:val="16"/>
+          <w:sz w:val="18"/>
         </w:rPr>
       </w:r>
     </w:p>
@@ -1881,7 +1881,7 @@
           <w:rFonts w:cs="Arial" w:ascii="Arial" w:hAnsi="Arial"/>
           <w:b/>
           <w:bCs/>
-          <w:sz w:val="16"/>
+          <w:sz w:val="18"/>
         </w:rPr>
         <w:t xml:space="preserve">a) La Segreteria Organizzativa, soggetto con esperienza comprovata, attivo nel campo dell’organizzazione e/o realizzazione di eventi nel rispetto dell’art. 124 del D. Lgs. 24 aprile 2006, n. 219, intende acquisire sponsorizzazioni per assicurarsi finanziamenti per la realizzazione dell’evento {{ event.name }} che si svolgerà a {{ event.location }} il {{ event.start_date|format_date }}{% if event.end_date and event.end_date != event.start_date %} – {{ event.end_date|format_date }}{% endif %} e destinato alla formazione di operatori sanitari; </w:t>
       </w:r>
@@ -1903,7 +1903,7 @@
           <w:rFonts w:cs="Arial" w:ascii="Arial" w:hAnsi="Arial"/>
           <w:b/>
           <w:bCs/>
-          <w:sz w:val="16"/>
+          <w:sz w:val="18"/>
         </w:rPr>
       </w:r>
     </w:p>
@@ -1919,14 +1919,14 @@
           <w:rFonts w:cs="Arial" w:ascii="Arial" w:hAnsi="Arial"/>
           <w:b/>
           <w:bCs/>
-          <w:sz w:val="16"/>
+          <w:sz w:val="18"/>
         </w:rPr>
         <w:t xml:space="preserve">b) </w:t>
       </w:r>
       <w:r>
         <w:rPr>
           <w:rFonts w:cs="Arial" w:ascii="Arial" w:hAnsi="Arial"/>
-          <w:sz w:val="16"/>
+          <w:sz w:val="18"/>
         </w:rPr>
         <w:t xml:space="preserve">la Segreteria Organizzativa è attiva nella realizzazione e gestione di tutte le attività di servizi non istituzionali e dichiara di essere soggetto giuridico in possesso delle competenze necessarie per la realizzazione dell’Evento; </w:t>
       </w:r>
@@ -1948,32 +1948,32 @@
           <w:rFonts w:cs="Arial" w:ascii="Arial" w:hAnsi="Arial"/>
           <w:b/>
           <w:bCs/>
-          <w:sz w:val="16"/>
-        </w:rPr>
-      </w:r>
-    </w:p>
-    <w:p>
-      <w:pPr>
-        <w:pStyle w:val="Normal"/>
-        <w:spacing w:before="0" w:after="0" w:line="230" w:lineRule="auto"/>
-        <w:jc w:val="both"/>
-        <w:rPr>
-          <w:rFonts w:ascii="Calibri" w:hAnsi="Calibri" w:cs="Calibri"/>
-        </w:rPr>
-      </w:pPr>
-      <w:r>
-        <w:rPr>
-          <w:rFonts w:cs="Arial" w:ascii="Arial" w:hAnsi="Arial"/>
-          <w:b/>
-          <w:bCs/>
-          <w:sz w:val="16"/>
+          <w:sz w:val="18"/>
+        </w:rPr>
+      </w:r>
+    </w:p>
+    <w:p>
+      <w:pPr>
+        <w:pStyle w:val="Normal"/>
+        <w:spacing w:before="0" w:after="0" w:line="230" w:lineRule="auto"/>
+        <w:jc w:val="both"/>
+        <w:rPr>
+          <w:rFonts w:ascii="Calibri" w:hAnsi="Calibri" w:cs="Calibri"/>
+        </w:rPr>
+      </w:pPr>
+      <w:r>
+        <w:rPr>
+          <w:rFonts w:cs="Arial" w:ascii="Arial" w:hAnsi="Arial"/>
+          <w:b/>
+          <w:bCs/>
+          <w:sz w:val="18"/>
         </w:rPr>
         <w:t xml:space="preserve">c) </w:t>
       </w:r>
       <w:r>
         <w:rPr>
           <w:rFonts w:cs="Arial" w:ascii="Arial" w:hAnsi="Arial"/>
-          <w:sz w:val="16"/>
+          <w:sz w:val="18"/>
         </w:rPr>
         <w:t>la Segreteria Organizzativa è disponibile ad organizzare una serie di attività nell’ambito dell’Evento.</w:t>
       </w:r>
@@ -1995,32 +1995,32 @@
           <w:rFonts w:cs="Arial" w:ascii="Arial" w:hAnsi="Arial"/>
           <w:b/>
           <w:bCs/>
-          <w:sz w:val="16"/>
-        </w:rPr>
-      </w:r>
-    </w:p>
-    <w:p>
-      <w:pPr>
-        <w:pStyle w:val="Normal"/>
-        <w:spacing w:before="0" w:after="0" w:line="230" w:lineRule="auto"/>
-        <w:jc w:val="both"/>
-        <w:rPr>
-          <w:rFonts w:ascii="Calibri" w:hAnsi="Calibri" w:cs="Calibri"/>
-        </w:rPr>
-      </w:pPr>
-      <w:r>
-        <w:rPr>
-          <w:rFonts w:cs="Arial" w:ascii="Arial" w:hAnsi="Arial"/>
-          <w:b/>
-          <w:bCs/>
-          <w:sz w:val="16"/>
+          <w:sz w:val="18"/>
+        </w:rPr>
+      </w:r>
+    </w:p>
+    <w:p>
+      <w:pPr>
+        <w:pStyle w:val="Normal"/>
+        <w:spacing w:before="0" w:after="0" w:line="230" w:lineRule="auto"/>
+        <w:jc w:val="both"/>
+        <w:rPr>
+          <w:rFonts w:ascii="Calibri" w:hAnsi="Calibri" w:cs="Calibri"/>
+        </w:rPr>
+      </w:pPr>
+      <w:r>
+        <w:rPr>
+          <w:rFonts w:cs="Arial" w:ascii="Arial" w:hAnsi="Arial"/>
+          <w:b/>
+          <w:bCs/>
+          <w:sz w:val="18"/>
         </w:rPr>
         <w:t xml:space="preserve">d) </w:t>
       </w:r>
       <w:r>
         <w:rPr>
           <w:rFonts w:cs="Arial" w:ascii="Arial" w:hAnsi="Arial"/>
-          <w:sz w:val="16"/>
+          <w:sz w:val="18"/>
         </w:rPr>
         <w:t>Lo Sponsor opera nel settore della distribuzione e commercializzazione di prodotti per la medicina e la chirurgia estetica ed è interessato a supportare istituzionalmente e sponsorizzare eventi finalizzati alla formazione e all’aggiornamento professionale, anche in cambio di spazi pubblicitari o attività promozionali per il proprio nome e/o i propri prodotti presso gli operatori sanitari.</w:t>
       </w:r>
@@ -2042,32 +2042,32 @@
           <w:rFonts w:cs="Arial" w:ascii="Arial" w:hAnsi="Arial"/>
           <w:b/>
           <w:bCs/>
-          <w:sz w:val="16"/>
-        </w:rPr>
-      </w:r>
-    </w:p>
-    <w:p>
-      <w:pPr>
-        <w:pStyle w:val="Normal"/>
-        <w:spacing w:before="0" w:after="0" w:line="230" w:lineRule="auto"/>
-        <w:jc w:val="both"/>
-        <w:rPr>
-          <w:rFonts w:ascii="Calibri" w:hAnsi="Calibri" w:cs="Calibri"/>
-        </w:rPr>
-      </w:pPr>
-      <w:r>
-        <w:rPr>
-          <w:rFonts w:cs="Arial" w:ascii="Arial" w:hAnsi="Arial"/>
-          <w:b/>
-          <w:bCs/>
-          <w:sz w:val="16"/>
+          <w:sz w:val="18"/>
+        </w:rPr>
+      </w:r>
+    </w:p>
+    <w:p>
+      <w:pPr>
+        <w:pStyle w:val="Normal"/>
+        <w:spacing w:before="0" w:after="0" w:line="230" w:lineRule="auto"/>
+        <w:jc w:val="both"/>
+        <w:rPr>
+          <w:rFonts w:ascii="Calibri" w:hAnsi="Calibri" w:cs="Calibri"/>
+        </w:rPr>
+      </w:pPr>
+      <w:r>
+        <w:rPr>
+          <w:rFonts w:cs="Arial" w:ascii="Arial" w:hAnsi="Arial"/>
+          <w:b/>
+          <w:bCs/>
+          <w:sz w:val="18"/>
         </w:rPr>
         <w:t xml:space="preserve">e) </w:t>
       </w:r>
       <w:r>
         <w:rPr>
           <w:rFonts w:cs="Arial" w:ascii="Arial" w:hAnsi="Arial"/>
-          <w:sz w:val="16"/>
+          <w:sz w:val="18"/>
         </w:rPr>
         <w:t xml:space="preserve">la Segreteria organizzativa ha sottoposto allo Sponsor il programma dell’Evento, proponendogli di contribuirvi come sponsor; </w:t>
       </w:r>
@@ -2089,7 +2089,7 @@
           <w:rFonts w:cs="Arial" w:ascii="Arial" w:hAnsi="Arial"/>
           <w:b/>
           <w:bCs/>
-          <w:sz w:val="16"/>
+          <w:sz w:val="18"/>
         </w:rPr>
       </w:r>
     </w:p>
@@ -2105,14 +2105,14 @@
           <w:rFonts w:cs="Arial" w:ascii="Arial" w:hAnsi="Arial"/>
           <w:b/>
           <w:bCs/>
-          <w:sz w:val="16"/>
+          <w:sz w:val="18"/>
         </w:rPr>
         <w:t xml:space="preserve">f) </w:t>
       </w:r>
       <w:r>
         <w:rPr>
           <w:rFonts w:cs="Arial" w:ascii="Arial" w:hAnsi="Arial"/>
-          <w:sz w:val="16"/>
+          <w:sz w:val="18"/>
         </w:rPr>
         <w:t>lo Sponsor e la Segreteria Organizzativa, (qui di seguito anche le “</w:t>
       </w:r>
@@ -2121,14 +2121,14 @@
           <w:rFonts w:cs="Arial" w:ascii="Arial" w:hAnsi="Arial"/>
           <w:b/>
           <w:bCs/>
-          <w:sz w:val="16"/>
+          <w:sz w:val="18"/>
         </w:rPr>
         <w:t>Parti</w:t>
       </w:r>
       <w:r>
         <w:rPr>
           <w:rFonts w:cs="Arial" w:ascii="Arial" w:hAnsi="Arial"/>
-          <w:sz w:val="16"/>
+          <w:sz w:val="18"/>
         </w:rPr>
         <w:t xml:space="preserve">”, se collettivamente indicate) riconoscendo espressamente che l’attività formativa realizzata attraverso l’Evento è finalizzata esclusivamente allo sviluppo delle conoscenze scientifiche e delle competenze tecnico professionali in ambito sanitario, ed è, pertanto, obiettiva ed indipendente da interessi commerciali direttamente o indirettamente ricollegabili allo Sponsor, intendono definire termini e condizioni per la sponsorizzazione dell’Evento come segue. </w:t>
       </w:r>
@@ -2145,7 +2145,7 @@
       <w:r>
         <w:rPr>
           <w:rFonts w:cs="Arial" w:ascii="Arial" w:hAnsi="Arial"/>
-          <w:sz w:val="16"/>
+          <w:sz w:val="18"/>
         </w:rPr>
       </w:r>
     </w:p>
@@ -2163,7 +2163,7 @@
           <w:rFonts w:cs="Arial" w:ascii="Arial" w:hAnsi="Arial"/>
           <w:b/>
           <w:bCs/>
-          <w:sz w:val="16"/>
+          <w:sz w:val="18"/>
         </w:rPr>
         <w:t>TUTTO CIÒ PREMESSO</w:t>
       </w:r>
@@ -2180,7 +2180,7 @@
       <w:r>
         <w:rPr>
           <w:rFonts w:cs="Arial" w:ascii="Arial" w:hAnsi="Arial"/>
-          <w:sz w:val="16"/>
+          <w:sz w:val="18"/>
         </w:rPr>
         <w:t>le Parti stipulano e convengono quanto segue.</w:t>
       </w:r>
@@ -2202,7 +2202,7 @@
           <w:rFonts w:cs="Arial" w:ascii="Arial" w:hAnsi="Arial"/>
           <w:b/>
           <w:bCs/>
-          <w:sz w:val="16"/>
+          <w:sz w:val="18"/>
         </w:rPr>
         <w:t>Oggetto del Contratto e generalità</w:t>
       </w:r>
@@ -2219,7 +2219,7 @@
       <w:r>
         <w:rPr>
           <w:rFonts w:cs="Arial" w:ascii="Arial" w:hAnsi="Arial"/>
-          <w:sz w:val="16"/>
+          <w:sz w:val="18"/>
         </w:rPr>
         <w:t>Il presente contratto regola il rapporto di sponsorizzazione tra Segreteria Organizzativa e Sponsor con specifico riferimento all’Evento citato al paragrafo a) delle premesse</w:t>
       </w:r>
@@ -2236,25 +2236,25 @@
       <w:r>
         <w:rPr>
           <w:rFonts w:cs="Arial" w:ascii="Arial" w:hAnsi="Arial"/>
-          <w:sz w:val="16"/>
-        </w:rPr>
-      </w:r>
-    </w:p>
-    <w:p>
-      <w:pPr>
-        <w:pStyle w:val="Normal"/>
-        <w:spacing w:before="0" w:after="0" w:line="230" w:lineRule="auto"/>
-        <w:jc w:val="both"/>
-        <w:rPr>
-          <w:rFonts w:ascii="Calibri" w:hAnsi="Calibri" w:cs="Calibri"/>
-        </w:rPr>
-      </w:pPr>
-      <w:r>
-        <w:rPr>
-          <w:rFonts w:cs="Arial" w:ascii="Arial" w:hAnsi="Arial"/>
-          <w:b/>
-          <w:bCs/>
-          <w:sz w:val="16"/>
+          <w:sz w:val="18"/>
+        </w:rPr>
+      </w:r>
+    </w:p>
+    <w:p>
+      <w:pPr>
+        <w:pStyle w:val="Normal"/>
+        <w:spacing w:before="0" w:after="0" w:line="230" w:lineRule="auto"/>
+        <w:jc w:val="both"/>
+        <w:rPr>
+          <w:rFonts w:ascii="Calibri" w:hAnsi="Calibri" w:cs="Calibri"/>
+        </w:rPr>
+      </w:pPr>
+      <w:r>
+        <w:rPr>
+          <w:rFonts w:cs="Arial" w:ascii="Arial" w:hAnsi="Arial"/>
+          <w:b/>
+          <w:bCs/>
+          <w:sz w:val="18"/>
         </w:rPr>
         <w:t xml:space="preserve">1. Obbligazioni della Segreteria Organizzativa </w:t>
       </w:r>
@@ -2272,14 +2272,14 @@
         <w:rPr>
           <w:rFonts w:cs="Arial" w:ascii="Arial" w:hAnsi="Arial"/>
           <w:b/>
-          <w:sz w:val="16"/>
+          <w:sz w:val="18"/>
         </w:rPr>
         <w:t>1.1</w:t>
       </w:r>
       <w:r>
         <w:rPr>
           <w:rFonts w:cs="Arial" w:ascii="Arial" w:hAnsi="Arial"/>
-          <w:sz w:val="16"/>
+          <w:sz w:val="18"/>
         </w:rPr>
         <w:t xml:space="preserve"> Il reperimento di tutte le risorse e dei mezzi necessari a garantire il buon esito dello stesso è rimesso alla Segreteria Organizzativa. Resta inteso che i fondi necessari allo svolgimento della manifestazione potranno essere recuperati dalla Segreteria Organizzativa anche attraverso il ricorso ad altri Sponsor.</w:t>
       </w:r>
@@ -2296,14 +2296,14 @@
           <w:rFonts w:cs="Arial" w:ascii="Arial" w:hAnsi="Arial"/>
           <w:b/>
           <w:bCs/>
-          <w:sz w:val="16"/>
+          <w:sz w:val="18"/>
         </w:rPr>
         <w:t xml:space="preserve">1.2 </w:t>
       </w:r>
       <w:r>
         <w:rPr>
           <w:rFonts w:cs="Arial" w:ascii="Arial" w:hAnsi="Arial"/>
-          <w:sz w:val="16"/>
+          <w:sz w:val="18"/>
         </w:rPr>
         <w:t xml:space="preserve">La Segreteria Organizzativa dichiara che l’Evento è stato organizzato e sarà condotto dal Responsabile Scientifico in piena autonomia e senza alcuna influenza o interferenza. Interesse delle Parti è, infatti, quello che venga fornita ai discenti attività formativa condotta con professionalità e rigore scientifico e con la massima indipendenza, dal momento che le finalità dell’Evento sono e dovranno restare unicamente quelle di educazione e formazione. </w:t>
       </w:r>
@@ -2318,7 +2318,7 @@
       <w:r>
         <w:rPr>
           <w:rFonts w:cs="Arial" w:ascii="Arial" w:hAnsi="Arial"/>
-          <w:sz w:val="16"/>
+          <w:sz w:val="18"/>
         </w:rPr>
         <w:t>La Segreteria Organizzativa indica come responsabile scientifico dell’Evento il {{ event.scientific_director|default('________________', true) }}  di seguito “Responsabile Scientifico”), mentre, ai fini del presente Contratto, il referente dello Sponsor sarà {{ signer.full_name }}  (di seguito “Referente”)</w:t>
       </w:r>
@@ -2340,7 +2340,7 @@
           <w:rFonts w:cs="Arial" w:ascii="Arial" w:hAnsi="Arial"/>
           <w:b/>
           <w:bCs/>
-          <w:sz w:val="16"/>
+          <w:sz w:val="18"/>
         </w:rPr>
       </w:r>
     </w:p>
@@ -2356,7 +2356,7 @@
           <w:rFonts w:cs="Arial" w:ascii="Arial" w:hAnsi="Arial"/>
           <w:b/>
           <w:bCs/>
-          <w:sz w:val="16"/>
+          <w:sz w:val="18"/>
         </w:rPr>
         <w:t xml:space="preserve">1.3 </w:t>
       </w:r>
@@ -2364,7 +2364,7 @@
         <w:rPr>
           <w:rFonts w:cs="Arial" w:ascii="Arial" w:hAnsi="Arial"/>
           <w:bCs/>
-          <w:sz w:val="16"/>
+          <w:sz w:val="18"/>
         </w:rPr>
         <w:t>La</w:t>
       </w:r>
@@ -2373,14 +2373,14 @@
           <w:rFonts w:cs="Arial" w:ascii="Arial" w:hAnsi="Arial"/>
           <w:b/>
           <w:bCs/>
-          <w:sz w:val="16"/>
+          <w:sz w:val="18"/>
         </w:rPr>
         <w:t xml:space="preserve"> </w:t>
       </w:r>
       <w:r>
         <w:rPr>
           <w:rFonts w:cs="Arial" w:ascii="Arial" w:hAnsi="Arial"/>
-          <w:sz w:val="16"/>
+          <w:sz w:val="18"/>
         </w:rPr>
         <w:t xml:space="preserve">Segreteria Organizzativa inoltre, si impegna a veicolare in termini pubblicitari, il nome e il logo dello Sponsor, come meglio specificato nei successivi articoli. </w:t>
       </w:r>
@@ -2402,7 +2402,7 @@
           <w:rFonts w:cs="Arial" w:ascii="Arial" w:hAnsi="Arial"/>
           <w:b/>
           <w:bCs/>
-          <w:sz w:val="16"/>
+          <w:sz w:val="18"/>
         </w:rPr>
       </w:r>
     </w:p>
@@ -2418,14 +2418,14 @@
           <w:rFonts w:cs="Arial" w:ascii="Arial" w:hAnsi="Arial"/>
           <w:b/>
           <w:bCs/>
-          <w:sz w:val="16"/>
+          <w:sz w:val="18"/>
         </w:rPr>
         <w:t xml:space="preserve">1.4 </w:t>
       </w:r>
       <w:r>
         <w:rPr>
           <w:rFonts w:cs="Arial" w:ascii="Arial" w:hAnsi="Arial"/>
-          <w:sz w:val="16"/>
+          <w:sz w:val="18"/>
         </w:rPr>
         <w:t>Lo Sponsor, dal canto suo, corrisponderà, a titolo di sponsorizzazione, un contributo finanziario, nei limiti di quanto indicato nell’</w:t>
       </w:r>
@@ -2434,14 +2434,14 @@
           <w:rFonts w:cs="Arial" w:ascii="Arial" w:hAnsi="Arial"/>
           <w:b/>
           <w:bCs/>
-          <w:sz w:val="16"/>
+          <w:sz w:val="18"/>
         </w:rPr>
         <w:t xml:space="preserve">Allegato 1) </w:t>
       </w:r>
       <w:r>
         <w:rPr>
           <w:rFonts w:cs="Arial" w:ascii="Arial" w:hAnsi="Arial"/>
-          <w:sz w:val="16"/>
+          <w:sz w:val="18"/>
         </w:rPr>
         <w:t xml:space="preserve">al presente Contratto di cui è parte integrante. </w:t>
       </w:r>
@@ -2458,7 +2458,7 @@
       <w:r>
         <w:rPr>
           <w:rFonts w:cs="Arial" w:ascii="Arial" w:hAnsi="Arial"/>
-          <w:sz w:val="16"/>
+          <w:sz w:val="18"/>
         </w:rPr>
         <w:t xml:space="preserve">Tale contributo dovrà essere destinato ed utilizzato dalla Segreteria Organizzativa esclusivamente per la realizzazione dell’Evento, in collaborazione con il Responsabile Scientifico dell’Evento stesso. </w:t>
       </w:r>
@@ -2475,7 +2475,7 @@
       <w:r>
         <w:rPr>
           <w:rFonts w:cs="Arial" w:ascii="Arial" w:hAnsi="Arial"/>
-          <w:sz w:val="16"/>
+          <w:sz w:val="18"/>
         </w:rPr>
       </w:r>
     </w:p>
@@ -2500,7 +2500,7 @@
       <w:r>
         <w:rPr>
           <w:rFonts w:cs="Arial" w:ascii="Arial" w:hAnsi="Arial"/>
-          <w:sz w:val="16"/>
+          <w:sz w:val="18"/>
         </w:rPr>
         <w:t>La Segreteria Organizzativa, potrà avvalersi, nell’esecuzione delle attività di cui sopra, anche di altri soggetti, ai quali potrà delegare in tutto o in parte l’effettuazione delle attività stesse.</w:t>
       </w:r>
@@ -2521,7 +2521,7 @@
       <w:r>
         <w:rPr>
           <w:rFonts w:cs="Arial" w:ascii="Arial" w:hAnsi="Arial"/>
-          <w:sz w:val="16"/>
+          <w:sz w:val="18"/>
         </w:rPr>
       </w:r>
     </w:p>
@@ -2539,7 +2539,7 @@
       <w:r>
         <w:rPr>
           <w:rFonts w:cs="Arial" w:ascii="Arial" w:hAnsi="Arial"/>
-          <w:sz w:val="16"/>
+          <w:sz w:val="18"/>
         </w:rPr>
         <w:t xml:space="preserve">La Segreteria Organizzativa si obbliga a: </w:t>
         <w:tab/>
@@ -2559,7 +2559,7 @@
       <w:r>
         <w:rPr>
           <w:rFonts w:cs="Arial" w:ascii="Arial" w:hAnsi="Arial"/>
-          <w:sz w:val="16"/>
+          <w:sz w:val="18"/>
           <w:szCs w:val="20"/>
         </w:rPr>
         <w:t>a) veicolare il programma dell’Evento attraverso i suoi canali marketing/comunicativi;</w:t>
@@ -2579,7 +2579,7 @@
       <w:r>
         <w:rPr>
           <w:rFonts w:cs="Arial" w:ascii="Arial" w:hAnsi="Arial"/>
-          <w:sz w:val="16"/>
+          <w:sz w:val="18"/>
           <w:szCs w:val="20"/>
         </w:rPr>
         <w:t>b) mettere a disposizione dello Sponsor quanto indicato nell’allegato 1) per l’esposizione ed illustrazione, da parte di personale qualificato e autorizzato dallo Sponsor, delle caratteristiche tecnico-scientifiche dei prodotti rientranti nel settore merceologico inerente l’evento che si svolgerà come specificato all’inizio del presente accordo.</w:t>
@@ -2598,7 +2598,7 @@
         <w:rPr>
           <w:rFonts w:cs="Arial" w:ascii="Arial" w:hAnsi="Arial"/>
           <w:bCs/>
-          <w:sz w:val="16"/>
+          <w:sz w:val="18"/>
           <w:szCs w:val="20"/>
         </w:rPr>
         <w:t xml:space="preserve">c) </w:t>
@@ -2606,7 +2606,7 @@
       <w:r>
         <w:rPr>
           <w:rFonts w:cs="Arial" w:ascii="Arial" w:hAnsi="Arial"/>
-          <w:sz w:val="16"/>
+          <w:sz w:val="18"/>
           <w:szCs w:val="20"/>
         </w:rPr>
         <w:t xml:space="preserve">esporre il logo aziendale dello Sponsor, come più avanti specificato. </w:t>
@@ -2622,7 +2622,7 @@
       <w:r>
         <w:rPr>
           <w:rFonts w:cs="Arial" w:ascii="Arial" w:hAnsi="Arial"/>
-          <w:sz w:val="16"/>
+          <w:sz w:val="18"/>
           <w:szCs w:val="20"/>
         </w:rPr>
         <w:t xml:space="preserve">La Segreteria Organizzativa potrà avvalersi, nell’esecuzione delle attività di cui sopra, anche di altri soggetti Partner, ai quali potrà delegare in tutto o in parte l’effettuazione delle attività stesse. </w:t>
@@ -2645,14 +2645,14 @@
           <w:rFonts w:cs="Arial" w:ascii="Arial" w:hAnsi="Arial"/>
           <w:b/>
           <w:bCs/>
-          <w:sz w:val="16"/>
+          <w:sz w:val="18"/>
         </w:rPr>
         <w:t xml:space="preserve">1.7 </w:t>
       </w:r>
       <w:r>
         <w:rPr>
           <w:rFonts w:cs="Arial" w:ascii="Arial" w:hAnsi="Arial"/>
-          <w:sz w:val="16"/>
+          <w:sz w:val="18"/>
         </w:rPr>
         <w:t xml:space="preserve">La Segreteria Organizzativa fornirà allo Sponsor, su sua specifica richiesta, almeno 70 giorni prima dell’inizio dell’Evento, il programma definitivo, la documentazione e tutte le informazioni necessarie per procedere alla richiesta di autorizzazione all’AIFA prevista dall’art. 124 del D.Lgs. 219/2006, se applicabile. </w:t>
       </w:r>
@@ -2671,14 +2671,14 @@
           <w:rFonts w:cs="Arial" w:ascii="Arial" w:hAnsi="Arial"/>
           <w:b/>
           <w:bCs/>
-          <w:sz w:val="16"/>
+          <w:sz w:val="18"/>
         </w:rPr>
         <w:t xml:space="preserve">1.8 </w:t>
       </w:r>
       <w:r>
         <w:rPr>
           <w:rFonts w:cs="Arial" w:ascii="Arial" w:hAnsi="Arial"/>
-          <w:sz w:val="16"/>
+          <w:sz w:val="18"/>
         </w:rPr>
         <w:t>La Segreteria Organizzativa si impegna a conservare una completa ed accurata documentazione relativa ai propri rapporti con lo Sponsor per un periodo di durata non inferiore a cinque anni.</w:t>
       </w:r>
@@ -2698,7 +2698,7 @@
           <w:rFonts w:cs="Arial" w:ascii="Arial" w:hAnsi="Arial"/>
           <w:b/>
           <w:bCs/>
-          <w:sz w:val="16"/>
+          <w:sz w:val="18"/>
           <w:szCs w:val="20"/>
         </w:rPr>
         <w:t xml:space="preserve">1.9 </w:t>
@@ -2706,7 +2706,7 @@
       <w:r>
         <w:rPr>
           <w:rFonts w:cs="Arial" w:ascii="Arial" w:hAnsi="Arial"/>
-          <w:sz w:val="16"/>
+          <w:sz w:val="18"/>
           <w:szCs w:val="20"/>
         </w:rPr>
         <w:t>L’elenco e gli indirizzi dei partecipanti all’evento verranno mantenuti riservati e non saranno trasmessi allo Sponsor. Tuttavia, sarà possibile comunicare allo Sponsor solo il numero complessivo dei discenti presenti all’evento formativo. Nel caso di reclutamento diretto è possibile per La Segreteria organizzativa dare un riscontro solamente sui nominativi segnalati dallo Sponsor.</w:t>
@@ -2731,7 +2731,7 @@
           <w:rFonts w:cs="Arial" w:ascii="Arial" w:hAnsi="Arial"/>
           <w:b/>
           <w:bCs/>
-          <w:sz w:val="16"/>
+          <w:sz w:val="18"/>
           <w:szCs w:val="20"/>
         </w:rPr>
       </w:r>
@@ -2750,7 +2750,7 @@
           <w:rFonts w:cs="Arial" w:ascii="Arial" w:hAnsi="Arial"/>
           <w:b/>
           <w:bCs/>
-          <w:sz w:val="16"/>
+          <w:sz w:val="18"/>
         </w:rPr>
         <w:t xml:space="preserve">2. Obblighi dello Sponsor </w:t>
       </w:r>
@@ -2772,14 +2772,14 @@
           <w:rFonts w:cs="Arial" w:ascii="Arial" w:hAnsi="Arial"/>
           <w:b/>
           <w:bCs/>
-          <w:sz w:val="16"/>
+          <w:sz w:val="18"/>
         </w:rPr>
         <w:t xml:space="preserve">2.1 </w:t>
       </w:r>
       <w:r>
         <w:rPr>
           <w:rFonts w:cs="Arial" w:ascii="Arial" w:hAnsi="Arial"/>
-          <w:sz w:val="16"/>
+          <w:sz w:val="18"/>
         </w:rPr>
         <w:t>Lo Sponsor si obbliga a sostenere l’Evento di cui al punto a) delle premesse e come da specifica nell’allegato 1) e a fornire le indicazioni necessarie alla realizzazione della pubblicità nel rispetto dei limiti di cui presente Contratto.</w:t>
       </w:r>
@@ -2796,14 +2796,14 @@
           <w:rFonts w:cs="Arial" w:ascii="Arial" w:hAnsi="Arial"/>
           <w:b/>
           <w:bCs/>
-          <w:sz w:val="16"/>
+          <w:sz w:val="18"/>
         </w:rPr>
         <w:t>2.2</w:t>
       </w:r>
       <w:r>
         <w:rPr>
           <w:rFonts w:cs="Arial" w:ascii="Arial" w:hAnsi="Arial"/>
-          <w:sz w:val="16"/>
+          <w:sz w:val="18"/>
         </w:rPr>
         <w:t xml:space="preserve"> </w:t>
       </w:r>
@@ -2811,14 +2811,14 @@
         <w:rPr>
           <w:rFonts w:cs="Arial" w:ascii="Arial" w:hAnsi="Arial"/>
           <w:bCs/>
-          <w:sz w:val="16"/>
+          <w:sz w:val="18"/>
         </w:rPr>
         <w:t>L</w:t>
       </w:r>
       <w:r>
         <w:rPr>
           <w:rFonts w:cs="Arial" w:ascii="Arial" w:hAnsi="Arial"/>
-          <w:sz w:val="16"/>
+          <w:sz w:val="18"/>
         </w:rPr>
         <w:t>e attività inerenti i trasferimenti e l’ospitalità alberghiera dei partecipanti invitati dallo Sponsor sono gestite direttamente da quest’ultimo.</w:t>
       </w:r>
@@ -2835,25 +2835,25 @@
       <w:r>
         <w:rPr>
           <w:rFonts w:cs="Arial" w:ascii="Arial" w:hAnsi="Arial"/>
-          <w:sz w:val="16"/>
-        </w:rPr>
-      </w:r>
-    </w:p>
-    <w:p>
-      <w:pPr>
-        <w:pStyle w:val="Normal"/>
-        <w:spacing w:before="0" w:after="0" w:line="230" w:lineRule="auto"/>
-        <w:jc w:val="both"/>
-        <w:rPr>
-          <w:rFonts w:ascii="Calibri" w:hAnsi="Calibri" w:cs="Calibri"/>
-        </w:rPr>
-      </w:pPr>
-      <w:r>
-        <w:rPr>
-          <w:rFonts w:cs="Arial" w:ascii="Arial" w:hAnsi="Arial"/>
-          <w:b/>
-          <w:bCs/>
-          <w:sz w:val="16"/>
+          <w:sz w:val="18"/>
+        </w:rPr>
+      </w:r>
+    </w:p>
+    <w:p>
+      <w:pPr>
+        <w:pStyle w:val="Normal"/>
+        <w:spacing w:before="0" w:after="0" w:line="230" w:lineRule="auto"/>
+        <w:jc w:val="both"/>
+        <w:rPr>
+          <w:rFonts w:ascii="Calibri" w:hAnsi="Calibri" w:cs="Calibri"/>
+        </w:rPr>
+      </w:pPr>
+      <w:r>
+        <w:rPr>
+          <w:rFonts w:cs="Arial" w:ascii="Arial" w:hAnsi="Arial"/>
+          <w:b/>
+          <w:bCs/>
+          <w:sz w:val="18"/>
         </w:rPr>
         <w:t xml:space="preserve">3. Corrispettivo e modalità di pagamento </w:t>
       </w:r>
@@ -2870,14 +2870,14 @@
           <w:rFonts w:cs="Arial" w:ascii="Arial" w:hAnsi="Arial"/>
           <w:b/>
           <w:bCs/>
-          <w:sz w:val="16"/>
+          <w:sz w:val="18"/>
         </w:rPr>
         <w:t xml:space="preserve">3.1 </w:t>
       </w:r>
       <w:r>
         <w:rPr>
           <w:rFonts w:cs="Arial" w:ascii="Arial" w:hAnsi="Arial"/>
-          <w:sz w:val="16"/>
+          <w:sz w:val="18"/>
         </w:rPr>
         <w:t>Lo Sponsor garantisce di corrispondere alla Segreteria Organizzativa il compenso concordato per la sponsorizzazione dell’Evento, così come definito nell’</w:t>
       </w:r>
@@ -2886,7 +2886,7 @@
           <w:rFonts w:cs="Arial" w:ascii="Arial" w:hAnsi="Arial"/>
           <w:b/>
           <w:bCs/>
-          <w:sz w:val="16"/>
+          <w:sz w:val="18"/>
         </w:rPr>
         <w:t>Allegato 1).</w:t>
       </w:r>
@@ -2908,7 +2908,7 @@
           <w:rFonts w:cs="Arial" w:ascii="Arial" w:hAnsi="Arial"/>
           <w:b/>
           <w:bCs/>
-          <w:sz w:val="16"/>
+          <w:sz w:val="18"/>
         </w:rPr>
         <w:t xml:space="preserve">3.2 </w:t>
       </w:r>
@@ -2916,7 +2916,7 @@
         <w:rPr>
           <w:rFonts w:cs="Arial" w:ascii="Arial" w:hAnsi="Arial"/>
           <w:iCs/>
-          <w:sz w:val="16"/>
+          <w:sz w:val="18"/>
         </w:rPr>
         <w:t>La Segreteria Organizzativa garantisce e dichiara che il compenso corrisposto dallo Sponsor, indicato nel presente Contratto, quanto all’importo e alle modalità di pagamento, non è condizionante sui contenuti delle attività, ma ha la finalità di fornire il necessario supporto finanziario per la buona riuscita dell’evento stesso</w:t>
       </w:r>
@@ -2938,25 +2938,25 @@
           <w:rFonts w:cs="Arial" w:ascii="Arial" w:hAnsi="Arial"/>
           <w:b/>
           <w:bCs/>
-          <w:sz w:val="16"/>
-        </w:rPr>
-      </w:r>
-    </w:p>
-    <w:p>
-      <w:pPr>
-        <w:pStyle w:val="Normal"/>
-        <w:spacing w:before="0" w:after="0" w:line="230" w:lineRule="auto"/>
-        <w:jc w:val="both"/>
-        <w:rPr>
-          <w:rFonts w:ascii="Calibri" w:hAnsi="Calibri" w:cs="Calibri"/>
-        </w:rPr>
-      </w:pPr>
-      <w:r>
-        <w:rPr>
-          <w:rFonts w:cs="Arial" w:ascii="Arial" w:hAnsi="Arial"/>
-          <w:b/>
-          <w:bCs/>
-          <w:sz w:val="16"/>
+          <w:sz w:val="18"/>
+        </w:rPr>
+      </w:r>
+    </w:p>
+    <w:p>
+      <w:pPr>
+        <w:pStyle w:val="Normal"/>
+        <w:spacing w:before="0" w:after="0" w:line="230" w:lineRule="auto"/>
+        <w:jc w:val="both"/>
+        <w:rPr>
+          <w:rFonts w:ascii="Calibri" w:hAnsi="Calibri" w:cs="Calibri"/>
+        </w:rPr>
+      </w:pPr>
+      <w:r>
+        <w:rPr>
+          <w:rFonts w:cs="Arial" w:ascii="Arial" w:hAnsi="Arial"/>
+          <w:b/>
+          <w:bCs/>
+          <w:sz w:val="18"/>
         </w:rPr>
         <w:t xml:space="preserve">4. Durata e Scioglimento del Contratto </w:t>
       </w:r>
@@ -2973,14 +2973,14 @@
           <w:rFonts w:cs="Arial" w:ascii="Arial" w:hAnsi="Arial"/>
           <w:b/>
           <w:bCs/>
-          <w:sz w:val="16"/>
+          <w:sz w:val="18"/>
         </w:rPr>
         <w:t xml:space="preserve">4.1 </w:t>
       </w:r>
       <w:r>
         <w:rPr>
           <w:rFonts w:cs="Arial" w:ascii="Arial" w:hAnsi="Arial"/>
-          <w:sz w:val="16"/>
+          <w:sz w:val="18"/>
         </w:rPr>
         <w:t xml:space="preserve">Il presente Contratto è efficace dalla data di sottoscrizione fino alla conclusione di tutte le procedure relative all’Evento. </w:t>
       </w:r>
@@ -2999,14 +2999,14 @@
           <w:rFonts w:cs="Arial" w:ascii="Arial" w:hAnsi="Arial"/>
           <w:b/>
           <w:bCs/>
-          <w:sz w:val="16"/>
+          <w:sz w:val="18"/>
         </w:rPr>
         <w:t xml:space="preserve">4.2 </w:t>
       </w:r>
       <w:r>
         <w:rPr>
           <w:rFonts w:cs="Arial" w:ascii="Arial" w:hAnsi="Arial"/>
-          <w:sz w:val="16"/>
+          <w:sz w:val="18"/>
         </w:rPr>
         <w:t>Lo Sponsor avrà facoltà di risolvere di diritto il presente contratto, ai sensi e per gli effetti dall’Art. 1456 del cod. civ., tramite PEC qualora la Segreteria Organizzativa non adempia agli accordi stabiliti dal presente contratto.</w:t>
       </w:r>
@@ -3023,14 +3023,14 @@
           <w:rFonts w:cs="Arial" w:ascii="Arial" w:hAnsi="Arial"/>
           <w:b/>
           <w:bCs/>
-          <w:sz w:val="16"/>
+          <w:sz w:val="18"/>
         </w:rPr>
         <w:t xml:space="preserve">4.3 </w:t>
       </w:r>
       <w:r>
         <w:rPr>
           <w:rFonts w:cs="Arial" w:ascii="Arial" w:hAnsi="Arial"/>
-          <w:sz w:val="16"/>
+          <w:sz w:val="18"/>
         </w:rPr>
         <w:t xml:space="preserve">La Segreteria organizzativa avrà facoltà di risolvere di diritto il presente contratto, nei confronti dello Sponsor, ai sensi e per gli effetti dall’Art. 1456 del cod. civ., tramite pec: valet@pec.it nella quale dichiari di volersi avvalere della presente clausola, qualora quest’ultimo violi uno qualsiasi degli impegni assunti in premessa ed ai sensi degli artt. 1 e ss. del presente Contratto. </w:t>
       </w:r>
@@ -3047,14 +3047,14 @@
           <w:rFonts w:cs="Arial" w:ascii="Arial" w:hAnsi="Arial"/>
           <w:b/>
           <w:bCs/>
-          <w:sz w:val="16"/>
+          <w:sz w:val="18"/>
         </w:rPr>
         <w:t xml:space="preserve">4.4 </w:t>
       </w:r>
       <w:r>
         <w:rPr>
           <w:rFonts w:cs="Arial" w:ascii="Arial" w:hAnsi="Arial"/>
-          <w:sz w:val="16"/>
+          <w:sz w:val="18"/>
         </w:rPr>
         <w:t xml:space="preserve">In caso di scioglimento del presente contratto, per qualsiasi ragione ciò avvenga, o nel caso in cui l’Evento non venga svolto o venga interrotto e, comunque, al termine dell’Evento, la Segreteria Organizzativa e lo Sponsor dovranno astenersi dall’utilizzare qualsiasi materiale e/o informazione confidenziale acquisita in costanza di rapporto. </w:t>
       </w:r>
@@ -3071,25 +3071,25 @@
       <w:r>
         <w:rPr>
           <w:rFonts w:cs="Arial" w:ascii="Arial" w:hAnsi="Arial"/>
-          <w:sz w:val="16"/>
-        </w:rPr>
-      </w:r>
-    </w:p>
-    <w:p>
-      <w:pPr>
-        <w:pStyle w:val="Normal"/>
-        <w:spacing w:before="0" w:after="0" w:line="230" w:lineRule="auto"/>
-        <w:jc w:val="both"/>
-        <w:rPr>
-          <w:rFonts w:ascii="Calibri" w:hAnsi="Calibri" w:cs="Calibri"/>
-        </w:rPr>
-      </w:pPr>
-      <w:r>
-        <w:rPr>
-          <w:rFonts w:cs="Arial" w:ascii="Arial" w:hAnsi="Arial"/>
-          <w:b/>
-          <w:bCs/>
-          <w:sz w:val="16"/>
+          <w:sz w:val="18"/>
+        </w:rPr>
+      </w:r>
+    </w:p>
+    <w:p>
+      <w:pPr>
+        <w:pStyle w:val="Normal"/>
+        <w:spacing w:before="0" w:after="0" w:line="230" w:lineRule="auto"/>
+        <w:jc w:val="both"/>
+        <w:rPr>
+          <w:rFonts w:ascii="Calibri" w:hAnsi="Calibri" w:cs="Calibri"/>
+        </w:rPr>
+      </w:pPr>
+      <w:r>
+        <w:rPr>
+          <w:rFonts w:cs="Arial" w:ascii="Arial" w:hAnsi="Arial"/>
+          <w:b/>
+          <w:bCs/>
+          <w:sz w:val="18"/>
         </w:rPr>
         <w:t xml:space="preserve">5. Confidenzialità e riservatezza </w:t>
       </w:r>
@@ -3106,14 +3106,14 @@
           <w:rFonts w:cs="Arial" w:ascii="Arial" w:hAnsi="Arial"/>
           <w:b/>
           <w:bCs/>
-          <w:sz w:val="16"/>
+          <w:sz w:val="18"/>
         </w:rPr>
         <w:t xml:space="preserve">5.1 </w:t>
       </w:r>
       <w:r>
         <w:rPr>
           <w:rFonts w:cs="Arial" w:ascii="Arial" w:hAnsi="Arial"/>
-          <w:sz w:val="16"/>
+          <w:sz w:val="18"/>
         </w:rPr>
         <w:t>La Segreteria Organizzativa dichiara e garantisce che i dati personali relativi ai propri dipendenti e collaboratori, nonché ai partecipanti all’Evento e/o a terzi raccolti od utilizzati in occasione dell’Evento stesso (di seguito “</w:t>
       </w:r>
@@ -3122,14 +3122,14 @@
           <w:rFonts w:cs="Arial" w:ascii="Arial" w:hAnsi="Arial"/>
           <w:b/>
           <w:bCs/>
-          <w:sz w:val="16"/>
+          <w:sz w:val="18"/>
         </w:rPr>
         <w:t>Dati Personali</w:t>
       </w:r>
       <w:r>
         <w:rPr>
           <w:rFonts w:cs="Arial" w:ascii="Arial" w:hAnsi="Arial"/>
-          <w:sz w:val="16"/>
+          <w:sz w:val="18"/>
         </w:rPr>
         <w:t>”) saranno trattati in conformità a quanto stabilito dal D.Lgs. n. 196/2003 e successive modifiche ed integrazioni e dal nuovo Regolamento Europeo 679/2016 (di seguito “</w:t>
       </w:r>
@@ -3138,14 +3138,14 @@
           <w:rFonts w:cs="Arial" w:ascii="Arial" w:hAnsi="Arial"/>
           <w:b/>
           <w:bCs/>
-          <w:sz w:val="16"/>
+          <w:sz w:val="18"/>
         </w:rPr>
         <w:t>Codice della Privacy</w:t>
       </w:r>
       <w:r>
         <w:rPr>
           <w:rFonts w:cs="Arial" w:ascii="Arial" w:hAnsi="Arial"/>
-          <w:sz w:val="16"/>
+          <w:sz w:val="18"/>
         </w:rPr>
         <w:t xml:space="preserve">”). </w:t>
       </w:r>
@@ -3162,14 +3162,14 @@
           <w:rFonts w:cs="Arial" w:ascii="Arial" w:hAnsi="Arial"/>
           <w:b/>
           <w:bCs/>
-          <w:sz w:val="16"/>
+          <w:sz w:val="18"/>
         </w:rPr>
         <w:t xml:space="preserve">5.2 </w:t>
       </w:r>
       <w:r>
         <w:rPr>
           <w:rFonts w:cs="Arial" w:ascii="Arial" w:hAnsi="Arial"/>
-          <w:sz w:val="16"/>
+          <w:sz w:val="18"/>
         </w:rPr>
         <w:t xml:space="preserve">Resta peraltro inteso che, ai fini del Codice della Privacy, titolare del trattamento dei dati personali è e resterà la Segreteria Organizzativa in persona del suo legale rappresentante. </w:t>
       </w:r>
@@ -3186,25 +3186,25 @@
       <w:r>
         <w:rPr>
           <w:rFonts w:cs="Arial" w:ascii="Arial" w:hAnsi="Arial"/>
-          <w:sz w:val="16"/>
-        </w:rPr>
-      </w:r>
-    </w:p>
-    <w:p>
-      <w:pPr>
-        <w:pStyle w:val="Normal"/>
-        <w:spacing w:before="0" w:after="0" w:line="230" w:lineRule="auto"/>
-        <w:jc w:val="both"/>
-        <w:rPr>
-          <w:rFonts w:ascii="Calibri" w:hAnsi="Calibri" w:cs="Calibri"/>
-        </w:rPr>
-      </w:pPr>
-      <w:r>
-        <w:rPr>
-          <w:rFonts w:cs="Arial" w:ascii="Arial" w:hAnsi="Arial"/>
-          <w:b/>
-          <w:bCs/>
-          <w:sz w:val="16"/>
+          <w:sz w:val="18"/>
+        </w:rPr>
+      </w:r>
+    </w:p>
+    <w:p>
+      <w:pPr>
+        <w:pStyle w:val="Normal"/>
+        <w:spacing w:before="0" w:after="0" w:line="230" w:lineRule="auto"/>
+        <w:jc w:val="both"/>
+        <w:rPr>
+          <w:rFonts w:ascii="Calibri" w:hAnsi="Calibri" w:cs="Calibri"/>
+        </w:rPr>
+      </w:pPr>
+      <w:r>
+        <w:rPr>
+          <w:rFonts w:cs="Arial" w:ascii="Arial" w:hAnsi="Arial"/>
+          <w:b/>
+          <w:bCs/>
+          <w:sz w:val="18"/>
         </w:rPr>
         <w:t xml:space="preserve">6. Ulteriori obbligazioni delle Parti </w:t>
       </w:r>
@@ -3221,14 +3221,14 @@
           <w:rFonts w:cs="Arial" w:ascii="Arial" w:hAnsi="Arial"/>
           <w:b/>
           <w:bCs/>
-          <w:sz w:val="16"/>
+          <w:sz w:val="18"/>
         </w:rPr>
         <w:t xml:space="preserve">6.1 </w:t>
       </w:r>
       <w:r>
         <w:rPr>
           <w:rFonts w:cs="Arial" w:ascii="Arial" w:hAnsi="Arial"/>
-          <w:sz w:val="16"/>
+          <w:sz w:val="18"/>
         </w:rPr>
         <w:t xml:space="preserve">La Segreteria Organizzativa si impegna a conservare una completa ed accurata documentazione relativa ai propri rapporti con lo Sponsor per un periodo di tempo di durata non inferiore a cinque anni. </w:t>
       </w:r>
@@ -3245,25 +3245,25 @@
       <w:r>
         <w:rPr>
           <w:rFonts w:cs="Arial" w:ascii="Arial" w:hAnsi="Arial"/>
-          <w:sz w:val="16"/>
-        </w:rPr>
-      </w:r>
-    </w:p>
-    <w:p>
-      <w:pPr>
-        <w:pStyle w:val="Normal"/>
-        <w:spacing w:before="0" w:after="0" w:line="230" w:lineRule="auto"/>
-        <w:jc w:val="both"/>
-        <w:rPr>
-          <w:rFonts w:ascii="Calibri" w:hAnsi="Calibri" w:cs="Calibri"/>
-        </w:rPr>
-      </w:pPr>
-      <w:r>
-        <w:rPr>
-          <w:rFonts w:cs="Arial" w:ascii="Arial" w:hAnsi="Arial"/>
-          <w:b/>
-          <w:bCs/>
-          <w:sz w:val="16"/>
+          <w:sz w:val="18"/>
+        </w:rPr>
+      </w:r>
+    </w:p>
+    <w:p>
+      <w:pPr>
+        <w:pStyle w:val="Normal"/>
+        <w:spacing w:before="0" w:after="0" w:line="230" w:lineRule="auto"/>
+        <w:jc w:val="both"/>
+        <w:rPr>
+          <w:rFonts w:ascii="Calibri" w:hAnsi="Calibri" w:cs="Calibri"/>
+        </w:rPr>
+      </w:pPr>
+      <w:r>
+        <w:rPr>
+          <w:rFonts w:cs="Arial" w:ascii="Arial" w:hAnsi="Arial"/>
+          <w:b/>
+          <w:bCs/>
+          <w:sz w:val="18"/>
         </w:rPr>
         <w:t xml:space="preserve">7. Varie </w:t>
       </w:r>
@@ -3282,14 +3282,14 @@
           <w:rFonts w:cs="Arial" w:ascii="Arial" w:hAnsi="Arial"/>
           <w:b/>
           <w:bCs/>
-          <w:sz w:val="16"/>
+          <w:sz w:val="18"/>
         </w:rPr>
         <w:t xml:space="preserve">7.1 </w:t>
       </w:r>
       <w:r>
         <w:rPr>
           <w:rFonts w:cs="Arial" w:ascii="Arial" w:hAnsi="Arial"/>
-          <w:sz w:val="16"/>
+          <w:sz w:val="18"/>
         </w:rPr>
         <w:t xml:space="preserve">Le premesse e gli Allegati costituiscono parte integrante e sostanziale del presente contratto. </w:t>
       </w:r>
@@ -3306,32 +3306,32 @@
       <w:r>
         <w:rPr>
           <w:rFonts w:cs="Arial" w:ascii="Arial" w:hAnsi="Arial"/>
-          <w:sz w:val="16"/>
-        </w:rPr>
-      </w:r>
-    </w:p>
-    <w:p>
-      <w:pPr>
-        <w:pStyle w:val="Normal"/>
-        <w:spacing w:before="0" w:after="0" w:line="230" w:lineRule="auto"/>
-        <w:jc w:val="both"/>
-        <w:rPr>
-          <w:rFonts w:ascii="Calibri" w:hAnsi="Calibri" w:cs="Calibri"/>
-        </w:rPr>
-      </w:pPr>
-      <w:r>
-        <w:rPr>
-          <w:rFonts w:cs="Arial" w:ascii="Arial" w:hAnsi="Arial"/>
-          <w:b/>
-          <w:bCs/>
-          <w:sz w:val="16"/>
+          <w:sz w:val="18"/>
+        </w:rPr>
+      </w:r>
+    </w:p>
+    <w:p>
+      <w:pPr>
+        <w:pStyle w:val="Normal"/>
+        <w:spacing w:before="0" w:after="0" w:line="230" w:lineRule="auto"/>
+        <w:jc w:val="both"/>
+        <w:rPr>
+          <w:rFonts w:ascii="Calibri" w:hAnsi="Calibri" w:cs="Calibri"/>
+        </w:rPr>
+      </w:pPr>
+      <w:r>
+        <w:rPr>
+          <w:rFonts w:cs="Arial" w:ascii="Arial" w:hAnsi="Arial"/>
+          <w:b/>
+          <w:bCs/>
+          <w:sz w:val="18"/>
         </w:rPr>
         <w:t xml:space="preserve">7.2 </w:t>
       </w:r>
       <w:r>
         <w:rPr>
           <w:rFonts w:cs="Arial" w:ascii="Arial" w:hAnsi="Arial"/>
-          <w:sz w:val="16"/>
+          <w:sz w:val="18"/>
         </w:rPr>
         <w:t xml:space="preserve">Nessuna modifica al presente Contratto sarà efficace se non avverrà per iscritto e non sarà debitamente sottoscritta da tutte le Parti. </w:t>
       </w:r>
@@ -3348,7 +3348,7 @@
       <w:r>
         <w:rPr>
           <w:rFonts w:cs="Arial" w:ascii="Arial" w:hAnsi="Arial"/>
-          <w:sz w:val="16"/>
+          <w:sz w:val="18"/>
         </w:rPr>
         <w:t>Qualsiasi comunicazione fra le Parti avverrà per iscritto e dovrà essere effettuata unicamente ai reciproci indirizzi indicati nella prima parte del presente accordo</w:t>
       </w:r>
@@ -3365,32 +3365,32 @@
       <w:r>
         <w:rPr>
           <w:rFonts w:cs="Arial" w:ascii="Arial" w:hAnsi="Arial"/>
-          <w:sz w:val="16"/>
-        </w:rPr>
-      </w:r>
-    </w:p>
-    <w:p>
-      <w:pPr>
-        <w:pStyle w:val="Normal"/>
-        <w:spacing w:before="0" w:after="0" w:line="230" w:lineRule="auto"/>
-        <w:jc w:val="both"/>
-        <w:rPr>
-          <w:rFonts w:ascii="Calibri" w:hAnsi="Calibri" w:cs="Calibri"/>
-        </w:rPr>
-      </w:pPr>
-      <w:r>
-        <w:rPr>
-          <w:rFonts w:cs="Arial" w:ascii="Arial" w:hAnsi="Arial"/>
-          <w:b/>
-          <w:bCs/>
-          <w:sz w:val="16"/>
+          <w:sz w:val="18"/>
+        </w:rPr>
+      </w:r>
+    </w:p>
+    <w:p>
+      <w:pPr>
+        <w:pStyle w:val="Normal"/>
+        <w:spacing w:before="0" w:after="0" w:line="230" w:lineRule="auto"/>
+        <w:jc w:val="both"/>
+        <w:rPr>
+          <w:rFonts w:ascii="Calibri" w:hAnsi="Calibri" w:cs="Calibri"/>
+        </w:rPr>
+      </w:pPr>
+      <w:r>
+        <w:rPr>
+          <w:rFonts w:cs="Arial" w:ascii="Arial" w:hAnsi="Arial"/>
+          <w:b/>
+          <w:bCs/>
+          <w:sz w:val="18"/>
         </w:rPr>
         <w:t xml:space="preserve">7.3 </w:t>
       </w:r>
       <w:r>
         <w:rPr>
           <w:rFonts w:cs="Arial" w:ascii="Arial" w:hAnsi="Arial"/>
-          <w:sz w:val="16"/>
+          <w:sz w:val="18"/>
         </w:rPr>
         <w:t xml:space="preserve">Per qualsiasi controversia dovesse sorgere in relazione al presente Contratto, la sua interpretazione, esecuzione o risoluzione, sarà competente esclusivamente il Foro di Bologna. </w:t>
       </w:r>
@@ -3407,32 +3407,32 @@
       <w:r>
         <w:rPr>
           <w:rFonts w:cs="Arial" w:ascii="Arial" w:hAnsi="Arial"/>
-          <w:sz w:val="16"/>
-        </w:rPr>
-      </w:r>
-    </w:p>
-    <w:p>
-      <w:pPr>
-        <w:pStyle w:val="Normal"/>
-        <w:spacing w:before="0" w:after="0" w:line="230" w:lineRule="auto"/>
-        <w:jc w:val="both"/>
-        <w:rPr>
-          <w:rFonts w:ascii="Calibri" w:hAnsi="Calibri" w:cs="Calibri"/>
-        </w:rPr>
-      </w:pPr>
-      <w:r>
-        <w:rPr>
-          <w:rFonts w:cs="Arial" w:ascii="Arial" w:hAnsi="Arial"/>
-          <w:b/>
-          <w:bCs/>
-          <w:sz w:val="16"/>
+          <w:sz w:val="18"/>
+        </w:rPr>
+      </w:r>
+    </w:p>
+    <w:p>
+      <w:pPr>
+        <w:pStyle w:val="Normal"/>
+        <w:spacing w:before="0" w:after="0" w:line="230" w:lineRule="auto"/>
+        <w:jc w:val="both"/>
+        <w:rPr>
+          <w:rFonts w:ascii="Calibri" w:hAnsi="Calibri" w:cs="Calibri"/>
+        </w:rPr>
+      </w:pPr>
+      <w:r>
+        <w:rPr>
+          <w:rFonts w:cs="Arial" w:ascii="Arial" w:hAnsi="Arial"/>
+          <w:b/>
+          <w:bCs/>
+          <w:sz w:val="18"/>
         </w:rPr>
         <w:t xml:space="preserve">7.4 </w:t>
       </w:r>
       <w:r>
         <w:rPr>
           <w:rFonts w:cs="Arial" w:ascii="Arial" w:hAnsi="Arial"/>
-          <w:sz w:val="16"/>
+          <w:sz w:val="18"/>
         </w:rPr>
         <w:t>La Segreteria Organizzativa si impegna a non rivelare a terzi e/o utilizzare le informazioni aventi natura confidenziale relative allo Sponsor, intendendosi come tali dati, notizie e informazioni relativi a analisi, prodotti, attività, progetti, tecnologie, know-how, organizzazione, processi industriali e clienti dello Sponsor.</w:t>
       </w:r>
@@ -3449,7 +3449,7 @@
       <w:r>
         <w:rPr>
           <w:rFonts w:cs="Arial" w:ascii="Arial" w:hAnsi="Arial"/>
-          <w:sz w:val="16"/>
+          <w:sz w:val="18"/>
         </w:rPr>
       </w:r>
     </w:p>
@@ -3474,7 +3474,7 @@
           <w:rFonts w:cs="Arial" w:ascii="Arial" w:hAnsi="Arial"/>
           <w:b/>
           <w:bCs/>
-          <w:sz w:val="16"/>
+          <w:sz w:val="18"/>
           <w:szCs w:val="20"/>
         </w:rPr>
         <w:t xml:space="preserve">7.4 </w:t>
@@ -3482,7 +3482,7 @@
       <w:r>
         <w:rPr>
           <w:rFonts w:cs="Arial" w:ascii="Arial" w:hAnsi="Arial"/>
-          <w:sz w:val="16"/>
+          <w:sz w:val="18"/>
           <w:szCs w:val="20"/>
         </w:rPr>
         <w:t xml:space="preserve">Nel caso in cui la Manifestazione, per casi imprevisti o per una ragione di qualsiasi natura eccezionale ed imprevista, non potesse aver luogo, verrà data immediata comunicazione a tutti coloro che già abbiano presentato domanda di ammissione/partecipazione. In tal caso la Segreteria Organizzativa procederà ad una nuova programmazione e sarà facoltà dello Sponsor aderire o richiedere il rimborso di quando versato. Con il rimborso della somma predetta non potrà essere avanzata nei confronti della Segreteria Organizzativa altra richiesta di alcun genere per nessun titolo o causale. Nel caso in cui la Manifestazione dovesse per qualunque motivo subire una anticipata chiusura o una temporanea sospensione, indipendentemente dalla volontà della Segreteria Organizzativa, nessun indennizzo sarà dovuto agli Sponsor per nessun titolo o causale. </w:t>
@@ -3507,7 +3507,7 @@
           <w:rFonts w:cs="Arial" w:ascii="Arial" w:hAnsi="Arial"/>
           <w:b/>
           <w:bCs/>
-          <w:sz w:val="16"/>
+          <w:sz w:val="18"/>
           <w:szCs w:val="20"/>
         </w:rPr>
       </w:r>
@@ -3524,7 +3524,7 @@
       <w:r>
         <w:rPr>
           <w:rFonts w:eastAsia="Calibri" w:cs="Arial" w:ascii="Arial" w:hAnsi="Arial"/>
-          <w:sz w:val="16"/>
+          <w:sz w:val="18"/>
         </w:rPr>
         <w:t xml:space="preserve"> </w:t>
       </w:r>
@@ -3541,7 +3541,7 @@
       <w:r>
         <w:rPr>
           <w:rFonts w:cs="Arial" w:ascii="Arial" w:hAnsi="Arial"/>
-          <w:sz w:val="16"/>
+          <w:sz w:val="18"/>
         </w:rPr>
         <w:t>Bologna,  {{ contract.signed_date|format_date|default('___________', true) }}</w:t>
       </w:r>
@@ -3563,28 +3563,28 @@
           <w:rFonts w:cs="Arial" w:ascii="Arial" w:hAnsi="Arial"/>
           <w:b/>
           <w:bCs/>
-          <w:sz w:val="16"/>
-        </w:rPr>
-      </w:r>
-    </w:p>
-    <w:p>
-      <w:pPr>
-        <w:pStyle w:val="Normal"/>
-        <w:spacing w:before="0" w:after="0" w:line="230" w:lineRule="auto"/>
-        <w:jc w:val="both"/>
-        <w:rPr>
-          <w:rFonts w:ascii="Calibri" w:hAnsi="Calibri" w:cs="Calibri"/>
-          <w:b/>
-          <w:b/>
-          <w:bCs/>
-        </w:rPr>
-      </w:pPr>
-      <w:r>
-        <w:rPr>
-          <w:rFonts w:cs="Arial" w:ascii="Arial" w:hAnsi="Arial"/>
-          <w:b/>
-          <w:bCs/>
-          <w:sz w:val="16"/>
+          <w:sz w:val="18"/>
+        </w:rPr>
+      </w:r>
+    </w:p>
+    <w:p>
+      <w:pPr>
+        <w:pStyle w:val="Normal"/>
+        <w:spacing w:before="0" w:after="0" w:line="230" w:lineRule="auto"/>
+        <w:jc w:val="both"/>
+        <w:rPr>
+          <w:rFonts w:ascii="Calibri" w:hAnsi="Calibri" w:cs="Calibri"/>
+          <w:b/>
+          <w:b/>
+          <w:bCs/>
+        </w:rPr>
+      </w:pPr>
+      <w:r>
+        <w:rPr>
+          <w:rFonts w:cs="Arial" w:ascii="Arial" w:hAnsi="Arial"/>
+          <w:b/>
+          <w:bCs/>
+          <w:sz w:val="18"/>
         </w:rPr>
       </w:r>
     </w:p>
@@ -3603,7 +3603,7 @@
         <w:rPr>
           <w:rFonts w:ascii="Arial" w:hAnsi="Arial" w:cs="Arial"/>
           <w:b w:val="0"/>
-          <w:sz w:val="16"/>
+          <w:sz w:val="18"/>
         </w:rPr>
         <w:t>Sponsor</w:t>
       </w:r>
@@ -3611,7 +3611,7 @@
         <w:rPr>
           <w:rFonts w:ascii="Arial" w:hAnsi="Arial" w:cs="Arial"/>
           <w:b w:val="0"/>
-          <w:sz w:val="16"/>
+          <w:sz w:val="18"/>
         </w:rPr>
         <w:br/>
       </w:r>
@@ -3619,7 +3619,7 @@
         <w:rPr>
           <w:rFonts w:ascii="Arial" w:hAnsi="Arial" w:cs="Arial"/>
           <w:b/>
-          <w:sz w:val="16"/>
+          <w:sz w:val="18"/>
         </w:rPr>
         <w:t>{{ sponsor.legal_name }}</w:t>
       </w:r>
@@ -3627,7 +3627,7 @@
         <w:rPr>
           <w:rFonts w:ascii="Arial" w:hAnsi="Arial" w:cs="Arial"/>
           <w:b w:val="0"/>
-          <w:sz w:val="16"/>
+          <w:sz w:val="18"/>
         </w:rPr>
         <w:br/>
       </w:r>
@@ -3635,7 +3635,7 @@
         <w:rPr>
           <w:rFonts w:ascii="Arial" w:hAnsi="Arial" w:cs="Arial"/>
           <w:b/>
-          <w:sz w:val="16"/>
+          <w:sz w:val="18"/>
         </w:rPr>
         <w:t>{% if signer.full_name %}{{ signer.full_name }}</w:t>
         <w:br/>
@@ -3645,7 +3645,7 @@
         <w:rPr>
           <w:rFonts w:ascii="Arial" w:hAnsi="Arial" w:cs="Arial"/>
           <w:b w:val="0"/>
-          <w:sz w:val="16"/>
+          <w:sz w:val="18"/>
         </w:rPr>
         <w:t>_______________________________________</w:t>
       </w:r>
@@ -3664,7 +3664,7 @@
           <w:rFonts w:cs="Arial" w:ascii="Arial" w:hAnsi="Arial"/>
           <w:b/>
           <w:bCs/>
-          <w:sz w:val="16"/>
+          <w:sz w:val="18"/>
         </w:rPr>
         <w:t xml:space="preserve">Segreteria Organizzativa: </w:t>
       </w:r>
@@ -3681,7 +3681,7 @@
       <w:r>
         <w:rPr>
           <w:rFonts w:cs="Arial" w:ascii="Arial" w:hAnsi="Arial"/>
-          <w:sz w:val="16"/>
+          <w:sz w:val="18"/>
         </w:rPr>
         <w:t xml:space="preserve">VALET SRL </w:t>
       </w:r>
@@ -3698,7 +3698,7 @@
       <w:r>
         <w:rPr>
           <w:rFonts w:ascii="Arial" w:hAnsi="Arial" w:cs="Arial"/>
-          <w:sz w:val="16"/>
+          <w:sz w:val="18"/>
         </w:rPr>
         <w:drawing>
           <wp:anchor behindDoc="1" distT="0" distB="0" distL="114935" distR="114935" simplePos="0" locked="0" layoutInCell="0" allowOverlap="1" relativeHeight="2">
@@ -3750,7 +3750,7 @@
       <w:r>
         <w:rPr>
           <w:rFonts w:cs="Arial" w:ascii="Arial" w:hAnsi="Arial"/>
-          <w:sz w:val="16"/>
+          <w:sz w:val="18"/>
         </w:rPr>
         <w:t>Il legale Rappresentate</w:t>
       </w:r>
@@ -3767,7 +3767,7 @@
       <w:r>
         <w:rPr>
           <w:rFonts w:cs="Arial" w:ascii="Arial" w:hAnsi="Arial"/>
-          <w:sz w:val="16"/>
+          <w:sz w:val="18"/>
         </w:rPr>
         <w:t>(Daniele Morini)</w:t>
       </w:r>
@@ -3784,7 +3784,7 @@
       <w:r>
         <w:rPr>
           <w:rFonts w:cs="Arial" w:ascii="Arial" w:hAnsi="Arial"/>
-          <w:sz w:val="16"/>
+          <w:sz w:val="18"/>
         </w:rPr>
         <w:t>____________________</w:t>
       </w:r>

</xml_diff>

<commit_message>
Contratto: piu' spazio prima del footer, firma Sponsor centrata, rimossa riga extra
</commit_message>
<xml_diff>
--- a/contracts/templates_pdf/template_contratto_sponsor_non_ecm_it.docx
+++ b/contracts/templates_pdf/template_contratto_sponsor_non_ecm_it.docx
@@ -3607,47 +3607,47 @@
         </w:rPr>
         <w:t>Sponsor</w:t>
       </w:r>
+    </w:p>
+    <w:p>
+      <w:pPr>
+        <w:spacing w:before="0" w:after="0"/>
+        <w:jc w:val="center"/>
+      </w:pPr>
+      <w:r>
+        <w:rPr>
+          <w:rFonts w:ascii="Arial" w:hAnsi="Arial" w:cs="Arial"/>
+          <w:b/>
+          <w:sz w:val="18"/>
+        </w:rPr>
+        <w:t>{{ sponsor.legal_name }}</w:t>
+      </w:r>
+    </w:p>
+    <w:p>
+      <w:pPr>
+        <w:spacing w:before="0" w:after="0"/>
+        <w:jc w:val="center"/>
+      </w:pPr>
+      <w:r>
+        <w:rPr>
+          <w:rFonts w:ascii="Arial" w:hAnsi="Arial" w:cs="Arial"/>
+          <w:b/>
+          <w:sz w:val="18"/>
+        </w:rPr>
+        <w:t>{% if signer.full_name %}{{ signer.full_name }}{% endif %}</w:t>
+      </w:r>
+    </w:p>
+    <w:p>
+      <w:pPr>
+        <w:spacing w:before="0" w:after="0"/>
+        <w:jc w:val="center"/>
+      </w:pPr>
       <w:r>
         <w:rPr>
           <w:rFonts w:ascii="Arial" w:hAnsi="Arial" w:cs="Arial"/>
           <w:b w:val="0"/>
           <w:sz w:val="18"/>
         </w:rPr>
-        <w:br/>
-      </w:r>
-      <w:r>
-        <w:rPr>
-          <w:rFonts w:ascii="Arial" w:hAnsi="Arial" w:cs="Arial"/>
-          <w:b/>
-          <w:sz w:val="18"/>
-        </w:rPr>
-        <w:t>{{ sponsor.legal_name }}</w:t>
-      </w:r>
-      <w:r>
-        <w:rPr>
-          <w:rFonts w:ascii="Arial" w:hAnsi="Arial" w:cs="Arial"/>
-          <w:b w:val="0"/>
-          <w:sz w:val="18"/>
-        </w:rPr>
-        <w:br/>
-      </w:r>
-      <w:r>
-        <w:rPr>
-          <w:rFonts w:ascii="Arial" w:hAnsi="Arial" w:cs="Arial"/>
-          <w:b/>
-          <w:sz w:val="18"/>
-        </w:rPr>
-        <w:t>{% if signer.full_name %}{{ signer.full_name }}</w:t>
-        <w:br/>
-        <w:t>{% endif %}</w:t>
-      </w:r>
-      <w:r>
-        <w:rPr>
-          <w:rFonts w:ascii="Arial" w:hAnsi="Arial" w:cs="Arial"/>
-          <w:b w:val="0"/>
-          <w:sz w:val="18"/>
-        </w:rPr>
-        <w:t>_______________________________________</w:t>
+        <w:t>_______________________________</w:t>
       </w:r>
     </w:p>
     <w:p>
@@ -3794,7 +3794,7 @@
       <w:footerReference w:type="default" r:id="rId4"/>
       <w:type w:val="nextPage"/>
       <w:pgSz w:w="11906" w:h="16838"/>
-      <w:pgMar w:left="850" w:right="850" w:gutter="0" w:header="426" w:top="567" w:footer="468" w:bottom="510"/>
+      <w:pgMar w:left="850" w:right="850" w:gutter="0" w:header="426" w:top="567" w:footer="468" w:bottom="1020"/>
       <w:pgNumType w:fmt="decimal"/>
       <w:formProt w:val="false"/>
       <w:textDirection w:val="lrTb"/>

</xml_diff>

<commit_message>
Contratto: REA su una riga, riga 'denominato Sponsor', 'con gli occorrenti poteri', sede completa (citta/sede/indirizzo) al punto a) e nel preventivo, riscrittura 1.6b, rimozione 1.6c ridondante, 7.4 manifestazione/evento/congresso, eliminato 1.8 (1.9->1.8)
</commit_message>
<xml_diff>
--- a/contracts/templates_pdf/template_contratto_sponsor_non_ecm_it.docx
+++ b/contracts/templates_pdf/template_contratto_sponsor_non_ecm_it.docx
@@ -384,7 +384,7 @@
           <w:rFonts w:cs="Arial" w:ascii="Arial" w:hAnsi="Arial"/>
           <w:sz w:val="18"/>
         </w:rPr>
-        <w:t>Fiscale: MRN DNL 65L23 C265S occorrenti poteri (denominata di seguito come “</w:t>
+        <w:t>Fiscale: MRN DNL 65L23 C265S con gli occorrenti poteri (denominata di seguito come “</w:t>
       </w:r>
       <w:r>
         <w:rPr>
@@ -1828,6 +1828,27 @@
     </w:p>
     <w:p>
       <w:pPr>
+        <w:jc w:val="both"/>
+      </w:pPr>
+      <w:r>
+        <w:rPr>
+          <w:rFonts w:ascii="Arial" w:hAnsi="Arial" w:cs="Arial"/>
+          <w:b w:val="0"/>
+          <w:sz w:val="18"/>
+        </w:rPr>
+        <w:t xml:space="preserve">di seguito denominato </w:t>
+      </w:r>
+      <w:r>
+        <w:rPr>
+          <w:rFonts w:ascii="Arial" w:hAnsi="Arial" w:cs="Arial"/>
+          <w:b/>
+          <w:sz w:val="18"/>
+        </w:rPr>
+        <w:t>“Sponsor”</w:t>
+      </w:r>
+    </w:p>
+    <w:p>
+      <w:pPr>
         <w:pStyle w:val="Normal"/>
         <w:spacing w:before="0" w:after="0" w:line="230" w:lineRule="auto"/>
         <w:jc w:val="center"/>
@@ -1883,7 +1904,7 @@
           <w:bCs/>
           <w:sz w:val="18"/>
         </w:rPr>
-        <w:t xml:space="preserve">a) La Segreteria Organizzativa, soggetto con esperienza comprovata, attivo nel campo dell’organizzazione e/o realizzazione di eventi nel rispetto dell’art. 124 del D. Lgs. 24 aprile 2006, n. 219, intende acquisire sponsorizzazioni per assicurarsi finanziamenti per la realizzazione dell’evento {{ event.name }} che si svolgerà a {{ event.location }} il {{ event.start_date|format_date }}{% if event.end_date and event.end_date != event.start_date %} – {{ event.end_date|format_date }}{% endif %} e destinato alla formazione di operatori sanitari; </w:t>
+        <w:t xml:space="preserve">a) La Segreteria Organizzativa, soggetto con esperienza comprovata, attivo nel campo dell’organizzazione e/o realizzazione di eventi nel rispetto dell’art. 124 del D. Lgs. 24 aprile 2006, n. 219, intende acquisire sponsorizzazioni per assicurarsi finanziamenti per la realizzazione dell’evento {{ event.name }}{% if event.sede_completa %}, {{ event.sede_completa }}{% endif %} che si svolgerà il {{ event.start_date|format_date }}{% if event.end_date and event.end_date != event.start_date %} – {{ event.end_date|format_date }}{% endif %} e destinato alla formazione di operatori sanitari; </w:t>
       </w:r>
     </w:p>
     <w:p>
@@ -2584,7 +2605,7 @@
         </w:rPr>
         <w:t>b) mettere a disposizione dello Sponsor quanto indicato nell’allegato 1) per l’esposizione ed illustrazione, da parte di personale qualificato e autorizzato dallo Sponsor, delle caratteristiche tecnico-scientifiche dei prodotti rientranti nel settore merceologico inerente l’evento che si svolgerà come specificato all’inizio del presente accordo.</w:t>
         <w:br/>
-        <w:t xml:space="preserve">La Segreteria Organizzativa si impegna altresì a permettere al personale autorizzato dallo Sponsor di accedere allo Stand anche al di fuori dell’orario di svolgimento dell’evento per finalità pratico-organizzative;  </w:t>
+        <w:t>La Segreteria Organizzativa si impegna altresì a consentire al personale autorizzato dallo Sponsor l’accesso allo Stand anche al di fuori dell’orario di svolgimento dell’evento, esclusivamente per finalità pratico-organizzative e comunque nei limiti degli orari messi a disposizione dalla Segreteria per gli Sponsor.</w:t>
       </w:r>
     </w:p>
     <w:p>
@@ -2614,22 +2635,6 @@
     </w:p>
     <w:p>
       <w:pPr>
-        <w:pStyle w:val="Default"/>
-        <w:spacing w:before="0" w:after="0" w:line="230" w:lineRule="auto"/>
-        <w:jc w:val="both"/>
-        <w:rPr/>
-      </w:pPr>
-      <w:r>
-        <w:rPr>
-          <w:rFonts w:cs="Arial" w:ascii="Arial" w:hAnsi="Arial"/>
-          <w:sz w:val="18"/>
-          <w:szCs w:val="20"/>
-        </w:rPr>
-        <w:t xml:space="preserve">La Segreteria Organizzativa potrà avvalersi, nell’esecuzione delle attività di cui sopra, anche di altri soggetti Partner, ai quali potrà delegare in tutto o in parte l’effettuazione delle attività stesse. </w:t>
-      </w:r>
-    </w:p>
-    <w:p>
-      <w:pPr>
         <w:pStyle w:val="Normal"/>
         <w:spacing w:before="0" w:after="0" w:line="230" w:lineRule="auto"/>
         <w:jc w:val="both"/>
@@ -2655,32 +2660,6 @@
           <w:sz w:val="18"/>
         </w:rPr>
         <w:t xml:space="preserve">La Segreteria Organizzativa fornirà allo Sponsor, su sua specifica richiesta, almeno 70 giorni prima dell’inizio dell’Evento, il programma definitivo, la documentazione e tutte le informazioni necessarie per procedere alla richiesta di autorizzazione all’AIFA prevista dall’art. 124 del D.Lgs. 219/2006, se applicabile. </w:t>
-      </w:r>
-    </w:p>
-    <w:p>
-      <w:pPr>
-        <w:pStyle w:val="Normal"/>
-        <w:spacing w:before="0" w:after="0" w:line="230" w:lineRule="auto"/>
-        <w:jc w:val="both"/>
-        <w:rPr>
-          <w:rFonts w:ascii="Calibri" w:hAnsi="Calibri" w:cs="Calibri"/>
-        </w:rPr>
-      </w:pPr>
-      <w:r>
-        <w:rPr>
-          <w:rFonts w:cs="Arial" w:ascii="Arial" w:hAnsi="Arial"/>
-          <w:b/>
-          <w:bCs/>
-          <w:sz w:val="18"/>
-        </w:rPr>
-        <w:t xml:space="preserve">1.8 </w:t>
-      </w:r>
-      <w:r>
-        <w:rPr>
-          <w:rFonts w:cs="Arial" w:ascii="Arial" w:hAnsi="Arial"/>
-          <w:sz w:val="18"/>
-        </w:rPr>
-        <w:t>La Segreteria Organizzativa si impegna a conservare una completa ed accurata documentazione relativa ai propri rapporti con lo Sponsor per un periodo di durata non inferiore a cinque anni.</w:t>
       </w:r>
     </w:p>
     <w:p>
@@ -2701,7 +2680,7 @@
           <w:sz w:val="18"/>
           <w:szCs w:val="20"/>
         </w:rPr>
-        <w:t xml:space="preserve">1.9 </w:t>
+        <w:t xml:space="preserve">1.8 </w:t>
       </w:r>
       <w:r>
         <w:rPr>
@@ -3485,7 +3464,7 @@
           <w:sz w:val="18"/>
           <w:szCs w:val="20"/>
         </w:rPr>
-        <w:t xml:space="preserve">Nel caso in cui la Manifestazione, per casi imprevisti o per una ragione di qualsiasi natura eccezionale ed imprevista, non potesse aver luogo, verrà data immediata comunicazione a tutti coloro che già abbiano presentato domanda di ammissione/partecipazione. In tal caso la Segreteria Organizzativa procederà ad una nuova programmazione e sarà facoltà dello Sponsor aderire o richiedere il rimborso di quando versato. Con il rimborso della somma predetta non potrà essere avanzata nei confronti della Segreteria Organizzativa altra richiesta di alcun genere per nessun titolo o causale. Nel caso in cui la Manifestazione dovesse per qualunque motivo subire una anticipata chiusura o una temporanea sospensione, indipendentemente dalla volontà della Segreteria Organizzativa, nessun indennizzo sarà dovuto agli Sponsor per nessun titolo o causale. </w:t>
+        <w:t xml:space="preserve">Nel caso in cui la manifestazione, evento, congresso, per casi imprevisti o per una ragione di qualsiasi natura eccezionale ed imprevista, non potesse aver luogo, verrà data immediata comunicazione a tutti coloro che già abbiano presentato domanda di ammissione/partecipazione. In tal caso la Segreteria Organizzativa procederà ad una nuova programmazione e sarà facoltà dello Sponsor aderire o richiedere il rimborso di quando versato. Con il rimborso della somma predetta non potrà essere avanzata nei confronti della Segreteria Organizzativa altra richiesta di alcun genere per nessun titolo o causale. Nel caso in cui la manifestazione, evento, congresso dovesse per qualunque motivo subire una anticipata chiusura o una temporanea sospensione, indipendentemente dalla volontà della Segreteria Organizzativa, nessun indennizzo sarà dovuto agli Sponsor per nessun titolo o causale. </w:t>
       </w:r>
     </w:p>
     <w:p>

</xml_diff>

<commit_message>
Domanda/Contratto: blocco firma non spezzabile tra pagine (keep_together + keep_with_next)
</commit_message>
<xml_diff>
--- a/contracts/templates_pdf/template_contratto_sponsor_non_ecm_it.docx
+++ b/contracts/templates_pdf/template_contratto_sponsor_non_ecm_it.docx
@@ -3570,6 +3570,8 @@
     <w:p>
       <w:pPr>
         <w:pStyle w:val="Normal"/>
+        <w:keepNext/>
+        <w:keepLines/>
         <w:spacing w:before="0" w:after="0" w:line="230" w:lineRule="auto"/>
         <w:ind w:left="7090" w:firstLine="709"/>
         <w:jc w:val="center"/>
@@ -3589,6 +3591,8 @@
     </w:p>
     <w:p>
       <w:pPr>
+        <w:keepNext/>
+        <w:keepLines/>
         <w:spacing w:before="0" w:after="0"/>
         <w:jc w:val="center"/>
       </w:pPr>
@@ -3603,6 +3607,8 @@
     </w:p>
     <w:p>
       <w:pPr>
+        <w:keepNext/>
+        <w:keepLines/>
         <w:spacing w:before="0" w:after="0"/>
         <w:jc w:val="center"/>
       </w:pPr>
@@ -3617,6 +3623,8 @@
     </w:p>
     <w:p>
       <w:pPr>
+        <w:keepNext/>
+        <w:keepLines/>
         <w:spacing w:before="0" w:after="0"/>
         <w:jc w:val="center"/>
       </w:pPr>
@@ -3632,6 +3640,8 @@
     <w:p>
       <w:pPr>
         <w:pStyle w:val="Normal"/>
+        <w:keepNext/>
+        <w:keepLines/>
         <w:spacing w:before="0" w:after="0" w:line="230" w:lineRule="auto"/>
         <w:jc w:val="both"/>
         <w:rPr>
@@ -3651,6 +3661,8 @@
     <w:p>
       <w:pPr>
         <w:pStyle w:val="Normal"/>
+        <w:keepNext/>
+        <w:keepLines/>
         <w:spacing w:before="0" w:after="0" w:line="230" w:lineRule="auto"/>
         <w:jc w:val="both"/>
         <w:rPr>
@@ -3668,6 +3680,8 @@
     <w:p>
       <w:pPr>
         <w:pStyle w:val="Normal"/>
+        <w:keepNext/>
+        <w:keepLines/>
         <w:spacing w:before="0" w:after="0" w:line="230" w:lineRule="auto"/>
         <w:jc w:val="both"/>
         <w:rPr>
@@ -3737,6 +3751,8 @@
     <w:p>
       <w:pPr>
         <w:pStyle w:val="Normal"/>
+        <w:keepNext/>
+        <w:keepLines/>
         <w:spacing w:before="0" w:after="0" w:line="230" w:lineRule="auto"/>
         <w:jc w:val="both"/>
         <w:rPr>
@@ -3754,6 +3770,8 @@
     <w:p>
       <w:pPr>
         <w:pStyle w:val="Normal"/>
+        <w:keepNext w:val="0"/>
+        <w:keepLines/>
         <w:spacing w:before="0" w:after="0" w:line="230" w:lineRule="auto"/>
         <w:jc w:val="both"/>
         <w:rPr>

</xml_diff>

<commit_message>
Contratto: tabella dati cliente REA su una riga ("n° REA" senza "al"); sotto-punti 1.6/1.7/1.8 giustificati
</commit_message>
<xml_diff>
--- a/contracts/templates_pdf/template_contratto_sponsor_non_ecm_it.docx
+++ b/contracts/templates_pdf/template_contratto_sponsor_non_ecm_it.docx
@@ -1153,7 +1153,7 @@
                 <w:rFonts w:cs="Arial" w:ascii="Arial" w:hAnsi="Arial"/>
                 <w:sz w:val="18"/>
               </w:rPr>
-              <w:t>al n° REA</w:t>
+              <w:t>n° REA</w:t>
             </w:r>
           </w:p>
         </w:tc>
@@ -2594,7 +2594,7 @@
           <w:tab w:val="left" w:pos="284" w:leader="none"/>
         </w:tabs>
         <w:spacing w:before="0" w:after="0" w:line="230" w:lineRule="auto"/>
-        <w:jc w:val="left"/>
+        <w:jc w:val="both"/>
         <w:rPr/>
       </w:pPr>
       <w:r>

</xml_diff>

<commit_message>
Contratto sponsor: firme affiancate in tabella 2 colonne (Segreteria a sinistra, Sponsor a destra centrato sotto la parola Sponsor, stesso livello)
</commit_message>
<xml_diff>
--- a/contracts/templates_pdf/template_contratto_sponsor_non_ecm_it.docx
+++ b/contracts/templates_pdf/template_contratto_sponsor_non_ecm_it.docx
@@ -3567,225 +3567,247 @@
         </w:rPr>
       </w:r>
     </w:p>
-    <w:p>
-      <w:pPr>
-        <w:pStyle w:val="Normal"/>
-        <w:keepNext/>
-        <w:keepLines/>
-        <w:spacing w:before="0" w:after="0" w:line="230" w:lineRule="auto"/>
-        <w:ind w:left="7090" w:firstLine="709"/>
-        <w:jc w:val="center"/>
-        <w:rPr>
-          <w:rFonts w:ascii="Calibri" w:hAnsi="Calibri" w:cs="Calibri"/>
-          <w:highlight w:val="cyan"/>
-        </w:rPr>
-      </w:pPr>
-      <w:r>
-        <w:rPr>
-          <w:rFonts w:ascii="Arial" w:hAnsi="Arial" w:cs="Arial"/>
-          <w:b w:val="0"/>
-          <w:sz w:val="18"/>
-        </w:rPr>
-        <w:t>Sponsor</w:t>
-      </w:r>
-    </w:p>
-    <w:p>
-      <w:pPr>
-        <w:keepNext/>
-        <w:keepLines/>
-        <w:spacing w:before="0" w:after="0"/>
-        <w:jc w:val="center"/>
-      </w:pPr>
-      <w:r>
-        <w:rPr>
-          <w:rFonts w:ascii="Arial" w:hAnsi="Arial" w:cs="Arial"/>
-          <w:b/>
-          <w:sz w:val="18"/>
-        </w:rPr>
-        <w:t>{{ sponsor.legal_name }}</w:t>
-      </w:r>
-    </w:p>
-    <w:p>
-      <w:pPr>
-        <w:keepNext/>
-        <w:keepLines/>
-        <w:spacing w:before="0" w:after="0"/>
-        <w:jc w:val="center"/>
-      </w:pPr>
-      <w:r>
-        <w:rPr>
-          <w:rFonts w:ascii="Arial" w:hAnsi="Arial" w:cs="Arial"/>
-          <w:b/>
-          <w:sz w:val="18"/>
-        </w:rPr>
-        <w:t>{% if signer.full_name %}{{ signer.full_name }}{% endif %}</w:t>
-      </w:r>
-    </w:p>
-    <w:p>
-      <w:pPr>
-        <w:keepNext/>
-        <w:keepLines/>
-        <w:spacing w:before="0" w:after="0"/>
-        <w:jc w:val="center"/>
-      </w:pPr>
-      <w:r>
-        <w:rPr>
-          <w:rFonts w:ascii="Arial" w:hAnsi="Arial" w:cs="Arial"/>
-          <w:b w:val="0"/>
-          <w:sz w:val="18"/>
-        </w:rPr>
-        <w:t>_______________________________</w:t>
-      </w:r>
-    </w:p>
-    <w:p>
-      <w:pPr>
-        <w:pStyle w:val="Normal"/>
-        <w:keepNext/>
-        <w:keepLines/>
-        <w:spacing w:before="0" w:after="0" w:line="230" w:lineRule="auto"/>
-        <w:jc w:val="both"/>
-        <w:rPr>
-          <w:rFonts w:ascii="Calibri" w:hAnsi="Calibri" w:cs="Calibri"/>
-        </w:rPr>
-      </w:pPr>
-      <w:r>
-        <w:rPr>
-          <w:rFonts w:cs="Arial" w:ascii="Arial" w:hAnsi="Arial"/>
-          <w:b/>
-          <w:bCs/>
-          <w:sz w:val="18"/>
-        </w:rPr>
-        <w:t xml:space="preserve">Segreteria Organizzativa: </w:t>
-      </w:r>
-    </w:p>
-    <w:p>
-      <w:pPr>
-        <w:pStyle w:val="Normal"/>
-        <w:keepNext/>
-        <w:keepLines/>
-        <w:spacing w:before="0" w:after="0" w:line="230" w:lineRule="auto"/>
-        <w:jc w:val="both"/>
-        <w:rPr>
-          <w:rFonts w:ascii="Calibri" w:hAnsi="Calibri" w:cs="Calibri"/>
-        </w:rPr>
-      </w:pPr>
-      <w:r>
-        <w:rPr>
-          <w:rFonts w:cs="Arial" w:ascii="Arial" w:hAnsi="Arial"/>
-          <w:sz w:val="18"/>
-        </w:rPr>
-        <w:t xml:space="preserve">VALET SRL </w:t>
-      </w:r>
-    </w:p>
-    <w:p>
-      <w:pPr>
-        <w:pStyle w:val="Normal"/>
-        <w:keepNext/>
-        <w:keepLines/>
-        <w:spacing w:before="0" w:after="0" w:line="230" w:lineRule="auto"/>
-        <w:jc w:val="both"/>
-        <w:rPr>
-          <w:rFonts w:ascii="Calibri" w:hAnsi="Calibri" w:cs="Calibri"/>
-        </w:rPr>
-      </w:pPr>
-      <w:r>
-        <w:rPr>
-          <w:rFonts w:ascii="Arial" w:hAnsi="Arial" w:cs="Arial"/>
-          <w:sz w:val="18"/>
-        </w:rPr>
-        <w:drawing>
-          <wp:anchor behindDoc="1" distT="0" distB="0" distL="114935" distR="114935" simplePos="0" locked="0" layoutInCell="0" allowOverlap="1" relativeHeight="2">
-            <wp:simplePos x="0" y="0"/>
-            <wp:positionH relativeFrom="column">
-              <wp:posOffset>0</wp:posOffset>
-            </wp:positionH>
-            <wp:positionV relativeFrom="paragraph">
-              <wp:posOffset>107315</wp:posOffset>
-            </wp:positionV>
-            <wp:extent cx="1489710" cy="590550"/>
-            <wp:effectExtent l="0" t="0" r="0" b="0"/>
-            <wp:wrapNone/>
-            <wp:docPr id="1" name="Image1" descr=""/>
-            <wp:cNvGraphicFramePr>
-              <a:graphicFrameLocks xmlns:a="http://schemas.openxmlformats.org/drawingml/2006/main" noChangeAspect="1"/>
-            </wp:cNvGraphicFramePr>
-            <a:graphic xmlns:a="http://schemas.openxmlformats.org/drawingml/2006/main">
-              <a:graphicData uri="http://schemas.openxmlformats.org/drawingml/2006/picture">
-                <pic:pic xmlns:pic="http://schemas.openxmlformats.org/drawingml/2006/picture">
-                  <pic:nvPicPr>
-                    <pic:cNvPr id="1" name="Image1" descr=""/>
-                    <pic:cNvPicPr>
-                      <a:picLocks noChangeAspect="1" noChangeArrowheads="1"/>
-                    </pic:cNvPicPr>
-                  </pic:nvPicPr>
-                  <pic:blipFill>
-                    <a:blip r:embed="rId2"/>
-                    <a:srcRect l="-12" t="-31" r="-12" b="-31"/>
-                    <a:stretch>
-                      <a:fillRect/>
-                    </a:stretch>
-                  </pic:blipFill>
-                  <pic:spPr bwMode="auto">
-                    <a:xfrm>
-                      <a:off x="0" y="0"/>
-                      <a:ext cx="1489710" cy="590550"/>
-                    </a:xfrm>
-                    <a:prstGeom prst="rect">
-                      <a:avLst/>
-                    </a:prstGeom>
-                  </pic:spPr>
-                </pic:pic>
-              </a:graphicData>
-            </a:graphic>
-          </wp:anchor>
-        </w:drawing>
-      </w:r>
-      <w:r>
-        <w:rPr>
-          <w:rFonts w:cs="Arial" w:ascii="Arial" w:hAnsi="Arial"/>
-          <w:sz w:val="18"/>
-        </w:rPr>
-        <w:t>Il legale Rappresentate</w:t>
-      </w:r>
-    </w:p>
-    <w:p>
-      <w:pPr>
-        <w:pStyle w:val="Normal"/>
-        <w:keepNext/>
-        <w:keepLines/>
-        <w:spacing w:before="0" w:after="0" w:line="230" w:lineRule="auto"/>
-        <w:jc w:val="both"/>
-        <w:rPr>
-          <w:rFonts w:ascii="Calibri" w:hAnsi="Calibri" w:cs="Calibri"/>
-        </w:rPr>
-      </w:pPr>
-      <w:r>
-        <w:rPr>
-          <w:rFonts w:cs="Arial" w:ascii="Arial" w:hAnsi="Arial"/>
-          <w:sz w:val="18"/>
-        </w:rPr>
-        <w:t>(Daniele Morini)</w:t>
-      </w:r>
-    </w:p>
-    <w:p>
-      <w:pPr>
-        <w:pStyle w:val="Normal"/>
-        <w:keepNext w:val="0"/>
-        <w:keepLines/>
-        <w:spacing w:before="0" w:after="0" w:line="230" w:lineRule="auto"/>
-        <w:jc w:val="both"/>
-        <w:rPr>
-          <w:rFonts w:ascii="Calibri" w:hAnsi="Calibri" w:cs="Calibri"/>
-        </w:rPr>
-      </w:pPr>
-      <w:r>
-        <w:rPr>
-          <w:rFonts w:cs="Arial" w:ascii="Arial" w:hAnsi="Arial"/>
-          <w:sz w:val="18"/>
-        </w:rPr>
-        <w:t>____________________</w:t>
-      </w:r>
-    </w:p>
+    <w:tbl>
+      <w:tblPr>
+        <w:tblW w:type="auto" w:w="0"/>
+        <w:tblLayout w:type="autofit"/>
+        <w:tblLook w:firstColumn="1" w:firstRow="1" w:lastColumn="0" w:lastRow="0" w:noHBand="0" w:noVBand="1" w:val="04A0"/>
+        <w:tblBorders>
+          <w:top w:val="nil"/>
+          <w:left w:val="nil"/>
+          <w:bottom w:val="nil"/>
+          <w:right w:val="nil"/>
+          <w:insideH w:val="nil"/>
+          <w:insideV w:val="nil"/>
+        </w:tblBorders>
+      </w:tblPr>
+      <w:tblGrid>
+        <w:gridCol w:w="5103"/>
+        <w:gridCol w:w="5103"/>
+      </w:tblGrid>
+      <w:tr>
+        <w:tc>
+          <w:tcPr>
+            <w:tcW w:type="dxa" w:w="4819"/>
+          </w:tcPr>
+          <w:p>
+            <w:pPr>
+              <w:pStyle w:val="Normal"/>
+              <w:keepNext/>
+              <w:keepLines/>
+              <w:spacing w:before="0" w:after="0" w:line="230" w:lineRule="auto"/>
+              <w:jc w:val="left"/>
+              <w:rPr>
+                <w:rFonts w:ascii="Calibri" w:hAnsi="Calibri" w:cs="Calibri"/>
+              </w:rPr>
+            </w:pPr>
+            <w:r>
+              <w:rPr>
+                <w:rFonts w:cs="Arial" w:ascii="Arial" w:hAnsi="Arial"/>
+                <w:b/>
+                <w:bCs/>
+                <w:sz w:val="18"/>
+              </w:rPr>
+              <w:t xml:space="preserve">Segreteria Organizzativa: </w:t>
+            </w:r>
+          </w:p>
+          <w:p>
+            <w:pPr>
+              <w:pStyle w:val="Normal"/>
+              <w:keepNext/>
+              <w:keepLines/>
+              <w:spacing w:before="0" w:after="0" w:line="230" w:lineRule="auto"/>
+              <w:jc w:val="left"/>
+              <w:rPr>
+                <w:rFonts w:ascii="Calibri" w:hAnsi="Calibri" w:cs="Calibri"/>
+              </w:rPr>
+            </w:pPr>
+            <w:r>
+              <w:rPr>
+                <w:rFonts w:cs="Arial" w:ascii="Arial" w:hAnsi="Arial"/>
+                <w:sz w:val="18"/>
+              </w:rPr>
+              <w:t xml:space="preserve">VALET SRL </w:t>
+            </w:r>
+          </w:p>
+          <w:p>
+            <w:pPr>
+              <w:pStyle w:val="Normal"/>
+              <w:keepNext/>
+              <w:keepLines/>
+              <w:spacing w:before="0" w:after="0" w:line="230" w:lineRule="auto"/>
+              <w:jc w:val="left"/>
+              <w:rPr>
+                <w:rFonts w:ascii="Calibri" w:hAnsi="Calibri" w:cs="Calibri"/>
+              </w:rPr>
+            </w:pPr>
+            <w:r>
+              <w:rPr>
+                <w:rFonts w:ascii="Arial" w:hAnsi="Arial" w:cs="Arial"/>
+                <w:sz w:val="18"/>
+              </w:rPr>
+              <w:drawing>
+                <wp:anchor behindDoc="1" distT="0" distB="0" distL="114935" distR="114935" simplePos="0" locked="0" layoutInCell="0" allowOverlap="1" relativeHeight="2">
+                  <wp:simplePos x="0" y="0"/>
+                  <wp:positionH relativeFrom="column">
+                    <wp:posOffset>0</wp:posOffset>
+                  </wp:positionH>
+                  <wp:positionV relativeFrom="paragraph">
+                    <wp:posOffset>107315</wp:posOffset>
+                  </wp:positionV>
+                  <wp:extent cx="1489710" cy="590550"/>
+                  <wp:effectExtent l="0" t="0" r="0" b="0"/>
+                  <wp:wrapNone/>
+                  <wp:docPr id="1" name="Image1" descr=""/>
+                  <wp:cNvGraphicFramePr>
+                    <a:graphicFrameLocks xmlns:a="http://schemas.openxmlformats.org/drawingml/2006/main" noChangeAspect="1"/>
+                  </wp:cNvGraphicFramePr>
+                  <a:graphic xmlns:a="http://schemas.openxmlformats.org/drawingml/2006/main">
+                    <a:graphicData uri="http://schemas.openxmlformats.org/drawingml/2006/picture">
+                      <pic:pic xmlns:pic="http://schemas.openxmlformats.org/drawingml/2006/picture">
+                        <pic:nvPicPr>
+                          <pic:cNvPr id="1" name="Image1" descr=""/>
+                          <pic:cNvPicPr>
+                            <a:picLocks noChangeAspect="1" noChangeArrowheads="1"/>
+                          </pic:cNvPicPr>
+                        </pic:nvPicPr>
+                        <pic:blipFill>
+                          <a:blip r:embed="rId2"/>
+                          <a:srcRect l="-12" t="-31" r="-12" b="-31"/>
+                          <a:stretch>
+                            <a:fillRect/>
+                          </a:stretch>
+                        </pic:blipFill>
+                        <pic:spPr bwMode="auto">
+                          <a:xfrm>
+                            <a:off x="0" y="0"/>
+                            <a:ext cx="1489710" cy="590550"/>
+                          </a:xfrm>
+                          <a:prstGeom prst="rect">
+                            <a:avLst/>
+                          </a:prstGeom>
+                        </pic:spPr>
+                      </pic:pic>
+                    </a:graphicData>
+                  </a:graphic>
+                </wp:anchor>
+              </w:drawing>
+            </w:r>
+            <w:r>
+              <w:rPr>
+                <w:rFonts w:cs="Arial" w:ascii="Arial" w:hAnsi="Arial"/>
+                <w:sz w:val="18"/>
+              </w:rPr>
+              <w:t>Il legale Rappresentate</w:t>
+            </w:r>
+          </w:p>
+          <w:p>
+            <w:pPr>
+              <w:pStyle w:val="Normal"/>
+              <w:keepNext/>
+              <w:keepLines/>
+              <w:spacing w:before="0" w:after="0" w:line="230" w:lineRule="auto"/>
+              <w:jc w:val="left"/>
+              <w:rPr>
+                <w:rFonts w:ascii="Calibri" w:hAnsi="Calibri" w:cs="Calibri"/>
+              </w:rPr>
+            </w:pPr>
+            <w:r>
+              <w:rPr>
+                <w:rFonts w:cs="Arial" w:ascii="Arial" w:hAnsi="Arial"/>
+                <w:sz w:val="18"/>
+              </w:rPr>
+              <w:t>(Daniele Morini)</w:t>
+            </w:r>
+          </w:p>
+          <w:p>
+            <w:pPr>
+              <w:pStyle w:val="Normal"/>
+              <w:keepNext w:val="0"/>
+              <w:keepLines/>
+              <w:spacing w:before="0" w:after="0" w:line="230" w:lineRule="auto"/>
+              <w:jc w:val="left"/>
+              <w:rPr>
+                <w:rFonts w:ascii="Calibri" w:hAnsi="Calibri" w:cs="Calibri"/>
+              </w:rPr>
+            </w:pPr>
+            <w:r>
+              <w:rPr>
+                <w:rFonts w:cs="Arial" w:ascii="Arial" w:hAnsi="Arial"/>
+                <w:sz w:val="18"/>
+              </w:rPr>
+              <w:t>____________________</w:t>
+            </w:r>
+          </w:p>
+        </w:tc>
+        <w:tc>
+          <w:tcPr>
+            <w:tcW w:type="dxa" w:w="4819"/>
+          </w:tcPr>
+          <w:p>
+            <w:pPr>
+              <w:jc w:val="center"/>
+            </w:pPr>
+            <w:r>
+              <w:rPr>
+                <w:b/>
+                <w:color w:val="000000"/>
+                <w:sz w:val="22"/>
+              </w:rPr>
+              <w:t>Sponsor</w:t>
+            </w:r>
+          </w:p>
+          <w:p>
+            <w:pPr>
+              <w:keepNext/>
+              <w:keepLines/>
+              <w:spacing w:before="0" w:after="0"/>
+              <w:jc w:val="center"/>
+            </w:pPr>
+            <w:r>
+              <w:rPr>
+                <w:rFonts w:ascii="Arial" w:hAnsi="Arial" w:cs="Arial"/>
+                <w:b/>
+                <w:sz w:val="18"/>
+              </w:rPr>
+              <w:t>{{ sponsor.legal_name }}</w:t>
+            </w:r>
+          </w:p>
+          <w:p>
+            <w:pPr>
+              <w:keepNext/>
+              <w:keepLines/>
+              <w:spacing w:before="0" w:after="0"/>
+              <w:jc w:val="center"/>
+            </w:pPr>
+            <w:r>
+              <w:rPr>
+                <w:rFonts w:ascii="Arial" w:hAnsi="Arial" w:cs="Arial"/>
+                <w:b/>
+                <w:sz w:val="18"/>
+              </w:rPr>
+              <w:t>{% if signer.full_name %}{{ signer.full_name }}{% endif %}</w:t>
+            </w:r>
+          </w:p>
+          <w:p>
+            <w:pPr>
+              <w:keepNext/>
+              <w:keepLines/>
+              <w:spacing w:before="0" w:after="0"/>
+              <w:jc w:val="center"/>
+            </w:pPr>
+            <w:r>
+              <w:rPr>
+                <w:rFonts w:ascii="Arial" w:hAnsi="Arial" w:cs="Arial"/>
+                <w:b w:val="0"/>
+                <w:sz w:val="18"/>
+              </w:rPr>
+              <w:t>_______________________________</w:t>
+            </w:r>
+          </w:p>
+        </w:tc>
+      </w:tr>
+    </w:tbl>
     <w:sectPr>
       <w:headerReference w:type="default" r:id="rId3"/>
       <w:footerReference w:type="default" r:id="rId4"/>

</xml_diff>